<commit_message>
Update Caso en la empresa Camposol (1).docx
</commit_message>
<xml_diff>
--- a/Caso en la empresa Camposol (1).docx
+++ b/Caso en la empresa Camposol (1).docx
@@ -9,6 +9,12 @@
           <w:lang w:val="es-ES"/>
         </w:rPr>
       </w:pPr>
+      <w:r>
+        <w:rPr>
+          <w:lang w:val="es-ES"/>
+        </w:rPr>
+        <w:t>o</w:t>
+      </w:r>
     </w:p>
     <w:p>
       <w:pPr>
@@ -174,21 +180,7 @@
         <w:rPr>
           <w:rFonts w:ascii="Arial" w:hAnsi="Arial" w:cs="Arial"/>
         </w:rPr>
-        <w:t xml:space="preserve">Franks Silvestre </w:t>
-      </w:r>
-      <w:proofErr w:type="spellStart"/>
-      <w:r>
-        <w:rPr>
-          <w:rFonts w:ascii="Arial" w:hAnsi="Arial" w:cs="Arial"/>
-        </w:rPr>
-        <w:t>Alvarez</w:t>
-      </w:r>
-      <w:proofErr w:type="spellEnd"/>
-      <w:r>
-        <w:rPr>
-          <w:rFonts w:ascii="Arial" w:hAnsi="Arial" w:cs="Arial"/>
-        </w:rPr>
-        <w:t xml:space="preserve"> Bustamante</w:t>
+        <w:t>Franks Silvestre Alvarez Bustamante</w:t>
       </w:r>
     </w:p>
     <w:p>
@@ -259,21 +251,7 @@
         <w:rPr>
           <w:rFonts w:ascii="Arial" w:hAnsi="Arial" w:cs="Arial"/>
         </w:rPr>
-        <w:t xml:space="preserve">Elvis Wilson </w:t>
-      </w:r>
-      <w:proofErr w:type="spellStart"/>
-      <w:r>
-        <w:rPr>
-          <w:rFonts w:ascii="Arial" w:hAnsi="Arial" w:cs="Arial"/>
-        </w:rPr>
-        <w:t>Alcantara</w:t>
-      </w:r>
-      <w:proofErr w:type="spellEnd"/>
-      <w:r>
-        <w:rPr>
-          <w:rFonts w:ascii="Arial" w:hAnsi="Arial" w:cs="Arial"/>
-        </w:rPr>
-        <w:t xml:space="preserve"> Pinedo</w:t>
+        <w:t>Elvis Wilson Alcantara Pinedo</w:t>
       </w:r>
     </w:p>
     <w:p>
@@ -708,18 +686,8 @@
           <w:b/>
           <w:bCs/>
         </w:rPr>
-        <w:t xml:space="preserve">Concepto planteado en </w:t>
+        <w:t>Concepto planteado en Sql</w:t>
       </w:r>
-      <w:proofErr w:type="spellStart"/>
-      <w:r>
-        <w:rPr>
-          <w:rFonts w:ascii="Arial" w:hAnsi="Arial" w:cs="Arial"/>
-          <w:b/>
-          <w:bCs/>
-        </w:rPr>
-        <w:t>Sql</w:t>
-      </w:r>
-      <w:proofErr w:type="spellEnd"/>
     </w:p>
     <w:p>
       <w:pPr>
@@ -975,21 +943,7 @@
         <w:rPr>
           <w:rFonts w:ascii="Arial" w:hAnsi="Arial" w:cs="Arial"/>
         </w:rPr>
-        <w:t>GRI-</w:t>
-      </w:r>
-      <w:proofErr w:type="spellStart"/>
-      <w:r>
-        <w:rPr>
-          <w:rFonts w:ascii="Arial" w:hAnsi="Arial" w:cs="Arial"/>
-        </w:rPr>
-        <w:t>aligned</w:t>
-      </w:r>
-      <w:proofErr w:type="spellEnd"/>
-      <w:r>
-        <w:rPr>
-          <w:rFonts w:ascii="Arial" w:hAnsi="Arial" w:cs="Arial"/>
-        </w:rPr>
-        <w:t xml:space="preserve"> </w:t>
+        <w:t xml:space="preserve">GRI-aligned </w:t>
       </w:r>
       <w:r>
         <w:rPr>
@@ -1551,29 +1505,7 @@
           <w:lang w:eastAsia="es-PE"/>
           <w14:ligatures w14:val="none"/>
         </w:rPr>
-        <w:t xml:space="preserve">Del presente registro digitalizado que se obtuvo de la empresa en cuestión, nosotros hemos analizado parte de los datos dispuestos para poder tener una visión </w:t>
-      </w:r>
-      <w:proofErr w:type="spellStart"/>
-      <w:r>
-        <w:rPr>
-          <w:rFonts w:ascii="Arial" w:eastAsia="Times New Roman" w:hAnsi="Arial" w:cs="Arial"/>
-          <w:color w:val="222222"/>
-          <w:kern w:val="0"/>
-          <w:lang w:eastAsia="es-PE"/>
-          <w14:ligatures w14:val="none"/>
-        </w:rPr>
-        <w:t>mas</w:t>
-      </w:r>
-      <w:proofErr w:type="spellEnd"/>
-      <w:r>
-        <w:rPr>
-          <w:rFonts w:ascii="Arial" w:eastAsia="Times New Roman" w:hAnsi="Arial" w:cs="Arial"/>
-          <w:color w:val="222222"/>
-          <w:kern w:val="0"/>
-          <w:lang w:eastAsia="es-PE"/>
-          <w14:ligatures w14:val="none"/>
-        </w:rPr>
-        <w:t xml:space="preserve"> clara y realista de los problemas presente en la empresa, teniendo en cuenta que gran parte de estos registros han sido o son realizados en físico con tablas graficadas. De este modo y restaurando ciertos datos, damos cuenta de que ciertos problemas como la duplicación de datos, la carencia de algunos datos, y la imprecisión de algunos hace de los registros físicos considerablemente ineficaces.</w:t>
+        <w:t>Del presente registro digitalizado que se obtuvo de la empresa en cuestión, nosotros hemos analizado parte de los datos dispuestos para poder tener una visión mas clara y realista de los problemas presente en la empresa, teniendo en cuenta que gran parte de estos registros han sido o son realizados en físico con tablas graficadas. De este modo y restaurando ciertos datos, damos cuenta de que ciertos problemas como la duplicación de datos, la carencia de algunos datos, y la imprecisión de algunos hace de los registros físicos considerablemente ineficaces.</w:t>
       </w:r>
     </w:p>
     <w:p>
@@ -1605,22 +1537,8 @@
           <w:lang w:eastAsia="es-PE"/>
           <w14:ligatures w14:val="none"/>
         </w:rPr>
-        <w:t xml:space="preserve">Registro trabajado en </w:t>
+        <w:t>Registro trabajado en excel</w:t>
       </w:r>
-      <w:proofErr w:type="spellStart"/>
-      <w:r>
-        <w:rPr>
-          <w:rFonts w:ascii="Arial" w:eastAsia="Times New Roman" w:hAnsi="Arial" w:cs="Arial"/>
-          <w:b/>
-          <w:bCs/>
-          <w:color w:val="222222"/>
-          <w:kern w:val="0"/>
-          <w:lang w:eastAsia="es-PE"/>
-          <w14:ligatures w14:val="none"/>
-        </w:rPr>
-        <w:t>excel</w:t>
-      </w:r>
-      <w:proofErr w:type="spellEnd"/>
     </w:p>
     <w:p>
       <w:pPr>
@@ -1658,10 +1576,10 @@
             <v:path o:extrusionok="f" gradientshapeok="t" o:connecttype="rect"/>
             <o:lock v:ext="edit" aspectratio="t"/>
           </v:shapetype>
-          <v:shape id="_x0000_i1025" type="#_x0000_t75" style="width:451.5pt;height:162pt" o:ole="">
+          <v:shape id="_x0000_i1025" type="#_x0000_t75" style="width:451.65pt;height:162.25pt" o:ole="">
             <v:imagedata r:id="rId8" o:title=""/>
           </v:shape>
-          <o:OLEObject Type="Embed" ProgID="Excel.Sheet.12" ShapeID="_x0000_i1025" DrawAspect="Content" ObjectID="_1842678674" r:id="rId9"/>
+          <o:OLEObject Type="Embed" ProgID="Excel.Sheet.12" ShapeID="_x0000_i1025" DrawAspect="Content" ObjectID="_1843222551" r:id="rId9"/>
         </w:object>
       </w:r>
     </w:p>
@@ -1727,48 +1645,190 @@
           <w:bCs/>
           <w:lang w:val="es-ES"/>
         </w:rPr>
-        <w:t xml:space="preserve">El problema como tal no se rige en el orden de los datos, sino </w:t>
+        <w:t xml:space="preserve">El problema como tal no se rige en el orden de los datos, sino mas en el hecho de que nada tiene un sector en especifico, cuando podríamos separar cada columna de esta tabla en varias tablas con columnas que nos permitan ver a mayor profundidad datos ya sea referentes a los clientes, las exportaciones, los lotes, las transacciones, y este no es el único caso, siendo que esta es la tabla principal, también tenemos el caso de otra tabla donde </w:t>
       </w:r>
-      <w:proofErr w:type="spellStart"/>
-      <w:r>
+    </w:p>
+    <w:p>
+      <w:pPr>
+        <w:pStyle w:val="ListParagraph"/>
+        <w:shd w:val="clear" w:color="auto" w:fill="FFFFFF"/>
+        <w:spacing w:after="0" w:line="240" w:lineRule="auto"/>
+        <w:ind w:left="792"/>
         <w:rPr>
           <w:rFonts w:ascii="Arial" w:hAnsi="Arial" w:cs="Arial"/>
           <w:b/>
           <w:bCs/>
           <w:lang w:val="es-ES"/>
         </w:rPr>
-        <w:t>mas</w:t>
-      </w:r>
-      <w:proofErr w:type="spellEnd"/>
-      <w:r>
+      </w:pPr>
+    </w:p>
+    <w:p>
+      <w:pPr>
+        <w:pStyle w:val="ListParagraph"/>
+        <w:shd w:val="clear" w:color="auto" w:fill="FFFFFF"/>
+        <w:spacing w:after="0" w:line="240" w:lineRule="auto"/>
+        <w:ind w:left="792"/>
         <w:rPr>
           <w:rFonts w:ascii="Arial" w:hAnsi="Arial" w:cs="Arial"/>
           <w:b/>
           <w:bCs/>
           <w:lang w:val="es-ES"/>
         </w:rPr>
-        <w:t xml:space="preserve"> en el hecho de que nada tiene un sector en </w:t>
-      </w:r>
-      <w:proofErr w:type="spellStart"/>
-      <w:r>
+      </w:pPr>
+    </w:p>
+    <w:p>
+      <w:pPr>
+        <w:pStyle w:val="ListParagraph"/>
+        <w:shd w:val="clear" w:color="auto" w:fill="FFFFFF"/>
+        <w:spacing w:after="0" w:line="240" w:lineRule="auto"/>
+        <w:ind w:left="792"/>
         <w:rPr>
           <w:rFonts w:ascii="Arial" w:hAnsi="Arial" w:cs="Arial"/>
           <w:b/>
           <w:bCs/>
           <w:lang w:val="es-ES"/>
         </w:rPr>
-        <w:t>especifico</w:t>
-      </w:r>
-      <w:proofErr w:type="spellEnd"/>
-      <w:r>
+      </w:pPr>
+    </w:p>
+    <w:p>
+      <w:pPr>
+        <w:pStyle w:val="ListParagraph"/>
+        <w:shd w:val="clear" w:color="auto" w:fill="FFFFFF"/>
+        <w:spacing w:after="0" w:line="240" w:lineRule="auto"/>
+        <w:ind w:left="792"/>
         <w:rPr>
           <w:rFonts w:ascii="Arial" w:hAnsi="Arial" w:cs="Arial"/>
           <w:b/>
           <w:bCs/>
           <w:lang w:val="es-ES"/>
         </w:rPr>
-        <w:t xml:space="preserve">, cuando podríamos separar cada columna de esta tabla en varias tablas con columnas que nos permitan ver a mayor profundidad datos ya sea referentes a los clientes, las exportaciones, los lotes, las transacciones, y este no es el único caso, siendo que esta es la tabla principal, también tenemos el caso de otra tabla donde </w:t>
-      </w:r>
+      </w:pPr>
+    </w:p>
+    <w:p>
+      <w:pPr>
+        <w:pStyle w:val="ListParagraph"/>
+        <w:shd w:val="clear" w:color="auto" w:fill="FFFFFF"/>
+        <w:spacing w:after="0" w:line="240" w:lineRule="auto"/>
+        <w:ind w:left="792"/>
+        <w:rPr>
+          <w:rFonts w:ascii="Arial" w:hAnsi="Arial" w:cs="Arial"/>
+          <w:b/>
+          <w:bCs/>
+          <w:lang w:val="es-ES"/>
+        </w:rPr>
+      </w:pPr>
+    </w:p>
+    <w:p>
+      <w:pPr>
+        <w:pStyle w:val="ListParagraph"/>
+        <w:shd w:val="clear" w:color="auto" w:fill="FFFFFF"/>
+        <w:spacing w:after="0" w:line="240" w:lineRule="auto"/>
+        <w:ind w:left="792"/>
+        <w:rPr>
+          <w:rFonts w:ascii="Arial" w:hAnsi="Arial" w:cs="Arial"/>
+          <w:b/>
+          <w:bCs/>
+          <w:lang w:val="es-ES"/>
+        </w:rPr>
+      </w:pPr>
+    </w:p>
+    <w:p>
+      <w:pPr>
+        <w:pStyle w:val="ListParagraph"/>
+        <w:shd w:val="clear" w:color="auto" w:fill="FFFFFF"/>
+        <w:spacing w:after="0" w:line="240" w:lineRule="auto"/>
+        <w:ind w:left="792"/>
+        <w:rPr>
+          <w:rFonts w:ascii="Arial" w:hAnsi="Arial" w:cs="Arial"/>
+          <w:b/>
+          <w:bCs/>
+          <w:lang w:val="es-ES"/>
+        </w:rPr>
+      </w:pPr>
+    </w:p>
+    <w:p>
+      <w:pPr>
+        <w:pStyle w:val="ListParagraph"/>
+        <w:shd w:val="clear" w:color="auto" w:fill="FFFFFF"/>
+        <w:spacing w:after="0" w:line="240" w:lineRule="auto"/>
+        <w:ind w:left="792"/>
+        <w:rPr>
+          <w:rFonts w:ascii="Arial" w:hAnsi="Arial" w:cs="Arial"/>
+          <w:b/>
+          <w:bCs/>
+          <w:lang w:val="es-ES"/>
+        </w:rPr>
+      </w:pPr>
+    </w:p>
+    <w:p>
+      <w:pPr>
+        <w:pStyle w:val="ListParagraph"/>
+        <w:shd w:val="clear" w:color="auto" w:fill="FFFFFF"/>
+        <w:spacing w:after="0" w:line="240" w:lineRule="auto"/>
+        <w:ind w:left="792"/>
+        <w:rPr>
+          <w:rFonts w:ascii="Arial" w:hAnsi="Arial" w:cs="Arial"/>
+          <w:b/>
+          <w:bCs/>
+          <w:lang w:val="es-ES"/>
+        </w:rPr>
+      </w:pPr>
+    </w:p>
+    <w:p>
+      <w:pPr>
+        <w:pStyle w:val="ListParagraph"/>
+        <w:shd w:val="clear" w:color="auto" w:fill="FFFFFF"/>
+        <w:spacing w:after="0" w:line="240" w:lineRule="auto"/>
+        <w:ind w:left="792"/>
+        <w:rPr>
+          <w:rFonts w:ascii="Arial" w:hAnsi="Arial" w:cs="Arial"/>
+          <w:b/>
+          <w:bCs/>
+          <w:lang w:val="es-ES"/>
+        </w:rPr>
+      </w:pPr>
+    </w:p>
+    <w:p>
+      <w:pPr>
+        <w:pStyle w:val="ListParagraph"/>
+        <w:shd w:val="clear" w:color="auto" w:fill="FFFFFF"/>
+        <w:spacing w:after="0" w:line="240" w:lineRule="auto"/>
+        <w:ind w:left="792"/>
+        <w:rPr>
+          <w:rFonts w:ascii="Arial" w:hAnsi="Arial" w:cs="Arial"/>
+          <w:b/>
+          <w:bCs/>
+          <w:lang w:val="es-ES"/>
+        </w:rPr>
+      </w:pPr>
+    </w:p>
+    <w:p>
+      <w:pPr>
+        <w:pStyle w:val="ListParagraph"/>
+        <w:shd w:val="clear" w:color="auto" w:fill="FFFFFF"/>
+        <w:spacing w:after="0" w:line="240" w:lineRule="auto"/>
+        <w:ind w:left="792"/>
+        <w:rPr>
+          <w:rFonts w:ascii="Arial" w:hAnsi="Arial" w:cs="Arial"/>
+          <w:b/>
+          <w:bCs/>
+          <w:lang w:val="es-ES"/>
+        </w:rPr>
+      </w:pPr>
+    </w:p>
+    <w:p>
+      <w:pPr>
+        <w:pStyle w:val="ListParagraph"/>
+        <w:shd w:val="clear" w:color="auto" w:fill="FFFFFF"/>
+        <w:spacing w:after="0" w:line="240" w:lineRule="auto"/>
+        <w:ind w:left="792"/>
+        <w:rPr>
+          <w:rFonts w:ascii="Arial" w:hAnsi="Arial" w:cs="Arial"/>
+          <w:b/>
+          <w:bCs/>
+          <w:lang w:val="es-ES"/>
+        </w:rPr>
+      </w:pPr>
     </w:p>
     <w:p>
       <w:pPr>
@@ -1799,6 +1859,7 @@
           <w:lang w:eastAsia="es-PE"/>
           <w14:ligatures w14:val="none"/>
         </w:rPr>
+        <w:lastRenderedPageBreak/>
         <w:t>Árbol de problemas</w:t>
       </w:r>
     </w:p>
@@ -1824,7 +1885,6 @@
           <w:kern w:val="0"/>
           <w:lang w:eastAsia="es-PE"/>
         </w:rPr>
-        <w:lastRenderedPageBreak/>
         <w:drawing>
           <wp:inline distT="0" distB="0" distL="0" distR="0" wp14:anchorId="6B77B7EE" wp14:editId="2F4B2DBC">
             <wp:extent cx="5443268" cy="3122762"/>
@@ -1874,6 +1934,98 @@
       </w:pPr>
       <w:r>
         <w:rPr>
+          <w:noProof/>
+        </w:rPr>
+        <mc:AlternateContent>
+          <mc:Choice Requires="wps">
+            <w:drawing>
+              <wp:anchor distT="0" distB="0" distL="114300" distR="114300" simplePos="0" relativeHeight="251670528" behindDoc="0" locked="0" layoutInCell="1" allowOverlap="1" wp14:anchorId="479950B7" wp14:editId="4267E136">
+                <wp:simplePos x="0" y="0"/>
+                <wp:positionH relativeFrom="column">
+                  <wp:posOffset>2030928</wp:posOffset>
+                </wp:positionH>
+                <wp:positionV relativeFrom="paragraph">
+                  <wp:posOffset>174740</wp:posOffset>
+                </wp:positionV>
+                <wp:extent cx="1104405" cy="962025"/>
+                <wp:effectExtent l="0" t="0" r="19685" b="28575"/>
+                <wp:wrapNone/>
+                <wp:docPr id="3" name="Cuadro de texto 3"/>
+                <wp:cNvGraphicFramePr/>
+                <a:graphic xmlns:a="http://schemas.openxmlformats.org/drawingml/2006/main">
+                  <a:graphicData uri="http://schemas.microsoft.com/office/word/2010/wordprocessingShape">
+                    <wps:wsp>
+                      <wps:cNvSpPr txBox="1"/>
+                      <wps:spPr>
+                        <a:xfrm>
+                          <a:off x="0" y="0"/>
+                          <a:ext cx="1104405" cy="962025"/>
+                        </a:xfrm>
+                        <a:prstGeom prst="rect">
+                          <a:avLst/>
+                        </a:prstGeom>
+                        <a:solidFill>
+                          <a:schemeClr val="lt1"/>
+                        </a:solidFill>
+                        <a:ln w="6350">
+                          <a:solidFill>
+                            <a:prstClr val="black"/>
+                          </a:solidFill>
+                        </a:ln>
+                      </wps:spPr>
+                      <wps:txbx>
+                        <w:txbxContent>
+                          <w:p>
+                            <w:r>
+                              <w:rPr>
+                                <w:lang w:val="es-ES"/>
+                              </w:rPr>
+                              <w:t>Carencia de una base de datos moderna</w:t>
+                            </w:r>
+                          </w:p>
+                        </w:txbxContent>
+                      </wps:txbx>
+                      <wps:bodyPr rot="0" spcFirstLastPara="0" vertOverflow="overflow" horzOverflow="overflow" vert="horz" wrap="square" lIns="91440" tIns="45720" rIns="91440" bIns="45720" numCol="1" spcCol="0" rtlCol="0" fromWordArt="0" anchor="t" anchorCtr="0" forceAA="0" compatLnSpc="1">
+                        <a:prstTxWarp prst="textNoShape">
+                          <a:avLst/>
+                        </a:prstTxWarp>
+                        <a:noAutofit/>
+                      </wps:bodyPr>
+                    </wps:wsp>
+                  </a:graphicData>
+                </a:graphic>
+                <wp14:sizeRelH relativeFrom="margin">
+                  <wp14:pctWidth>0</wp14:pctWidth>
+                </wp14:sizeRelH>
+              </wp:anchor>
+            </w:drawing>
+          </mc:Choice>
+          <mc:Fallback>
+            <w:pict>
+              <v:shapetype w14:anchorId="479950B7" id="_x0000_t202" coordsize="21600,21600" o:spt="202" path="m,l,21600r21600,l21600,xe">
+                <v:stroke joinstyle="miter"/>
+                <v:path gradientshapeok="t" o:connecttype="rect"/>
+              </v:shapetype>
+              <v:shape id="Cuadro de texto 3" o:spid="_x0000_s1026" type="#_x0000_t202" style="position:absolute;left:0;text-align:left;margin-left:159.9pt;margin-top:13.75pt;width:86.95pt;height:75.75pt;z-index:251670528;visibility:visible;mso-wrap-style:square;mso-width-percent:0;mso-wrap-distance-left:9pt;mso-wrap-distance-top:0;mso-wrap-distance-right:9pt;mso-wrap-distance-bottom:0;mso-position-horizontal:absolute;mso-position-horizontal-relative:text;mso-position-vertical:absolute;mso-position-vertical-relative:text;mso-width-percent:0;mso-width-relative:margin;v-text-anchor:top" o:gfxdata="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" fillcolor="white [3201]" strokeweight=".5pt">
+                <v:textbox>
+                  <w:txbxContent>
+                    <w:p>
+                      <w:r>
+                        <w:rPr>
+                          <w:lang w:val="es-ES"/>
+                        </w:rPr>
+                        <w:t>Carencia de una base de datos moderna</w:t>
+                      </w:r>
+                    </w:p>
+                  </w:txbxContent>
+                </v:textbox>
+              </v:shape>
+            </w:pict>
+          </mc:Fallback>
+        </mc:AlternateContent>
+      </w:r>
+      <w:r>
+        <w:rPr>
           <w:rFonts w:ascii="Arial" w:eastAsia="Times New Roman" w:hAnsi="Arial" w:cs="Arial"/>
           <w:b/>
           <w:bCs/>
@@ -1903,17 +2055,220 @@
         <w:rPr>
           <w:noProof/>
         </w:rPr>
-        <w:lastRenderedPageBreak/>
         <mc:AlternateContent>
           <mc:Choice Requires="wps">
             <w:drawing>
-              <wp:anchor distT="0" distB="0" distL="114300" distR="114300" simplePos="0" relativeHeight="251669504" behindDoc="0" locked="0" layoutInCell="1" allowOverlap="1" wp14:anchorId="44871104" wp14:editId="37DD01DA">
+              <wp:anchor distT="0" distB="0" distL="114300" distR="114300" simplePos="0" relativeHeight="251665408" behindDoc="0" locked="0" layoutInCell="1" allowOverlap="1" wp14:anchorId="358E8AE5" wp14:editId="12136827">
                 <wp:simplePos x="0" y="0"/>
                 <wp:positionH relativeFrom="column">
-                  <wp:posOffset>3606165</wp:posOffset>
+                  <wp:posOffset>1033194</wp:posOffset>
                 </wp:positionH>
                 <wp:positionV relativeFrom="paragraph">
-                  <wp:posOffset>4725670</wp:posOffset>
+                  <wp:posOffset>297164</wp:posOffset>
+                </wp:positionV>
+                <wp:extent cx="1036617" cy="1033153"/>
+                <wp:effectExtent l="0" t="0" r="11430" b="14605"/>
+                <wp:wrapNone/>
+                <wp:docPr id="6" name="Cuadro de texto 6"/>
+                <wp:cNvGraphicFramePr/>
+                <a:graphic xmlns:a="http://schemas.openxmlformats.org/drawingml/2006/main">
+                  <a:graphicData uri="http://schemas.microsoft.com/office/word/2010/wordprocessingShape">
+                    <wps:wsp>
+                      <wps:cNvSpPr txBox="1"/>
+                      <wps:spPr>
+                        <a:xfrm>
+                          <a:off x="0" y="0"/>
+                          <a:ext cx="1036617" cy="1033153"/>
+                        </a:xfrm>
+                        <a:prstGeom prst="rect">
+                          <a:avLst/>
+                        </a:prstGeom>
+                        <a:solidFill>
+                          <a:schemeClr val="lt1"/>
+                        </a:solidFill>
+                        <a:ln w="6350">
+                          <a:solidFill>
+                            <a:prstClr val="black"/>
+                          </a:solidFill>
+                        </a:ln>
+                      </wps:spPr>
+                      <wps:txbx>
+                        <w:txbxContent>
+                          <w:p>
+                            <w:pPr>
+                              <w:rPr>
+                                <w:sz w:val="22"/>
+                                <w:szCs w:val="22"/>
+                                <w:lang w:val="es-ES"/>
+                              </w:rPr>
+                            </w:pPr>
+                            <w:r>
+                              <w:rPr>
+                                <w:sz w:val="22"/>
+                                <w:szCs w:val="22"/>
+                                <w:lang w:val="es-ES"/>
+                              </w:rPr>
+                              <w:t>Poca trazabilidad de las exportaciones</w:t>
+                            </w:r>
+                          </w:p>
+                        </w:txbxContent>
+                      </wps:txbx>
+                      <wps:bodyPr rot="0" spcFirstLastPara="0" vertOverflow="overflow" horzOverflow="overflow" vert="horz" wrap="square" lIns="91440" tIns="45720" rIns="91440" bIns="45720" numCol="1" spcCol="0" rtlCol="0" fromWordArt="0" anchor="t" anchorCtr="0" forceAA="0" compatLnSpc="1">
+                        <a:prstTxWarp prst="textNoShape">
+                          <a:avLst/>
+                        </a:prstTxWarp>
+                        <a:noAutofit/>
+                      </wps:bodyPr>
+                    </wps:wsp>
+                  </a:graphicData>
+                </a:graphic>
+                <wp14:sizeRelH relativeFrom="margin">
+                  <wp14:pctWidth>0</wp14:pctWidth>
+                </wp14:sizeRelH>
+                <wp14:sizeRelV relativeFrom="margin">
+                  <wp14:pctHeight>0</wp14:pctHeight>
+                </wp14:sizeRelV>
+              </wp:anchor>
+            </w:drawing>
+          </mc:Choice>
+          <mc:Fallback>
+            <w:pict>
+              <v:shape w14:anchorId="358E8AE5" id="Cuadro de texto 6" o:spid="_x0000_s1027" type="#_x0000_t202" style="position:absolute;left:0;text-align:left;margin-left:81.35pt;margin-top:23.4pt;width:81.6pt;height:81.35pt;z-index:251665408;visibility:visible;mso-wrap-style:square;mso-width-percent:0;mso-height-percent:0;mso-wrap-distance-left:9pt;mso-wrap-distance-top:0;mso-wrap-distance-right:9pt;mso-wrap-distance-bottom:0;mso-position-horizontal:absolute;mso-position-horizontal-relative:text;mso-position-vertical:absolute;mso-position-vertical-relative:text;mso-width-percent:0;mso-height-percent:0;mso-width-relative:margin;mso-height-relative:margin;v-text-anchor:top" o:gfxdata="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" fillcolor="white [3201]" strokeweight=".5pt">
+                <v:textbox>
+                  <w:txbxContent>
+                    <w:p>
+                      <w:pPr>
+                        <w:rPr>
+                          <w:sz w:val="22"/>
+                          <w:szCs w:val="22"/>
+                          <w:lang w:val="es-ES"/>
+                        </w:rPr>
+                      </w:pPr>
+                      <w:r>
+                        <w:rPr>
+                          <w:sz w:val="22"/>
+                          <w:szCs w:val="22"/>
+                          <w:lang w:val="es-ES"/>
+                        </w:rPr>
+                        <w:t>Poca trazabilidad de las exportaciones</w:t>
+                      </w:r>
+                    </w:p>
+                  </w:txbxContent>
+                </v:textbox>
+              </v:shape>
+            </w:pict>
+          </mc:Fallback>
+        </mc:AlternateContent>
+      </w:r>
+      <w:r>
+        <w:rPr>
+          <w:noProof/>
+        </w:rPr>
+        <mc:AlternateContent>
+          <mc:Choice Requires="wps">
+            <w:drawing>
+              <wp:anchor distT="0" distB="0" distL="114300" distR="114300" simplePos="0" relativeHeight="251667456" behindDoc="0" locked="0" layoutInCell="1" allowOverlap="1" wp14:anchorId="2029474B" wp14:editId="04F0C5C6">
+                <wp:simplePos x="0" y="0"/>
+                <wp:positionH relativeFrom="column">
+                  <wp:posOffset>1127067</wp:posOffset>
+                </wp:positionH>
+                <wp:positionV relativeFrom="paragraph">
+                  <wp:posOffset>2239521</wp:posOffset>
+                </wp:positionV>
+                <wp:extent cx="1333500" cy="962025"/>
+                <wp:effectExtent l="0" t="0" r="19050" b="28575"/>
+                <wp:wrapNone/>
+                <wp:docPr id="7" name="Cuadro de texto 7"/>
+                <wp:cNvGraphicFramePr/>
+                <a:graphic xmlns:a="http://schemas.openxmlformats.org/drawingml/2006/main">
+                  <a:graphicData uri="http://schemas.microsoft.com/office/word/2010/wordprocessingShape">
+                    <wps:wsp>
+                      <wps:cNvSpPr txBox="1"/>
+                      <wps:spPr>
+                        <a:xfrm>
+                          <a:off x="0" y="0"/>
+                          <a:ext cx="1333500" cy="962025"/>
+                        </a:xfrm>
+                        <a:prstGeom prst="rect">
+                          <a:avLst/>
+                        </a:prstGeom>
+                        <a:solidFill>
+                          <a:schemeClr val="lt1"/>
+                        </a:solidFill>
+                        <a:ln w="6350">
+                          <a:solidFill>
+                            <a:prstClr val="black"/>
+                          </a:solidFill>
+                        </a:ln>
+                      </wps:spPr>
+                      <wps:txbx>
+                        <w:txbxContent>
+                          <w:p>
+                            <w:pPr>
+                              <w:rPr>
+                                <w:lang w:val="es-ES"/>
+                              </w:rPr>
+                            </w:pPr>
+                            <w:r>
+                              <w:rPr>
+                                <w:lang w:val="es-ES"/>
+                              </w:rPr>
+                              <w:t>Ventas no directas hacia los clientes</w:t>
+                            </w:r>
+                          </w:p>
+                        </w:txbxContent>
+                      </wps:txbx>
+                      <wps:bodyPr rot="0" spcFirstLastPara="0" vertOverflow="overflow" horzOverflow="overflow" vert="horz" wrap="square" lIns="91440" tIns="45720" rIns="91440" bIns="45720" numCol="1" spcCol="0" rtlCol="0" fromWordArt="0" anchor="t" anchorCtr="0" forceAA="0" compatLnSpc="1">
+                        <a:prstTxWarp prst="textNoShape">
+                          <a:avLst/>
+                        </a:prstTxWarp>
+                        <a:noAutofit/>
+                      </wps:bodyPr>
+                    </wps:wsp>
+                  </a:graphicData>
+                </a:graphic>
+              </wp:anchor>
+            </w:drawing>
+          </mc:Choice>
+          <mc:Fallback>
+            <w:pict>
+              <v:shape w14:anchorId="2029474B" id="Cuadro de texto 7" o:spid="_x0000_s1028" type="#_x0000_t202" style="position:absolute;left:0;text-align:left;margin-left:88.75pt;margin-top:176.35pt;width:105pt;height:75.75pt;z-index:251667456;visibility:visible;mso-wrap-style:square;mso-wrap-distance-left:9pt;mso-wrap-distance-top:0;mso-wrap-distance-right:9pt;mso-wrap-distance-bottom:0;mso-position-horizontal:absolute;mso-position-horizontal-relative:text;mso-position-vertical:absolute;mso-position-vertical-relative:text;v-text-anchor:top" o:gfxdata="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" fillcolor="white [3201]" strokeweight=".5pt">
+                <v:textbox>
+                  <w:txbxContent>
+                    <w:p>
+                      <w:pPr>
+                        <w:rPr>
+                          <w:lang w:val="es-ES"/>
+                        </w:rPr>
+                      </w:pPr>
+                      <w:r>
+                        <w:rPr>
+                          <w:lang w:val="es-ES"/>
+                        </w:rPr>
+                        <w:t>Ventas no directas hacia los clientes</w:t>
+                      </w:r>
+                    </w:p>
+                  </w:txbxContent>
+                </v:textbox>
+              </v:shape>
+            </w:pict>
+          </mc:Fallback>
+        </mc:AlternateContent>
+      </w:r>
+      <w:r>
+        <w:rPr>
+          <w:noProof/>
+        </w:rPr>
+        <mc:AlternateContent>
+          <mc:Choice Requires="wps">
+            <w:drawing>
+              <wp:anchor distT="0" distB="0" distL="114300" distR="114300" simplePos="0" relativeHeight="251669504" behindDoc="0" locked="0" layoutInCell="1" allowOverlap="1" wp14:anchorId="44871104" wp14:editId="0F1401C8">
+                <wp:simplePos x="0" y="0"/>
+                <wp:positionH relativeFrom="column">
+                  <wp:posOffset>1777365</wp:posOffset>
+                </wp:positionH>
+                <wp:positionV relativeFrom="paragraph">
+                  <wp:posOffset>2778116</wp:posOffset>
                 </wp:positionV>
                 <wp:extent cx="1333500" cy="1171575"/>
                 <wp:effectExtent l="0" t="0" r="19050" b="28575"/>
@@ -1981,11 +2336,7 @@
           </mc:Choice>
           <mc:Fallback>
             <w:pict>
-              <v:shapetype w14:anchorId="44871104" id="_x0000_t202" coordsize="21600,21600" o:spt="202" path="m,l,21600r21600,l21600,xe">
-                <v:stroke joinstyle="miter"/>
-                <v:path gradientshapeok="t" o:connecttype="rect"/>
-              </v:shapetype>
-              <v:shape id="Cuadro de texto 8" o:spid="_x0000_s1026" type="#_x0000_t202" style="position:absolute;left:0;text-align:left;margin-left:283.95pt;margin-top:372.1pt;width:105pt;height:92.25pt;z-index:251669504;visibility:visible;mso-wrap-style:square;mso-height-percent:0;mso-wrap-distance-left:9pt;mso-wrap-distance-top:0;mso-wrap-distance-right:9pt;mso-wrap-distance-bottom:0;mso-position-horizontal:absolute;mso-position-horizontal-relative:text;mso-position-vertical:absolute;mso-position-vertical-relative:text;mso-height-percent:0;mso-height-relative:margin;v-text-anchor:top" o:gfxdata="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" fillcolor="white [3201]" strokeweight=".5pt">
+              <v:shape w14:anchorId="44871104" id="Cuadro de texto 8" o:spid="_x0000_s1029" type="#_x0000_t202" style="position:absolute;left:0;text-align:left;margin-left:139.95pt;margin-top:218.75pt;width:105pt;height:92.25pt;z-index:251669504;visibility:visible;mso-wrap-style:square;mso-height-percent:0;mso-wrap-distance-left:9pt;mso-wrap-distance-top:0;mso-wrap-distance-right:9pt;mso-wrap-distance-bottom:0;mso-position-horizontal:absolute;mso-position-horizontal-relative:text;mso-position-vertical:absolute;mso-position-vertical-relative:text;mso-height-percent:0;mso-height-relative:margin;v-text-anchor:top" o:gfxdata="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" fillcolor="white [3201]" strokeweight=".5pt">
                 <v:textbox>
                   <w:txbxContent>
                     <w:p>
@@ -2021,111 +2372,16 @@
         <mc:AlternateContent>
           <mc:Choice Requires="wps">
             <w:drawing>
-              <wp:anchor distT="0" distB="0" distL="114300" distR="114300" simplePos="0" relativeHeight="251667456" behindDoc="0" locked="0" layoutInCell="1" allowOverlap="1" wp14:anchorId="2029474B" wp14:editId="0B599F4D">
+              <wp:anchor distT="0" distB="0" distL="114300" distR="114300" simplePos="0" relativeHeight="251663360" behindDoc="0" locked="0" layoutInCell="1" allowOverlap="1" wp14:anchorId="6965F7DF" wp14:editId="120E1D6B">
                 <wp:simplePos x="0" y="0"/>
                 <wp:positionH relativeFrom="column">
-                  <wp:posOffset>129540</wp:posOffset>
+                  <wp:posOffset>3218502</wp:posOffset>
                 </wp:positionH>
                 <wp:positionV relativeFrom="paragraph">
-                  <wp:posOffset>4935220</wp:posOffset>
+                  <wp:posOffset>2351191</wp:posOffset>
                 </wp:positionV>
-                <wp:extent cx="1333500" cy="962025"/>
-                <wp:effectExtent l="0" t="0" r="19050" b="28575"/>
-                <wp:wrapNone/>
-                <wp:docPr id="7" name="Cuadro de texto 7"/>
-                <wp:cNvGraphicFramePr/>
-                <a:graphic xmlns:a="http://schemas.openxmlformats.org/drawingml/2006/main">
-                  <a:graphicData uri="http://schemas.microsoft.com/office/word/2010/wordprocessingShape">
-                    <wps:wsp>
-                      <wps:cNvSpPr txBox="1"/>
-                      <wps:spPr>
-                        <a:xfrm>
-                          <a:off x="0" y="0"/>
-                          <a:ext cx="1333500" cy="962025"/>
-                        </a:xfrm>
-                        <a:prstGeom prst="rect">
-                          <a:avLst/>
-                        </a:prstGeom>
-                        <a:solidFill>
-                          <a:schemeClr val="lt1"/>
-                        </a:solidFill>
-                        <a:ln w="6350">
-                          <a:solidFill>
-                            <a:prstClr val="black"/>
-                          </a:solidFill>
-                        </a:ln>
-                      </wps:spPr>
-                      <wps:txbx>
-                        <w:txbxContent>
-                          <w:p>
-                            <w:pPr>
-                              <w:rPr>
-                                <w:lang w:val="es-ES"/>
-                              </w:rPr>
-                            </w:pPr>
-                            <w:r>
-                              <w:rPr>
-                                <w:lang w:val="es-ES"/>
-                              </w:rPr>
-                              <w:t>Ventas no directas hacia los clientes</w:t>
-                            </w:r>
-                          </w:p>
-                        </w:txbxContent>
-                      </wps:txbx>
-                      <wps:bodyPr rot="0" spcFirstLastPara="0" vertOverflow="overflow" horzOverflow="overflow" vert="horz" wrap="square" lIns="91440" tIns="45720" rIns="91440" bIns="45720" numCol="1" spcCol="0" rtlCol="0" fromWordArt="0" anchor="t" anchorCtr="0" forceAA="0" compatLnSpc="1">
-                        <a:prstTxWarp prst="textNoShape">
-                          <a:avLst/>
-                        </a:prstTxWarp>
-                        <a:noAutofit/>
-                      </wps:bodyPr>
-                    </wps:wsp>
-                  </a:graphicData>
-                </a:graphic>
-              </wp:anchor>
-            </w:drawing>
-          </mc:Choice>
-          <mc:Fallback>
-            <w:pict>
-              <v:shape w14:anchorId="2029474B" id="Cuadro de texto 7" o:spid="_x0000_s1027" type="#_x0000_t202" style="position:absolute;left:0;text-align:left;margin-left:10.2pt;margin-top:388.6pt;width:105pt;height:75.75pt;z-index:251667456;visibility:visible;mso-wrap-style:square;mso-wrap-distance-left:9pt;mso-wrap-distance-top:0;mso-wrap-distance-right:9pt;mso-wrap-distance-bottom:0;mso-position-horizontal:absolute;mso-position-horizontal-relative:text;mso-position-vertical:absolute;mso-position-vertical-relative:text;v-text-anchor:top" o:gfxdata="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" fillcolor="white [3201]" strokeweight=".5pt">
-                <v:textbox>
-                  <w:txbxContent>
-                    <w:p>
-                      <w:pPr>
-                        <w:rPr>
-                          <w:lang w:val="es-ES"/>
-                        </w:rPr>
-                      </w:pPr>
-                      <w:r>
-                        <w:rPr>
-                          <w:lang w:val="es-ES"/>
-                        </w:rPr>
-                        <w:t>Ventas no directas hacia los clientes</w:t>
-                      </w:r>
-                    </w:p>
-                  </w:txbxContent>
-                </v:textbox>
-              </v:shape>
-            </w:pict>
-          </mc:Fallback>
-        </mc:AlternateContent>
-      </w:r>
-      <w:r>
-        <w:rPr>
-          <w:noProof/>
-        </w:rPr>
-        <mc:AlternateContent>
-          <mc:Choice Requires="wps">
-            <w:drawing>
-              <wp:anchor distT="0" distB="0" distL="114300" distR="114300" simplePos="0" relativeHeight="251663360" behindDoc="0" locked="0" layoutInCell="1" allowOverlap="1" wp14:anchorId="6965F7DF" wp14:editId="062528AD">
-                <wp:simplePos x="0" y="0"/>
-                <wp:positionH relativeFrom="column">
-                  <wp:posOffset>4072890</wp:posOffset>
-                </wp:positionH>
-                <wp:positionV relativeFrom="paragraph">
-                  <wp:posOffset>3611245</wp:posOffset>
-                </wp:positionV>
-                <wp:extent cx="1333500" cy="962025"/>
-                <wp:effectExtent l="0" t="0" r="19050" b="28575"/>
+                <wp:extent cx="831273" cy="855023"/>
+                <wp:effectExtent l="0" t="0" r="26035" b="21590"/>
                 <wp:wrapNone/>
                 <wp:docPr id="5" name="Cuadro de texto 5"/>
                 <wp:cNvGraphicFramePr/>
@@ -2136,7 +2392,7 @@
                       <wps:spPr>
                         <a:xfrm>
                           <a:off x="0" y="0"/>
-                          <a:ext cx="1333500" cy="962025"/>
+                          <a:ext cx="831273" cy="855023"/>
                         </a:xfrm>
                         <a:prstGeom prst="rect">
                           <a:avLst/>
@@ -2182,12 +2438,18 @@
                     </wps:wsp>
                   </a:graphicData>
                 </a:graphic>
+                <wp14:sizeRelH relativeFrom="margin">
+                  <wp14:pctWidth>0</wp14:pctWidth>
+                </wp14:sizeRelH>
+                <wp14:sizeRelV relativeFrom="margin">
+                  <wp14:pctHeight>0</wp14:pctHeight>
+                </wp14:sizeRelV>
               </wp:anchor>
             </w:drawing>
           </mc:Choice>
           <mc:Fallback>
             <w:pict>
-              <v:shape w14:anchorId="6965F7DF" id="Cuadro de texto 5" o:spid="_x0000_s1028" type="#_x0000_t202" style="position:absolute;left:0;text-align:left;margin-left:320.7pt;margin-top:284.35pt;width:105pt;height:75.75pt;z-index:251663360;visibility:visible;mso-wrap-style:square;mso-wrap-distance-left:9pt;mso-wrap-distance-top:0;mso-wrap-distance-right:9pt;mso-wrap-distance-bottom:0;mso-position-horizontal:absolute;mso-position-horizontal-relative:text;mso-position-vertical:absolute;mso-position-vertical-relative:text;v-text-anchor:top" o:gfxdata="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" fillcolor="white [3201]" strokeweight=".5pt">
+              <v:shape w14:anchorId="6965F7DF" id="Cuadro de texto 5" o:spid="_x0000_s1030" type="#_x0000_t202" style="position:absolute;left:0;text-align:left;margin-left:253.45pt;margin-top:185.15pt;width:65.45pt;height:67.3pt;z-index:251663360;visibility:visible;mso-wrap-style:square;mso-width-percent:0;mso-height-percent:0;mso-wrap-distance-left:9pt;mso-wrap-distance-top:0;mso-wrap-distance-right:9pt;mso-wrap-distance-bottom:0;mso-position-horizontal:absolute;mso-position-horizontal-relative:text;mso-position-vertical:absolute;mso-position-vertical-relative:text;mso-width-percent:0;mso-height-percent:0;mso-width-relative:margin;mso-height-relative:margin;v-text-anchor:top" o:gfxdata="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" fillcolor="white [3201]" strokeweight=".5pt">
                 <v:textbox>
                   <w:txbxContent>
                     <w:p>
@@ -2223,111 +2485,16 @@
         <mc:AlternateContent>
           <mc:Choice Requires="wps">
             <w:drawing>
-              <wp:anchor distT="0" distB="0" distL="114300" distR="114300" simplePos="0" relativeHeight="251665408" behindDoc="0" locked="0" layoutInCell="1" allowOverlap="1" wp14:anchorId="358E8AE5" wp14:editId="7573297F">
+              <wp:anchor distT="0" distB="0" distL="114300" distR="114300" simplePos="0" relativeHeight="251661312" behindDoc="0" locked="0" layoutInCell="1" allowOverlap="1" wp14:anchorId="5CEFCD57" wp14:editId="21CDA9D6">
                 <wp:simplePos x="0" y="0"/>
                 <wp:positionH relativeFrom="column">
-                  <wp:posOffset>-251460</wp:posOffset>
+                  <wp:posOffset>3087882</wp:posOffset>
                 </wp:positionH>
                 <wp:positionV relativeFrom="paragraph">
-                  <wp:posOffset>3563620</wp:posOffset>
+                  <wp:posOffset>308857</wp:posOffset>
                 </wp:positionV>
-                <wp:extent cx="1333500" cy="962025"/>
-                <wp:effectExtent l="0" t="0" r="19050" b="28575"/>
-                <wp:wrapNone/>
-                <wp:docPr id="6" name="Cuadro de texto 6"/>
-                <wp:cNvGraphicFramePr/>
-                <a:graphic xmlns:a="http://schemas.openxmlformats.org/drawingml/2006/main">
-                  <a:graphicData uri="http://schemas.microsoft.com/office/word/2010/wordprocessingShape">
-                    <wps:wsp>
-                      <wps:cNvSpPr txBox="1"/>
-                      <wps:spPr>
-                        <a:xfrm>
-                          <a:off x="0" y="0"/>
-                          <a:ext cx="1333500" cy="962025"/>
-                        </a:xfrm>
-                        <a:prstGeom prst="rect">
-                          <a:avLst/>
-                        </a:prstGeom>
-                        <a:solidFill>
-                          <a:schemeClr val="lt1"/>
-                        </a:solidFill>
-                        <a:ln w="6350">
-                          <a:solidFill>
-                            <a:prstClr val="black"/>
-                          </a:solidFill>
-                        </a:ln>
-                      </wps:spPr>
-                      <wps:txbx>
-                        <w:txbxContent>
-                          <w:p>
-                            <w:pPr>
-                              <w:rPr>
-                                <w:lang w:val="es-ES"/>
-                              </w:rPr>
-                            </w:pPr>
-                            <w:r>
-                              <w:rPr>
-                                <w:lang w:val="es-ES"/>
-                              </w:rPr>
-                              <w:t>Poca trazabilidad de las exportaciones</w:t>
-                            </w:r>
-                          </w:p>
-                        </w:txbxContent>
-                      </wps:txbx>
-                      <wps:bodyPr rot="0" spcFirstLastPara="0" vertOverflow="overflow" horzOverflow="overflow" vert="horz" wrap="square" lIns="91440" tIns="45720" rIns="91440" bIns="45720" numCol="1" spcCol="0" rtlCol="0" fromWordArt="0" anchor="t" anchorCtr="0" forceAA="0" compatLnSpc="1">
-                        <a:prstTxWarp prst="textNoShape">
-                          <a:avLst/>
-                        </a:prstTxWarp>
-                        <a:noAutofit/>
-                      </wps:bodyPr>
-                    </wps:wsp>
-                  </a:graphicData>
-                </a:graphic>
-              </wp:anchor>
-            </w:drawing>
-          </mc:Choice>
-          <mc:Fallback>
-            <w:pict>
-              <v:shape w14:anchorId="358E8AE5" id="Cuadro de texto 6" o:spid="_x0000_s1029" type="#_x0000_t202" style="position:absolute;left:0;text-align:left;margin-left:-19.8pt;margin-top:280.6pt;width:105pt;height:75.75pt;z-index:251665408;visibility:visible;mso-wrap-style:square;mso-wrap-distance-left:9pt;mso-wrap-distance-top:0;mso-wrap-distance-right:9pt;mso-wrap-distance-bottom:0;mso-position-horizontal:absolute;mso-position-horizontal-relative:text;mso-position-vertical:absolute;mso-position-vertical-relative:text;v-text-anchor:top" o:gfxdata="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" fillcolor="white [3201]" strokeweight=".5pt">
-                <v:textbox>
-                  <w:txbxContent>
-                    <w:p>
-                      <w:pPr>
-                        <w:rPr>
-                          <w:lang w:val="es-ES"/>
-                        </w:rPr>
-                      </w:pPr>
-                      <w:r>
-                        <w:rPr>
-                          <w:lang w:val="es-ES"/>
-                        </w:rPr>
-                        <w:t>Poca trazabilidad de las exportaciones</w:t>
-                      </w:r>
-                    </w:p>
-                  </w:txbxContent>
-                </v:textbox>
-              </v:shape>
-            </w:pict>
-          </mc:Fallback>
-        </mc:AlternateContent>
-      </w:r>
-      <w:r>
-        <w:rPr>
-          <w:noProof/>
-        </w:rPr>
-        <mc:AlternateContent>
-          <mc:Choice Requires="wps">
-            <w:drawing>
-              <wp:anchor distT="0" distB="0" distL="114300" distR="114300" simplePos="0" relativeHeight="251661312" behindDoc="0" locked="0" layoutInCell="1" allowOverlap="1" wp14:anchorId="5CEFCD57" wp14:editId="5E4EDA97">
-                <wp:simplePos x="0" y="0"/>
-                <wp:positionH relativeFrom="column">
-                  <wp:posOffset>3672840</wp:posOffset>
-                </wp:positionH>
-                <wp:positionV relativeFrom="paragraph">
-                  <wp:posOffset>2296795</wp:posOffset>
-                </wp:positionV>
-                <wp:extent cx="1333500" cy="962025"/>
-                <wp:effectExtent l="0" t="0" r="19050" b="28575"/>
+                <wp:extent cx="1258784" cy="641391"/>
+                <wp:effectExtent l="0" t="0" r="17780" b="25400"/>
                 <wp:wrapNone/>
                 <wp:docPr id="4" name="Cuadro de texto 4"/>
                 <wp:cNvGraphicFramePr/>
@@ -2338,7 +2505,7 @@
                       <wps:spPr>
                         <a:xfrm>
                           <a:off x="0" y="0"/>
-                          <a:ext cx="1333500" cy="962025"/>
+                          <a:ext cx="1258784" cy="641391"/>
                         </a:xfrm>
                         <a:prstGeom prst="rect">
                           <a:avLst/>
@@ -2378,12 +2545,18 @@
                     </wps:wsp>
                   </a:graphicData>
                 </a:graphic>
+                <wp14:sizeRelH relativeFrom="margin">
+                  <wp14:pctWidth>0</wp14:pctWidth>
+                </wp14:sizeRelH>
+                <wp14:sizeRelV relativeFrom="margin">
+                  <wp14:pctHeight>0</wp14:pctHeight>
+                </wp14:sizeRelV>
               </wp:anchor>
             </w:drawing>
           </mc:Choice>
           <mc:Fallback>
             <w:pict>
-              <v:shape w14:anchorId="5CEFCD57" id="Cuadro de texto 4" o:spid="_x0000_s1030" type="#_x0000_t202" style="position:absolute;left:0;text-align:left;margin-left:289.2pt;margin-top:180.85pt;width:105pt;height:75.75pt;z-index:251661312;visibility:visible;mso-wrap-style:square;mso-wrap-distance-left:9pt;mso-wrap-distance-top:0;mso-wrap-distance-right:9pt;mso-wrap-distance-bottom:0;mso-position-horizontal:absolute;mso-position-horizontal-relative:text;mso-position-vertical:absolute;mso-position-vertical-relative:text;v-text-anchor:top" o:gfxdata="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" fillcolor="white [3201]" strokeweight=".5pt">
+              <v:shape w14:anchorId="5CEFCD57" id="Cuadro de texto 4" o:spid="_x0000_s1031" type="#_x0000_t202" style="position:absolute;left:0;text-align:left;margin-left:243.15pt;margin-top:24.3pt;width:99.1pt;height:50.5pt;z-index:251661312;visibility:visible;mso-wrap-style:square;mso-width-percent:0;mso-height-percent:0;mso-wrap-distance-left:9pt;mso-wrap-distance-top:0;mso-wrap-distance-right:9pt;mso-wrap-distance-bottom:0;mso-position-horizontal:absolute;mso-position-horizontal-relative:text;mso-position-vertical:absolute;mso-position-vertical-relative:text;mso-width-percent:0;mso-height-percent:0;mso-width-relative:margin;mso-height-relative:margin;v-text-anchor:top" o:gfxdata="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" fillcolor="white [3201]" strokeweight=".5pt">
                 <v:textbox>
                   <w:txbxContent>
                     <w:p>
@@ -2410,95 +2583,10 @@
         <w:rPr>
           <w:noProof/>
         </w:rPr>
-        <mc:AlternateContent>
-          <mc:Choice Requires="wps">
-            <w:drawing>
-              <wp:anchor distT="0" distB="0" distL="114300" distR="114300" simplePos="0" relativeHeight="251659264" behindDoc="0" locked="0" layoutInCell="1" allowOverlap="1" wp14:anchorId="479950B7" wp14:editId="6A40D9A2">
-                <wp:simplePos x="0" y="0"/>
-                <wp:positionH relativeFrom="column">
-                  <wp:posOffset>329565</wp:posOffset>
-                </wp:positionH>
-                <wp:positionV relativeFrom="paragraph">
-                  <wp:posOffset>2296795</wp:posOffset>
-                </wp:positionV>
-                <wp:extent cx="1333500" cy="962025"/>
-                <wp:effectExtent l="0" t="0" r="19050" b="28575"/>
-                <wp:wrapNone/>
-                <wp:docPr id="3" name="Cuadro de texto 3"/>
-                <wp:cNvGraphicFramePr/>
-                <a:graphic xmlns:a="http://schemas.openxmlformats.org/drawingml/2006/main">
-                  <a:graphicData uri="http://schemas.microsoft.com/office/word/2010/wordprocessingShape">
-                    <wps:wsp>
-                      <wps:cNvSpPr txBox="1"/>
-                      <wps:spPr>
-                        <a:xfrm>
-                          <a:off x="0" y="0"/>
-                          <a:ext cx="1333500" cy="962025"/>
-                        </a:xfrm>
-                        <a:prstGeom prst="rect">
-                          <a:avLst/>
-                        </a:prstGeom>
-                        <a:solidFill>
-                          <a:schemeClr val="lt1"/>
-                        </a:solidFill>
-                        <a:ln w="6350">
-                          <a:solidFill>
-                            <a:prstClr val="black"/>
-                          </a:solidFill>
-                        </a:ln>
-                      </wps:spPr>
-                      <wps:txbx>
-                        <w:txbxContent>
-                          <w:p>
-                            <w:r>
-                              <w:rPr>
-                                <w:lang w:val="es-ES"/>
-                              </w:rPr>
-                              <w:t>Carencia de una base de datos moderna</w:t>
-                            </w:r>
-                          </w:p>
-                        </w:txbxContent>
-                      </wps:txbx>
-                      <wps:bodyPr rot="0" spcFirstLastPara="0" vertOverflow="overflow" horzOverflow="overflow" vert="horz" wrap="square" lIns="91440" tIns="45720" rIns="91440" bIns="45720" numCol="1" spcCol="0" rtlCol="0" fromWordArt="0" anchor="t" anchorCtr="0" forceAA="0" compatLnSpc="1">
-                        <a:prstTxWarp prst="textNoShape">
-                          <a:avLst/>
-                        </a:prstTxWarp>
-                        <a:noAutofit/>
-                      </wps:bodyPr>
-                    </wps:wsp>
-                  </a:graphicData>
-                </a:graphic>
-              </wp:anchor>
-            </w:drawing>
-          </mc:Choice>
-          <mc:Fallback>
-            <w:pict>
-              <v:shape w14:anchorId="479950B7" id="Cuadro de texto 3" o:spid="_x0000_s1031" type="#_x0000_t202" style="position:absolute;left:0;text-align:left;margin-left:25.95pt;margin-top:180.85pt;width:105pt;height:75.75pt;z-index:251659264;visibility:visible;mso-wrap-style:square;mso-wrap-distance-left:9pt;mso-wrap-distance-top:0;mso-wrap-distance-right:9pt;mso-wrap-distance-bottom:0;mso-position-horizontal:absolute;mso-position-horizontal-relative:text;mso-position-vertical:absolute;mso-position-vertical-relative:text;v-text-anchor:top" o:gfxdata="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" fillcolor="white [3201]" strokeweight=".5pt">
-                <v:textbox>
-                  <w:txbxContent>
-                    <w:p>
-                      <w:r>
-                        <w:rPr>
-                          <w:lang w:val="es-ES"/>
-                        </w:rPr>
-                        <w:t>Carencia de una base de datos moderna</w:t>
-                      </w:r>
-                    </w:p>
-                  </w:txbxContent>
-                </v:textbox>
-              </v:shape>
-            </w:pict>
-          </mc:Fallback>
-        </mc:AlternateContent>
-      </w:r>
-      <w:r>
-        <w:rPr>
-          <w:noProof/>
-        </w:rPr>
         <w:drawing>
-          <wp:inline distT="0" distB="0" distL="0" distR="0" wp14:anchorId="47CFBC69" wp14:editId="17C65969">
-            <wp:extent cx="6587384" cy="4498538"/>
-            <wp:effectExtent l="0" t="3492" r="952" b="953"/>
+          <wp:inline distT="0" distB="0" distL="0" distR="0" wp14:anchorId="47CFBC69" wp14:editId="38ED3097">
+            <wp:extent cx="5244943" cy="3581782"/>
+            <wp:effectExtent l="0" t="0" r="0" b="0"/>
             <wp:docPr id="1" name="Imagen 1"/>
             <wp:cNvGraphicFramePr>
               <a:graphicFrameLocks xmlns:a="http://schemas.openxmlformats.org/drawingml/2006/main" noChangeAspect="1"/>
@@ -2516,9 +2604,9 @@
                     <a:stretch/>
                   </pic:blipFill>
                   <pic:spPr bwMode="auto">
-                    <a:xfrm rot="16200000">
+                    <a:xfrm>
                       <a:off x="0" y="0"/>
-                      <a:ext cx="6643435" cy="4536815"/>
+                      <a:ext cx="5296990" cy="3617325"/>
                     </a:xfrm>
                     <a:prstGeom prst="rect">
                       <a:avLst/>
@@ -2661,51 +2749,6 @@
     </w:p>
     <w:p>
       <w:pPr>
-        <w:pStyle w:val="ListParagraph"/>
-        <w:shd w:val="clear" w:color="auto" w:fill="FFFFFF"/>
-        <w:spacing w:after="0" w:line="240" w:lineRule="auto"/>
-        <w:ind w:left="792"/>
-        <w:rPr>
-          <w:rFonts w:ascii="Arial" w:eastAsia="Times New Roman" w:hAnsi="Arial" w:cs="Arial"/>
-          <w:color w:val="222222"/>
-          <w:kern w:val="0"/>
-          <w:lang w:eastAsia="es-PE"/>
-          <w14:ligatures w14:val="none"/>
-        </w:rPr>
-      </w:pPr>
-    </w:p>
-    <w:p>
-      <w:pPr>
-        <w:pStyle w:val="ListParagraph"/>
-        <w:shd w:val="clear" w:color="auto" w:fill="FFFFFF"/>
-        <w:spacing w:after="0" w:line="240" w:lineRule="auto"/>
-        <w:ind w:left="792"/>
-        <w:rPr>
-          <w:rFonts w:ascii="Arial" w:eastAsia="Times New Roman" w:hAnsi="Arial" w:cs="Arial"/>
-          <w:color w:val="222222"/>
-          <w:kern w:val="0"/>
-          <w:lang w:eastAsia="es-PE"/>
-          <w14:ligatures w14:val="none"/>
-        </w:rPr>
-      </w:pPr>
-    </w:p>
-    <w:p>
-      <w:pPr>
-        <w:pStyle w:val="ListParagraph"/>
-        <w:shd w:val="clear" w:color="auto" w:fill="FFFFFF"/>
-        <w:spacing w:after="0" w:line="240" w:lineRule="auto"/>
-        <w:ind w:left="792"/>
-        <w:rPr>
-          <w:rFonts w:ascii="Arial" w:eastAsia="Times New Roman" w:hAnsi="Arial" w:cs="Arial"/>
-          <w:color w:val="222222"/>
-          <w:kern w:val="0"/>
-          <w:lang w:eastAsia="es-PE"/>
-          <w14:ligatures w14:val="none"/>
-        </w:rPr>
-      </w:pPr>
-    </w:p>
-    <w:p>
-      <w:pPr>
         <w:shd w:val="clear" w:color="auto" w:fill="FFFFFF"/>
         <w:spacing w:after="0" w:line="240" w:lineRule="auto"/>
         <w:rPr>
@@ -2739,6 +2782,7 @@
           <w:bCs/>
           <w:lang w:val="es-ES"/>
         </w:rPr>
+        <w:lastRenderedPageBreak/>
         <w:t>Análisis del problema</w:t>
       </w:r>
     </w:p>
@@ -2764,7 +2808,6 @@
           <w:bCs/>
           <w:lang w:val="es-ES"/>
         </w:rPr>
-        <w:lastRenderedPageBreak/>
         <w:t>Tablas</w:t>
       </w:r>
     </w:p>
@@ -2824,10 +2867,10 @@
           <w:lang w:val="es-ES"/>
         </w:rPr>
         <w:drawing>
-          <wp:inline distT="0" distB="0" distL="0" distR="0" wp14:anchorId="5A2A6C2E" wp14:editId="26151248">
+          <wp:inline distT="0" distB="0" distL="0" distR="0" wp14:anchorId="781DE88F" wp14:editId="6593B985">
             <wp:extent cx="5400040" cy="3150235"/>
-            <wp:effectExtent l="0" t="0" r="0" b="0"/>
-            <wp:docPr id="11" name="Diagrama 11"/>
+            <wp:effectExtent l="0" t="0" r="10160" b="12065"/>
+            <wp:docPr id="240229098" name="Diagram 7"/>
             <wp:cNvGraphicFramePr/>
             <a:graphic xmlns:a="http://schemas.openxmlformats.org/drawingml/2006/main">
               <a:graphicData uri="http://schemas.openxmlformats.org/drawingml/2006/diagram">
@@ -9746,8 +9789,8 @@
 <file path=word/diagrams/data2.xml><?xml version="1.0" encoding="utf-8"?>
 <dgm:dataModel xmlns:dgm="http://schemas.openxmlformats.org/drawingml/2006/diagram" xmlns:a="http://schemas.openxmlformats.org/drawingml/2006/main">
   <dgm:ptLst>
-    <dgm:pt modelId="{E90ED010-ECCB-45F2-B3FE-8619849B0397}" type="doc">
-      <dgm:prSet loTypeId="urn:microsoft.com/office/officeart/2005/8/layout/hierarchy2" loCatId="hierarchy" qsTypeId="urn:microsoft.com/office/officeart/2005/8/quickstyle/simple4" qsCatId="simple" csTypeId="urn:microsoft.com/office/officeart/2005/8/colors/accent1_2" csCatId="accent1" phldr="1"/>
+    <dgm:pt modelId="{BB2464BA-081D-4B3A-B0A6-CDEE8DECB181}" type="doc">
+      <dgm:prSet loTypeId="urn:microsoft.com/office/officeart/2005/8/layout/matrix1" loCatId="matrix" qsTypeId="urn:microsoft.com/office/officeart/2005/8/quickstyle/simple1" qsCatId="simple" csTypeId="urn:microsoft.com/office/officeart/2005/8/colors/accent1_2" csCatId="accent1" phldr="1"/>
       <dgm:spPr/>
       <dgm:t>
         <a:bodyPr/>
@@ -9757,8 +9800,8 @@
         </a:p>
       </dgm:t>
     </dgm:pt>
-    <dgm:pt modelId="{B806241A-21BA-45A3-85D5-E74853CFBF9B}">
-      <dgm:prSet phldrT="[Texto]"/>
+    <dgm:pt modelId="{ABFCE8A3-0BFF-4AC0-A58A-ADC58999D497}">
+      <dgm:prSet phldrT="[Text]"/>
       <dgm:spPr/>
       <dgm:t>
         <a:bodyPr/>
@@ -9766,12 +9809,12 @@
         <a:p>
           <a:r>
             <a:rPr lang="es-PE"/>
-            <a:t>Gestion de compras</a:t>
+            <a:t>Base de datos "agroglobal"</a:t>
           </a:r>
         </a:p>
       </dgm:t>
     </dgm:pt>
-    <dgm:pt modelId="{2C12B439-B5C8-4A54-AA68-0F21E7E7AED2}" type="parTrans" cxnId="{6244DA02-4DE0-4113-830C-62E56EFD848C}">
+    <dgm:pt modelId="{6CCFF629-179D-4BDD-852F-57D663D1E2C4}" type="parTrans" cxnId="{02D409D2-21B6-444D-92EE-423F4E6F6108}">
       <dgm:prSet/>
       <dgm:spPr/>
       <dgm:t>
@@ -9782,7 +9825,7 @@
         </a:p>
       </dgm:t>
     </dgm:pt>
-    <dgm:pt modelId="{E34928CE-C12D-4053-A1E8-D5AE55C23E24}" type="sibTrans" cxnId="{6244DA02-4DE0-4113-830C-62E56EFD848C}">
+    <dgm:pt modelId="{42F903A5-6CA3-40F3-A6B9-BDAA841D3BEC}" type="sibTrans" cxnId="{02D409D2-21B6-444D-92EE-423F4E6F6108}">
       <dgm:prSet/>
       <dgm:spPr/>
       <dgm:t>
@@ -9793,8 +9836,8 @@
         </a:p>
       </dgm:t>
     </dgm:pt>
-    <dgm:pt modelId="{0D6981A7-25DB-4AB2-9B09-1A9717B28669}">
-      <dgm:prSet phldrT="[Texto]"/>
+    <dgm:pt modelId="{178FD340-0998-44EE-BF32-F2A4C865D183}">
+      <dgm:prSet phldrT="[Text]"/>
       <dgm:spPr/>
       <dgm:t>
         <a:bodyPr/>
@@ -9802,12 +9845,18 @@
         <a:p>
           <a:r>
             <a:rPr lang="es-PE"/>
-            <a:t>Gestion de salida</a:t>
+            <a:t>Gestion de salidas:</a:t>
+          </a:r>
+        </a:p>
+        <a:p>
+          <a:r>
+            <a:rPr lang="es-PE"/>
+            <a:t>Despachos y monitoreopuerto</a:t>
           </a:r>
         </a:p>
       </dgm:t>
     </dgm:pt>
-    <dgm:pt modelId="{3BC5C666-A39A-4FE0-B790-1268E9528488}" type="parTrans" cxnId="{59C19764-ED16-410F-9508-D7468F982EE1}">
+    <dgm:pt modelId="{F35325B6-754F-43F3-AECF-D0589CC263DA}" type="parTrans" cxnId="{CCAB438C-CA0E-4E02-A605-D248C77066C2}">
       <dgm:prSet/>
       <dgm:spPr/>
       <dgm:t>
@@ -9818,7 +9867,7 @@
         </a:p>
       </dgm:t>
     </dgm:pt>
-    <dgm:pt modelId="{F7239425-F096-4203-9ABE-8E09DC1A5721}" type="sibTrans" cxnId="{59C19764-ED16-410F-9508-D7468F982EE1}">
+    <dgm:pt modelId="{A726973F-FB1E-4A2C-9D07-18F09026CA21}" type="sibTrans" cxnId="{CCAB438C-CA0E-4E02-A605-D248C77066C2}">
       <dgm:prSet/>
       <dgm:spPr/>
       <dgm:t>
@@ -9829,8 +9878,8 @@
         </a:p>
       </dgm:t>
     </dgm:pt>
-    <dgm:pt modelId="{D8E70305-12AD-4F49-BD91-33D35FC62BA7}">
-      <dgm:prSet phldrT="[Texto]"/>
+    <dgm:pt modelId="{79F8C9E6-E441-4856-9DE2-03B6AB20A102}">
+      <dgm:prSet phldrT="[Text]"/>
       <dgm:spPr/>
       <dgm:t>
         <a:bodyPr/>
@@ -9838,12 +9887,18 @@
         <a:p>
           <a:r>
             <a:rPr lang="es-PE"/>
-            <a:t>Produccion</a:t>
+            <a:t>Gestion de compras:</a:t>
+          </a:r>
+        </a:p>
+        <a:p>
+          <a:r>
+            <a:rPr lang="es-PE"/>
+            <a:t>Transacciones, transaccionesdetalle y canales</a:t>
           </a:r>
         </a:p>
       </dgm:t>
     </dgm:pt>
-    <dgm:pt modelId="{30245E7D-36E3-48C1-9B64-167DE823D6DD}" type="parTrans" cxnId="{2D8E3F15-2A06-4F96-9A41-5D8A3F80C74A}">
+    <dgm:pt modelId="{2A059EE1-12AE-428A-9ADD-1F3ED2852EF2}" type="parTrans" cxnId="{1112C1B3-41E5-4E60-9984-C3048FEF16B8}">
       <dgm:prSet/>
       <dgm:spPr/>
       <dgm:t>
@@ -9854,7 +9909,7 @@
         </a:p>
       </dgm:t>
     </dgm:pt>
-    <dgm:pt modelId="{2B36A1F1-A054-4E1C-B6B1-CBE1475E0AAD}" type="sibTrans" cxnId="{2D8E3F15-2A06-4F96-9A41-5D8A3F80C74A}">
+    <dgm:pt modelId="{1273AC21-FBEB-4CBB-BE38-EC694397B2BE}" type="sibTrans" cxnId="{1112C1B3-41E5-4E60-9984-C3048FEF16B8}">
       <dgm:prSet/>
       <dgm:spPr/>
       <dgm:t>
@@ -9865,8 +9920,8 @@
         </a:p>
       </dgm:t>
     </dgm:pt>
-    <dgm:pt modelId="{C613CF21-FF49-4AD0-A8C2-7E23EBC840BA}">
-      <dgm:prSet phldrT="[Texto]"/>
+    <dgm:pt modelId="{E0F8754D-031D-46A4-947D-70EA03CB7A85}">
+      <dgm:prSet phldrT="[Text]"/>
       <dgm:spPr/>
       <dgm:t>
         <a:bodyPr/>
@@ -9874,12 +9929,18 @@
         <a:p>
           <a:r>
             <a:rPr lang="es-PE"/>
-            <a:t>Cliente/Solicitud</a:t>
+            <a:t>Produccion: </a:t>
+          </a:r>
+        </a:p>
+        <a:p>
+          <a:r>
+            <a:rPr lang="es-PE"/>
+            <a:t>Lotes y productos </a:t>
           </a:r>
         </a:p>
       </dgm:t>
     </dgm:pt>
-    <dgm:pt modelId="{51659AB6-D2DD-476D-854C-3AF664BE4753}" type="parTrans" cxnId="{7A14A2C3-1547-4D62-B263-1843FAEFA0D7}">
+    <dgm:pt modelId="{1DC585A6-A47A-4405-86A0-841751124881}" type="parTrans" cxnId="{E1FDEACD-D15D-44F4-BC5C-80CCF223FE82}">
       <dgm:prSet/>
       <dgm:spPr/>
       <dgm:t>
@@ -9890,7 +9951,7 @@
         </a:p>
       </dgm:t>
     </dgm:pt>
-    <dgm:pt modelId="{C7C7CC2E-371F-4BA5-ADAC-218067DF08A6}" type="sibTrans" cxnId="{7A14A2C3-1547-4D62-B263-1843FAEFA0D7}">
+    <dgm:pt modelId="{5D6C68A1-6B09-469E-9CE2-C1476A635609}" type="sibTrans" cxnId="{E1FDEACD-D15D-44F4-BC5C-80CCF223FE82}">
       <dgm:prSet/>
       <dgm:spPr/>
       <dgm:t>
@@ -9901,8 +9962,8 @@
         </a:p>
       </dgm:t>
     </dgm:pt>
-    <dgm:pt modelId="{D77BE9EE-44F0-487C-96EF-B1460D15E85F}">
-      <dgm:prSet/>
+    <dgm:pt modelId="{81FEEF98-4BD1-4D41-BA5D-CE06208F7C4E}">
+      <dgm:prSet phldrT="[Text]"/>
       <dgm:spPr/>
       <dgm:t>
         <a:bodyPr/>
@@ -9910,24 +9971,18 @@
         <a:p>
           <a:r>
             <a:rPr lang="es-PE"/>
-            <a:t>- Detalle de la transferencia</a:t>
+            <a:t>Datos del consumidor:</a:t>
           </a:r>
         </a:p>
         <a:p>
           <a:r>
             <a:rPr lang="es-PE"/>
-            <a:t>- Transacciones</a:t>
-          </a:r>
-        </a:p>
-        <a:p>
-          <a:r>
-            <a:rPr lang="es-PE"/>
-            <a:t>- Canales </a:t>
+            <a:t>Interaccionesqr y consumidorfinal</a:t>
           </a:r>
         </a:p>
       </dgm:t>
     </dgm:pt>
-    <dgm:pt modelId="{990E7673-22A5-432F-9C50-04D8AB9A5F0C}" type="parTrans" cxnId="{85FBC83C-677F-4DE6-B7AE-518523AC8E44}">
+    <dgm:pt modelId="{C685C38B-4378-452F-9322-56C97A1BB594}" type="parTrans" cxnId="{5A74213D-72B9-4B04-899F-9961D4BC0E23}">
       <dgm:prSet/>
       <dgm:spPr/>
       <dgm:t>
@@ -9938,7 +9993,7 @@
         </a:p>
       </dgm:t>
     </dgm:pt>
-    <dgm:pt modelId="{192F095F-ADDD-48C5-A04E-E5AEAA2559EF}" type="sibTrans" cxnId="{85FBC83C-677F-4DE6-B7AE-518523AC8E44}">
+    <dgm:pt modelId="{229A51D4-F1E7-4952-8BB7-D3475CD73710}" type="sibTrans" cxnId="{5A74213D-72B9-4B04-899F-9961D4BC0E23}">
       <dgm:prSet/>
       <dgm:spPr/>
       <dgm:t>
@@ -9949,351 +10004,113 @@
         </a:p>
       </dgm:t>
     </dgm:pt>
-    <dgm:pt modelId="{C3A8FE2E-1344-4361-BF5F-E8D1BCE498E0}">
-      <dgm:prSet/>
-      <dgm:spPr/>
-      <dgm:t>
-        <a:bodyPr/>
-        <a:lstStyle/>
-        <a:p>
-          <a:r>
-            <a:rPr lang="es-PE"/>
-            <a:t>- Despacho </a:t>
-          </a:r>
-        </a:p>
-        <a:p>
-          <a:r>
-            <a:rPr lang="es-PE"/>
-            <a:t>- Monitoreo de puerto</a:t>
-          </a:r>
-        </a:p>
-      </dgm:t>
-    </dgm:pt>
-    <dgm:pt modelId="{A20B399E-C606-4C26-B047-4C9436A79344}" type="parTrans" cxnId="{8A2CE78E-1B20-4BDD-A39D-ACDB9C06FDFE}">
-      <dgm:prSet/>
-      <dgm:spPr/>
-      <dgm:t>
-        <a:bodyPr/>
-        <a:lstStyle/>
-        <a:p>
-          <a:endParaRPr lang="es-PE"/>
-        </a:p>
-      </dgm:t>
-    </dgm:pt>
-    <dgm:pt modelId="{FC144699-5A83-45BC-9E59-B68DE06BC197}" type="sibTrans" cxnId="{8A2CE78E-1B20-4BDD-A39D-ACDB9C06FDFE}">
-      <dgm:prSet/>
-      <dgm:spPr/>
-      <dgm:t>
-        <a:bodyPr/>
-        <a:lstStyle/>
-        <a:p>
-          <a:endParaRPr lang="es-PE"/>
-        </a:p>
-      </dgm:t>
-    </dgm:pt>
-    <dgm:pt modelId="{1C846715-B75D-45BD-B6B4-2743BBA43992}">
-      <dgm:prSet/>
-      <dgm:spPr/>
-      <dgm:t>
-        <a:bodyPr/>
-        <a:lstStyle/>
-        <a:p>
-          <a:r>
-            <a:rPr lang="es-PE"/>
-            <a:t>- Qr o codigos en barra</a:t>
-          </a:r>
-        </a:p>
-        <a:p>
-          <a:r>
-            <a:rPr lang="es-PE"/>
-            <a:t>- Consumidor final</a:t>
-          </a:r>
-        </a:p>
-      </dgm:t>
-    </dgm:pt>
-    <dgm:pt modelId="{C1DF1329-ACC2-4126-B762-AE854F42DF0F}" type="parTrans" cxnId="{E29BEFD9-6320-40AC-B1F0-39118EA186C9}">
-      <dgm:prSet/>
-      <dgm:spPr/>
-      <dgm:t>
-        <a:bodyPr/>
-        <a:lstStyle/>
-        <a:p>
-          <a:endParaRPr lang="es-PE"/>
-        </a:p>
-      </dgm:t>
-    </dgm:pt>
-    <dgm:pt modelId="{80D443D8-B16D-43B0-9A86-9190E0DBCF2C}" type="sibTrans" cxnId="{E29BEFD9-6320-40AC-B1F0-39118EA186C9}">
-      <dgm:prSet/>
-      <dgm:spPr/>
-      <dgm:t>
-        <a:bodyPr/>
-        <a:lstStyle/>
-        <a:p>
-          <a:endParaRPr lang="es-PE"/>
-        </a:p>
-      </dgm:t>
-    </dgm:pt>
-    <dgm:pt modelId="{BAABDAFB-7634-4485-9547-A4CFB2ECCBC1}">
-      <dgm:prSet/>
-      <dgm:spPr/>
-      <dgm:t>
-        <a:bodyPr/>
-        <a:lstStyle/>
-        <a:p>
-          <a:r>
-            <a:rPr lang="es-PE"/>
-            <a:t>- Productos</a:t>
-          </a:r>
-        </a:p>
-        <a:p>
-          <a:r>
-            <a:rPr lang="es-PE"/>
-            <a:t>- Lotes</a:t>
-          </a:r>
-        </a:p>
-      </dgm:t>
-    </dgm:pt>
-    <dgm:pt modelId="{A7ABAED1-D1A9-4259-A869-EC8D05063D89}" type="parTrans" cxnId="{13DE0BAC-1CF6-4013-95FF-2C7AEA806F67}">
-      <dgm:prSet/>
-      <dgm:spPr/>
-      <dgm:t>
-        <a:bodyPr/>
-        <a:lstStyle/>
-        <a:p>
-          <a:endParaRPr lang="es-PE"/>
-        </a:p>
-      </dgm:t>
-    </dgm:pt>
-    <dgm:pt modelId="{050544D5-E72A-4DF7-8EA9-75413E09974E}" type="sibTrans" cxnId="{13DE0BAC-1CF6-4013-95FF-2C7AEA806F67}">
-      <dgm:prSet/>
-      <dgm:spPr/>
-      <dgm:t>
-        <a:bodyPr/>
-        <a:lstStyle/>
-        <a:p>
-          <a:endParaRPr lang="es-PE"/>
-        </a:p>
-      </dgm:t>
-    </dgm:pt>
-    <dgm:pt modelId="{8A64451B-6987-40AB-8AA9-829BB3BBA757}" type="pres">
-      <dgm:prSet presAssocID="{E90ED010-ECCB-45F2-B3FE-8619849B0397}" presName="diagram" presStyleCnt="0">
+    <dgm:pt modelId="{E38F0745-8114-4CFB-B9ED-F3A2638DCF4D}" type="pres">
+      <dgm:prSet presAssocID="{BB2464BA-081D-4B3A-B0A6-CDEE8DECB181}" presName="diagram" presStyleCnt="0">
         <dgm:presLayoutVars>
-          <dgm:chPref val="1"/>
+          <dgm:chMax val="1"/>
           <dgm:dir/>
-          <dgm:animOne val="branch"/>
-          <dgm:animLvl val="lvl"/>
+          <dgm:animLvl val="ctr"/>
           <dgm:resizeHandles val="exact"/>
         </dgm:presLayoutVars>
       </dgm:prSet>
       <dgm:spPr/>
     </dgm:pt>
-    <dgm:pt modelId="{354228CF-A08F-44EF-9CB8-0B7E93C00E73}" type="pres">
-      <dgm:prSet presAssocID="{B806241A-21BA-45A3-85D5-E74853CFBF9B}" presName="root1" presStyleCnt="0"/>
+    <dgm:pt modelId="{2B42E5E3-ABBF-4DB9-9BB9-32BAD791DBCF}" type="pres">
+      <dgm:prSet presAssocID="{BB2464BA-081D-4B3A-B0A6-CDEE8DECB181}" presName="matrix" presStyleCnt="0"/>
       <dgm:spPr/>
     </dgm:pt>
-    <dgm:pt modelId="{10626306-2580-41C1-A07D-89D5E873C004}" type="pres">
-      <dgm:prSet presAssocID="{B806241A-21BA-45A3-85D5-E74853CFBF9B}" presName="LevelOneTextNode" presStyleLbl="node0" presStyleIdx="0" presStyleCnt="5" custScaleX="64488" custScaleY="38660">
+    <dgm:pt modelId="{77855043-8F3A-4C66-9106-6B288F3097C9}" type="pres">
+      <dgm:prSet presAssocID="{BB2464BA-081D-4B3A-B0A6-CDEE8DECB181}" presName="tile1" presStyleLbl="node1" presStyleIdx="0" presStyleCnt="4"/>
+      <dgm:spPr/>
+    </dgm:pt>
+    <dgm:pt modelId="{BDA43C3D-C9C7-4995-8348-F09F390913AF}" type="pres">
+      <dgm:prSet presAssocID="{BB2464BA-081D-4B3A-B0A6-CDEE8DECB181}" presName="tile1text" presStyleLbl="node1" presStyleIdx="0" presStyleCnt="4">
         <dgm:presLayoutVars>
-          <dgm:chPref val="3"/>
+          <dgm:chMax val="0"/>
+          <dgm:chPref val="0"/>
+          <dgm:bulletEnabled val="1"/>
         </dgm:presLayoutVars>
       </dgm:prSet>
       <dgm:spPr/>
     </dgm:pt>
-    <dgm:pt modelId="{C763A4D4-8040-40A2-9435-EC29B21C813D}" type="pres">
-      <dgm:prSet presAssocID="{B806241A-21BA-45A3-85D5-E74853CFBF9B}" presName="level2hierChild" presStyleCnt="0"/>
+    <dgm:pt modelId="{E74F4A6E-7743-4BA4-9D84-79269FA37DB4}" type="pres">
+      <dgm:prSet presAssocID="{BB2464BA-081D-4B3A-B0A6-CDEE8DECB181}" presName="tile2" presStyleLbl="node1" presStyleIdx="1" presStyleCnt="4"/>
       <dgm:spPr/>
     </dgm:pt>
-    <dgm:pt modelId="{0F9AD43E-D1E1-4DF9-BBDC-9DD7E9F2F7FF}" type="pres">
-      <dgm:prSet presAssocID="{3BC5C666-A39A-4FE0-B790-1268E9528488}" presName="conn2-1" presStyleLbl="parChTrans1D2" presStyleIdx="0" presStyleCnt="2"/>
-      <dgm:spPr/>
-    </dgm:pt>
-    <dgm:pt modelId="{07776F11-23BD-403D-B16A-F306F7D3401E}" type="pres">
-      <dgm:prSet presAssocID="{3BC5C666-A39A-4FE0-B790-1268E9528488}" presName="connTx" presStyleLbl="parChTrans1D2" presStyleIdx="0" presStyleCnt="2"/>
-      <dgm:spPr/>
-    </dgm:pt>
-    <dgm:pt modelId="{9ED10207-4D67-4BC5-AEC7-DFA31AA26658}" type="pres">
-      <dgm:prSet presAssocID="{0D6981A7-25DB-4AB2-9B09-1A9717B28669}" presName="root2" presStyleCnt="0"/>
-      <dgm:spPr/>
-    </dgm:pt>
-    <dgm:pt modelId="{8D89B59C-76D8-4726-93E9-BDBDEEC9934A}" type="pres">
-      <dgm:prSet presAssocID="{0D6981A7-25DB-4AB2-9B09-1A9717B28669}" presName="LevelTwoTextNode" presStyleLbl="node2" presStyleIdx="0" presStyleCnt="2" custScaleY="32348" custLinFactNeighborX="-22481" custLinFactNeighborY="-71696">
+    <dgm:pt modelId="{5BA9D47E-3BAB-4AA9-B14A-54B26154C85B}" type="pres">
+      <dgm:prSet presAssocID="{BB2464BA-081D-4B3A-B0A6-CDEE8DECB181}" presName="tile2text" presStyleLbl="node1" presStyleIdx="1" presStyleCnt="4">
         <dgm:presLayoutVars>
-          <dgm:chPref val="3"/>
+          <dgm:chMax val="0"/>
+          <dgm:chPref val="0"/>
+          <dgm:bulletEnabled val="1"/>
         </dgm:presLayoutVars>
       </dgm:prSet>
       <dgm:spPr/>
     </dgm:pt>
-    <dgm:pt modelId="{5B4EC5F6-6958-4F76-BE0F-7C41049624DE}" type="pres">
-      <dgm:prSet presAssocID="{0D6981A7-25DB-4AB2-9B09-1A9717B28669}" presName="level3hierChild" presStyleCnt="0"/>
+    <dgm:pt modelId="{D9CB5EF0-57C4-47A5-AE9B-937CE97F9480}" type="pres">
+      <dgm:prSet presAssocID="{BB2464BA-081D-4B3A-B0A6-CDEE8DECB181}" presName="tile3" presStyleLbl="node1" presStyleIdx="2" presStyleCnt="4"/>
       <dgm:spPr/>
     </dgm:pt>
-    <dgm:pt modelId="{FEB800BA-EEE9-45E9-BF1E-F37CDFE0C36F}" type="pres">
-      <dgm:prSet presAssocID="{30245E7D-36E3-48C1-9B64-167DE823D6DD}" presName="conn2-1" presStyleLbl="parChTrans1D2" presStyleIdx="1" presStyleCnt="2"/>
-      <dgm:spPr/>
-    </dgm:pt>
-    <dgm:pt modelId="{2C4F3879-804B-4DA5-98F3-15BF153BA3C4}" type="pres">
-      <dgm:prSet presAssocID="{30245E7D-36E3-48C1-9B64-167DE823D6DD}" presName="connTx" presStyleLbl="parChTrans1D2" presStyleIdx="1" presStyleCnt="2"/>
-      <dgm:spPr/>
-    </dgm:pt>
-    <dgm:pt modelId="{55F9392C-296E-4785-BB86-CF73E09676EB}" type="pres">
-      <dgm:prSet presAssocID="{D8E70305-12AD-4F49-BD91-33D35FC62BA7}" presName="root2" presStyleCnt="0"/>
-      <dgm:spPr/>
-    </dgm:pt>
-    <dgm:pt modelId="{4AD5691D-C99C-4250-97DA-3BA6F8AC12A9}" type="pres">
-      <dgm:prSet presAssocID="{D8E70305-12AD-4F49-BD91-33D35FC62BA7}" presName="LevelTwoTextNode" presStyleLbl="node2" presStyleIdx="1" presStyleCnt="2" custScaleY="33667" custLinFactNeighborX="9114" custLinFactNeighborY="38886">
+    <dgm:pt modelId="{E23687CB-CD0B-46E6-BDE9-C3090FEB3CCA}" type="pres">
+      <dgm:prSet presAssocID="{BB2464BA-081D-4B3A-B0A6-CDEE8DECB181}" presName="tile3text" presStyleLbl="node1" presStyleIdx="2" presStyleCnt="4">
         <dgm:presLayoutVars>
-          <dgm:chPref val="3"/>
+          <dgm:chMax val="0"/>
+          <dgm:chPref val="0"/>
+          <dgm:bulletEnabled val="1"/>
         </dgm:presLayoutVars>
       </dgm:prSet>
       <dgm:spPr/>
     </dgm:pt>
-    <dgm:pt modelId="{1BDF2A4F-930C-43FF-8AFF-C379A0F50133}" type="pres">
-      <dgm:prSet presAssocID="{D8E70305-12AD-4F49-BD91-33D35FC62BA7}" presName="level3hierChild" presStyleCnt="0"/>
+    <dgm:pt modelId="{F9212AD2-3739-41F9-857E-CD128EBB22FE}" type="pres">
+      <dgm:prSet presAssocID="{BB2464BA-081D-4B3A-B0A6-CDEE8DECB181}" presName="tile4" presStyleLbl="node1" presStyleIdx="3" presStyleCnt="4"/>
       <dgm:spPr/>
     </dgm:pt>
-    <dgm:pt modelId="{809E78D7-ECDC-4D04-A70A-F7167F78B08D}" type="pres">
-      <dgm:prSet presAssocID="{51659AB6-D2DD-476D-854C-3AF664BE4753}" presName="conn2-1" presStyleLbl="parChTrans1D3" presStyleIdx="0" presStyleCnt="1"/>
-      <dgm:spPr/>
-    </dgm:pt>
-    <dgm:pt modelId="{467394A1-4197-4155-9F22-F46641CDF339}" type="pres">
-      <dgm:prSet presAssocID="{51659AB6-D2DD-476D-854C-3AF664BE4753}" presName="connTx" presStyleLbl="parChTrans1D3" presStyleIdx="0" presStyleCnt="1"/>
-      <dgm:spPr/>
-    </dgm:pt>
-    <dgm:pt modelId="{776D5F48-9252-47DE-9ACE-D9B27D8C8D4E}" type="pres">
-      <dgm:prSet presAssocID="{C613CF21-FF49-4AD0-A8C2-7E23EBC840BA}" presName="root2" presStyleCnt="0"/>
-      <dgm:spPr/>
-    </dgm:pt>
-    <dgm:pt modelId="{9EED91FC-DC27-4282-B0C2-5F757280B8B3}" type="pres">
-      <dgm:prSet presAssocID="{C613CF21-FF49-4AD0-A8C2-7E23EBC840BA}" presName="LevelTwoTextNode" presStyleLbl="node3" presStyleIdx="0" presStyleCnt="1" custLinFactNeighborX="5468" custLinFactNeighborY="-70481">
+    <dgm:pt modelId="{A47F731D-16CA-47C7-9B3F-3F7D45CB367F}" type="pres">
+      <dgm:prSet presAssocID="{BB2464BA-081D-4B3A-B0A6-CDEE8DECB181}" presName="tile4text" presStyleLbl="node1" presStyleIdx="3" presStyleCnt="4">
         <dgm:presLayoutVars>
-          <dgm:chPref val="3"/>
+          <dgm:chMax val="0"/>
+          <dgm:chPref val="0"/>
+          <dgm:bulletEnabled val="1"/>
         </dgm:presLayoutVars>
       </dgm:prSet>
       <dgm:spPr/>
     </dgm:pt>
-    <dgm:pt modelId="{82876F55-DF05-40BD-8894-C85E5A98F626}" type="pres">
-      <dgm:prSet presAssocID="{C613CF21-FF49-4AD0-A8C2-7E23EBC840BA}" presName="level3hierChild" presStyleCnt="0"/>
-      <dgm:spPr/>
-    </dgm:pt>
-    <dgm:pt modelId="{638E35A2-A5E3-4B2D-AF61-25404CA58C88}" type="pres">
-      <dgm:prSet presAssocID="{D77BE9EE-44F0-487C-96EF-B1460D15E85F}" presName="root1" presStyleCnt="0"/>
-      <dgm:spPr/>
-    </dgm:pt>
-    <dgm:pt modelId="{1F4CCB26-C0B0-4520-9273-CF75326737E8}" type="pres">
-      <dgm:prSet presAssocID="{D77BE9EE-44F0-487C-96EF-B1460D15E85F}" presName="LevelOneTextNode" presStyleLbl="node0" presStyleIdx="1" presStyleCnt="5" custScaleX="51550" custScaleY="87071" custLinFactNeighborX="18834" custLinFactNeighborY="4036">
+    <dgm:pt modelId="{15DA4C24-45F2-491D-8FC2-76BE5FF69CA5}" type="pres">
+      <dgm:prSet presAssocID="{BB2464BA-081D-4B3A-B0A6-CDEE8DECB181}" presName="centerTile" presStyleLbl="fgShp" presStyleIdx="0" presStyleCnt="1">
         <dgm:presLayoutVars>
-          <dgm:chPref val="3"/>
+          <dgm:chMax val="0"/>
+          <dgm:chPref val="0"/>
         </dgm:presLayoutVars>
       </dgm:prSet>
       <dgm:spPr/>
     </dgm:pt>
-    <dgm:pt modelId="{79AB56CD-DADF-4444-9D60-567231B57B57}" type="pres">
-      <dgm:prSet presAssocID="{D77BE9EE-44F0-487C-96EF-B1460D15E85F}" presName="level2hierChild" presStyleCnt="0"/>
-      <dgm:spPr/>
-    </dgm:pt>
-    <dgm:pt modelId="{4B83601F-FF84-41AA-BDE5-94F6F7884CF8}" type="pres">
-      <dgm:prSet presAssocID="{C3A8FE2E-1344-4361-BF5F-E8D1BCE498E0}" presName="root1" presStyleCnt="0"/>
-      <dgm:spPr/>
-    </dgm:pt>
-    <dgm:pt modelId="{77C47A97-26C2-4A9A-BE5F-C9B4196ED41C}" type="pres">
-      <dgm:prSet presAssocID="{C3A8FE2E-1344-4361-BF5F-E8D1BCE498E0}" presName="LevelOneTextNode" presStyleLbl="node0" presStyleIdx="2" presStyleCnt="5" custScaleX="80237" custScaleY="46921" custLinFactY="-68101" custLinFactNeighborX="99258" custLinFactNeighborY="-100000">
-        <dgm:presLayoutVars>
-          <dgm:chPref val="3"/>
-        </dgm:presLayoutVars>
-      </dgm:prSet>
-      <dgm:spPr/>
-    </dgm:pt>
-    <dgm:pt modelId="{249CC7B0-3F90-4D44-810B-4F2526D8E05B}" type="pres">
-      <dgm:prSet presAssocID="{C3A8FE2E-1344-4361-BF5F-E8D1BCE498E0}" presName="level2hierChild" presStyleCnt="0"/>
-      <dgm:spPr/>
-    </dgm:pt>
-    <dgm:pt modelId="{B38DA1D1-FB39-4395-B1CA-C7A4533C72E7}" type="pres">
-      <dgm:prSet presAssocID="{1C846715-B75D-45BD-B6B4-2743BBA43992}" presName="root1" presStyleCnt="0"/>
-      <dgm:spPr/>
-    </dgm:pt>
-    <dgm:pt modelId="{D5254D5D-93F9-4349-97EE-703C0B99704D}" type="pres">
-      <dgm:prSet presAssocID="{1C846715-B75D-45BD-B6B4-2743BBA43992}" presName="LevelOneTextNode" presStyleLbl="node0" presStyleIdx="3" presStyleCnt="5" custScaleX="80789" custScaleY="45802" custLinFactX="16676" custLinFactY="-12805" custLinFactNeighborX="100000" custLinFactNeighborY="-100000">
-        <dgm:presLayoutVars>
-          <dgm:chPref val="3"/>
-        </dgm:presLayoutVars>
-      </dgm:prSet>
-      <dgm:spPr/>
-    </dgm:pt>
-    <dgm:pt modelId="{F3FCB086-5F13-401A-BBAB-AC1B90C95764}" type="pres">
-      <dgm:prSet presAssocID="{1C846715-B75D-45BD-B6B4-2743BBA43992}" presName="level2hierChild" presStyleCnt="0"/>
-      <dgm:spPr/>
-    </dgm:pt>
-    <dgm:pt modelId="{18A3DD57-A554-434F-BA9A-C93B3DFD6D99}" type="pres">
-      <dgm:prSet presAssocID="{BAABDAFB-7634-4485-9547-A4CFB2ECCBC1}" presName="root1" presStyleCnt="0"/>
-      <dgm:spPr/>
-    </dgm:pt>
-    <dgm:pt modelId="{F9144E29-2DA4-4D21-B3EF-213A5F247CBA}" type="pres">
-      <dgm:prSet presAssocID="{BAABDAFB-7634-4485-9547-A4CFB2ECCBC1}" presName="LevelOneTextNode" presStyleLbl="node0" presStyleIdx="4" presStyleCnt="5" custScaleX="80789" custScaleY="45802" custLinFactX="100000" custLinFactY="-100000" custLinFactNeighborX="154917" custLinFactNeighborY="-120633">
-        <dgm:presLayoutVars>
-          <dgm:chPref val="3"/>
-        </dgm:presLayoutVars>
-      </dgm:prSet>
-      <dgm:spPr/>
-    </dgm:pt>
-    <dgm:pt modelId="{F2C132D2-2AF2-40A3-9537-D735BB9C98CD}" type="pres">
-      <dgm:prSet presAssocID="{BAABDAFB-7634-4485-9547-A4CFB2ECCBC1}" presName="level2hierChild" presStyleCnt="0"/>
-      <dgm:spPr/>
-    </dgm:pt>
   </dgm:ptLst>
   <dgm:cxnLst>
-    <dgm:cxn modelId="{6244DA02-4DE0-4113-830C-62E56EFD848C}" srcId="{E90ED010-ECCB-45F2-B3FE-8619849B0397}" destId="{B806241A-21BA-45A3-85D5-E74853CFBF9B}" srcOrd="0" destOrd="0" parTransId="{2C12B439-B5C8-4A54-AA68-0F21E7E7AED2}" sibTransId="{E34928CE-C12D-4053-A1E8-D5AE55C23E24}"/>
-    <dgm:cxn modelId="{BB865711-76D8-457C-9B1B-EE4C318F70F8}" type="presOf" srcId="{30245E7D-36E3-48C1-9B64-167DE823D6DD}" destId="{FEB800BA-EEE9-45E9-BF1E-F37CDFE0C36F}" srcOrd="0" destOrd="0" presId="urn:microsoft.com/office/officeart/2005/8/layout/hierarchy2"/>
-    <dgm:cxn modelId="{2D8E3F15-2A06-4F96-9A41-5D8A3F80C74A}" srcId="{B806241A-21BA-45A3-85D5-E74853CFBF9B}" destId="{D8E70305-12AD-4F49-BD91-33D35FC62BA7}" srcOrd="1" destOrd="0" parTransId="{30245E7D-36E3-48C1-9B64-167DE823D6DD}" sibTransId="{2B36A1F1-A054-4E1C-B6B1-CBE1475E0AAD}"/>
-    <dgm:cxn modelId="{D28F131C-4AA3-4252-9D29-EDB55709F7A0}" type="presOf" srcId="{3BC5C666-A39A-4FE0-B790-1268E9528488}" destId="{07776F11-23BD-403D-B16A-F306F7D3401E}" srcOrd="1" destOrd="0" presId="urn:microsoft.com/office/officeart/2005/8/layout/hierarchy2"/>
-    <dgm:cxn modelId="{3BFF4636-8075-4DCA-BAA9-577AD2936E65}" type="presOf" srcId="{51659AB6-D2DD-476D-854C-3AF664BE4753}" destId="{809E78D7-ECDC-4D04-A70A-F7167F78B08D}" srcOrd="0" destOrd="0" presId="urn:microsoft.com/office/officeart/2005/8/layout/hierarchy2"/>
-    <dgm:cxn modelId="{85FBC83C-677F-4DE6-B7AE-518523AC8E44}" srcId="{E90ED010-ECCB-45F2-B3FE-8619849B0397}" destId="{D77BE9EE-44F0-487C-96EF-B1460D15E85F}" srcOrd="1" destOrd="0" parTransId="{990E7673-22A5-432F-9C50-04D8AB9A5F0C}" sibTransId="{192F095F-ADDD-48C5-A04E-E5AEAA2559EF}"/>
-    <dgm:cxn modelId="{B03DEF62-3AD0-44D4-BA97-34DA23FC223D}" type="presOf" srcId="{E90ED010-ECCB-45F2-B3FE-8619849B0397}" destId="{8A64451B-6987-40AB-8AA9-829BB3BBA757}" srcOrd="0" destOrd="0" presId="urn:microsoft.com/office/officeart/2005/8/layout/hierarchy2"/>
-    <dgm:cxn modelId="{AFEDB643-40EB-433D-815A-641667CF80B8}" type="presOf" srcId="{3BC5C666-A39A-4FE0-B790-1268E9528488}" destId="{0F9AD43E-D1E1-4DF9-BBDC-9DD7E9F2F7FF}" srcOrd="0" destOrd="0" presId="urn:microsoft.com/office/officeart/2005/8/layout/hierarchy2"/>
-    <dgm:cxn modelId="{59C19764-ED16-410F-9508-D7468F982EE1}" srcId="{B806241A-21BA-45A3-85D5-E74853CFBF9B}" destId="{0D6981A7-25DB-4AB2-9B09-1A9717B28669}" srcOrd="0" destOrd="0" parTransId="{3BC5C666-A39A-4FE0-B790-1268E9528488}" sibTransId="{F7239425-F096-4203-9ABE-8E09DC1A5721}"/>
-    <dgm:cxn modelId="{13090D6A-11BD-41E7-9EEE-A6C937E1AE5B}" type="presOf" srcId="{C3A8FE2E-1344-4361-BF5F-E8D1BCE498E0}" destId="{77C47A97-26C2-4A9A-BE5F-C9B4196ED41C}" srcOrd="0" destOrd="0" presId="urn:microsoft.com/office/officeart/2005/8/layout/hierarchy2"/>
-    <dgm:cxn modelId="{49C66A8A-73BA-4543-8E8E-509AF6BBCED3}" type="presOf" srcId="{C613CF21-FF49-4AD0-A8C2-7E23EBC840BA}" destId="{9EED91FC-DC27-4282-B0C2-5F757280B8B3}" srcOrd="0" destOrd="0" presId="urn:microsoft.com/office/officeart/2005/8/layout/hierarchy2"/>
-    <dgm:cxn modelId="{8A2CE78E-1B20-4BDD-A39D-ACDB9C06FDFE}" srcId="{E90ED010-ECCB-45F2-B3FE-8619849B0397}" destId="{C3A8FE2E-1344-4361-BF5F-E8D1BCE498E0}" srcOrd="2" destOrd="0" parTransId="{A20B399E-C606-4C26-B047-4C9436A79344}" sibTransId="{FC144699-5A83-45BC-9E59-B68DE06BC197}"/>
-    <dgm:cxn modelId="{943C5599-42CF-46B3-A75A-929DD5475F05}" type="presOf" srcId="{51659AB6-D2DD-476D-854C-3AF664BE4753}" destId="{467394A1-4197-4155-9F22-F46641CDF339}" srcOrd="1" destOrd="0" presId="urn:microsoft.com/office/officeart/2005/8/layout/hierarchy2"/>
-    <dgm:cxn modelId="{0156199D-8AB9-40B2-B2AF-5388B5BA3C13}" type="presOf" srcId="{D77BE9EE-44F0-487C-96EF-B1460D15E85F}" destId="{1F4CCB26-C0B0-4520-9273-CF75326737E8}" srcOrd="0" destOrd="0" presId="urn:microsoft.com/office/officeart/2005/8/layout/hierarchy2"/>
-    <dgm:cxn modelId="{87742AA6-A579-4EC2-8171-C5F9A0855CF9}" type="presOf" srcId="{30245E7D-36E3-48C1-9B64-167DE823D6DD}" destId="{2C4F3879-804B-4DA5-98F3-15BF153BA3C4}" srcOrd="1" destOrd="0" presId="urn:microsoft.com/office/officeart/2005/8/layout/hierarchy2"/>
-    <dgm:cxn modelId="{13DE0BAC-1CF6-4013-95FF-2C7AEA806F67}" srcId="{E90ED010-ECCB-45F2-B3FE-8619849B0397}" destId="{BAABDAFB-7634-4485-9547-A4CFB2ECCBC1}" srcOrd="4" destOrd="0" parTransId="{A7ABAED1-D1A9-4259-A869-EC8D05063D89}" sibTransId="{050544D5-E72A-4DF7-8EA9-75413E09974E}"/>
-    <dgm:cxn modelId="{F68321B6-E547-4331-91CE-92AAB21F5DD2}" type="presOf" srcId="{D8E70305-12AD-4F49-BD91-33D35FC62BA7}" destId="{4AD5691D-C99C-4250-97DA-3BA6F8AC12A9}" srcOrd="0" destOrd="0" presId="urn:microsoft.com/office/officeart/2005/8/layout/hierarchy2"/>
-    <dgm:cxn modelId="{2796C2B6-056F-406C-B453-A4F1C6D00CE1}" type="presOf" srcId="{1C846715-B75D-45BD-B6B4-2743BBA43992}" destId="{D5254D5D-93F9-4349-97EE-703C0B99704D}" srcOrd="0" destOrd="0" presId="urn:microsoft.com/office/officeart/2005/8/layout/hierarchy2"/>
-    <dgm:cxn modelId="{01A3CFBE-D240-4C96-AC77-928255CE74CB}" type="presOf" srcId="{B806241A-21BA-45A3-85D5-E74853CFBF9B}" destId="{10626306-2580-41C1-A07D-89D5E873C004}" srcOrd="0" destOrd="0" presId="urn:microsoft.com/office/officeart/2005/8/layout/hierarchy2"/>
-    <dgm:cxn modelId="{50A80AC1-9104-4B11-9FA6-C9E7939E81C4}" type="presOf" srcId="{0D6981A7-25DB-4AB2-9B09-1A9717B28669}" destId="{8D89B59C-76D8-4726-93E9-BDBDEEC9934A}" srcOrd="0" destOrd="0" presId="urn:microsoft.com/office/officeart/2005/8/layout/hierarchy2"/>
-    <dgm:cxn modelId="{7A14A2C3-1547-4D62-B263-1843FAEFA0D7}" srcId="{D8E70305-12AD-4F49-BD91-33D35FC62BA7}" destId="{C613CF21-FF49-4AD0-A8C2-7E23EBC840BA}" srcOrd="0" destOrd="0" parTransId="{51659AB6-D2DD-476D-854C-3AF664BE4753}" sibTransId="{C7C7CC2E-371F-4BA5-ADAC-218067DF08A6}"/>
-    <dgm:cxn modelId="{BBA098C5-00FF-449A-AD54-2E98BB8526D6}" type="presOf" srcId="{BAABDAFB-7634-4485-9547-A4CFB2ECCBC1}" destId="{F9144E29-2DA4-4D21-B3EF-213A5F247CBA}" srcOrd="0" destOrd="0" presId="urn:microsoft.com/office/officeart/2005/8/layout/hierarchy2"/>
-    <dgm:cxn modelId="{E29BEFD9-6320-40AC-B1F0-39118EA186C9}" srcId="{E90ED010-ECCB-45F2-B3FE-8619849B0397}" destId="{1C846715-B75D-45BD-B6B4-2743BBA43992}" srcOrd="3" destOrd="0" parTransId="{C1DF1329-ACC2-4126-B762-AE854F42DF0F}" sibTransId="{80D443D8-B16D-43B0-9A86-9190E0DBCF2C}"/>
-    <dgm:cxn modelId="{92B457CF-203C-4198-AAFC-7B67844E032A}" type="presParOf" srcId="{8A64451B-6987-40AB-8AA9-829BB3BBA757}" destId="{354228CF-A08F-44EF-9CB8-0B7E93C00E73}" srcOrd="0" destOrd="0" presId="urn:microsoft.com/office/officeart/2005/8/layout/hierarchy2"/>
-    <dgm:cxn modelId="{A9F1DBDC-355E-46E7-9671-B5C9330A58C5}" type="presParOf" srcId="{354228CF-A08F-44EF-9CB8-0B7E93C00E73}" destId="{10626306-2580-41C1-A07D-89D5E873C004}" srcOrd="0" destOrd="0" presId="urn:microsoft.com/office/officeart/2005/8/layout/hierarchy2"/>
-    <dgm:cxn modelId="{340A873F-2C0E-4787-965D-08A3F2DF4591}" type="presParOf" srcId="{354228CF-A08F-44EF-9CB8-0B7E93C00E73}" destId="{C763A4D4-8040-40A2-9435-EC29B21C813D}" srcOrd="1" destOrd="0" presId="urn:microsoft.com/office/officeart/2005/8/layout/hierarchy2"/>
-    <dgm:cxn modelId="{F5B789BA-1AB5-4DDF-A258-A8B4D10DDDD8}" type="presParOf" srcId="{C763A4D4-8040-40A2-9435-EC29B21C813D}" destId="{0F9AD43E-D1E1-4DF9-BBDC-9DD7E9F2F7FF}" srcOrd="0" destOrd="0" presId="urn:microsoft.com/office/officeart/2005/8/layout/hierarchy2"/>
-    <dgm:cxn modelId="{4599CB2B-6A52-428F-AF35-266D87959259}" type="presParOf" srcId="{0F9AD43E-D1E1-4DF9-BBDC-9DD7E9F2F7FF}" destId="{07776F11-23BD-403D-B16A-F306F7D3401E}" srcOrd="0" destOrd="0" presId="urn:microsoft.com/office/officeart/2005/8/layout/hierarchy2"/>
-    <dgm:cxn modelId="{5C4F705B-F2B2-44B0-B1D9-134B7399CE76}" type="presParOf" srcId="{C763A4D4-8040-40A2-9435-EC29B21C813D}" destId="{9ED10207-4D67-4BC5-AEC7-DFA31AA26658}" srcOrd="1" destOrd="0" presId="urn:microsoft.com/office/officeart/2005/8/layout/hierarchy2"/>
-    <dgm:cxn modelId="{144CC189-B142-4640-8126-10F5449DE256}" type="presParOf" srcId="{9ED10207-4D67-4BC5-AEC7-DFA31AA26658}" destId="{8D89B59C-76D8-4726-93E9-BDBDEEC9934A}" srcOrd="0" destOrd="0" presId="urn:microsoft.com/office/officeart/2005/8/layout/hierarchy2"/>
-    <dgm:cxn modelId="{46E66A0A-5D01-4949-A14B-3378B7B1533C}" type="presParOf" srcId="{9ED10207-4D67-4BC5-AEC7-DFA31AA26658}" destId="{5B4EC5F6-6958-4F76-BE0F-7C41049624DE}" srcOrd="1" destOrd="0" presId="urn:microsoft.com/office/officeart/2005/8/layout/hierarchy2"/>
-    <dgm:cxn modelId="{88068812-DDC8-47D1-8502-4977459EDB19}" type="presParOf" srcId="{C763A4D4-8040-40A2-9435-EC29B21C813D}" destId="{FEB800BA-EEE9-45E9-BF1E-F37CDFE0C36F}" srcOrd="2" destOrd="0" presId="urn:microsoft.com/office/officeart/2005/8/layout/hierarchy2"/>
-    <dgm:cxn modelId="{76C888C0-F2CF-41DE-8F39-302DEAD58D75}" type="presParOf" srcId="{FEB800BA-EEE9-45E9-BF1E-F37CDFE0C36F}" destId="{2C4F3879-804B-4DA5-98F3-15BF153BA3C4}" srcOrd="0" destOrd="0" presId="urn:microsoft.com/office/officeart/2005/8/layout/hierarchy2"/>
-    <dgm:cxn modelId="{7B6388DE-22C4-411A-AA88-81CDD6609856}" type="presParOf" srcId="{C763A4D4-8040-40A2-9435-EC29B21C813D}" destId="{55F9392C-296E-4785-BB86-CF73E09676EB}" srcOrd="3" destOrd="0" presId="urn:microsoft.com/office/officeart/2005/8/layout/hierarchy2"/>
-    <dgm:cxn modelId="{FB08EDC4-286B-425A-9558-41A1C20E3CC4}" type="presParOf" srcId="{55F9392C-296E-4785-BB86-CF73E09676EB}" destId="{4AD5691D-C99C-4250-97DA-3BA6F8AC12A9}" srcOrd="0" destOrd="0" presId="urn:microsoft.com/office/officeart/2005/8/layout/hierarchy2"/>
-    <dgm:cxn modelId="{27CBB3D7-5133-4969-BD3F-BFBDFA138E2B}" type="presParOf" srcId="{55F9392C-296E-4785-BB86-CF73E09676EB}" destId="{1BDF2A4F-930C-43FF-8AFF-C379A0F50133}" srcOrd="1" destOrd="0" presId="urn:microsoft.com/office/officeart/2005/8/layout/hierarchy2"/>
-    <dgm:cxn modelId="{967B6D78-0D07-4FAD-884A-2EBE1E5610F3}" type="presParOf" srcId="{1BDF2A4F-930C-43FF-8AFF-C379A0F50133}" destId="{809E78D7-ECDC-4D04-A70A-F7167F78B08D}" srcOrd="0" destOrd="0" presId="urn:microsoft.com/office/officeart/2005/8/layout/hierarchy2"/>
-    <dgm:cxn modelId="{EB62A8C0-133E-40C8-83C2-E88B95F4C90B}" type="presParOf" srcId="{809E78D7-ECDC-4D04-A70A-F7167F78B08D}" destId="{467394A1-4197-4155-9F22-F46641CDF339}" srcOrd="0" destOrd="0" presId="urn:microsoft.com/office/officeart/2005/8/layout/hierarchy2"/>
-    <dgm:cxn modelId="{8B6BAD3B-8C99-49DA-BC57-E61A004B4AFA}" type="presParOf" srcId="{1BDF2A4F-930C-43FF-8AFF-C379A0F50133}" destId="{776D5F48-9252-47DE-9ACE-D9B27D8C8D4E}" srcOrd="1" destOrd="0" presId="urn:microsoft.com/office/officeart/2005/8/layout/hierarchy2"/>
-    <dgm:cxn modelId="{5BEB1F64-F8CA-4BB5-AB6D-E39B369E5842}" type="presParOf" srcId="{776D5F48-9252-47DE-9ACE-D9B27D8C8D4E}" destId="{9EED91FC-DC27-4282-B0C2-5F757280B8B3}" srcOrd="0" destOrd="0" presId="urn:microsoft.com/office/officeart/2005/8/layout/hierarchy2"/>
-    <dgm:cxn modelId="{A438CDC0-095F-4B0C-AD11-4CBD63D02A09}" type="presParOf" srcId="{776D5F48-9252-47DE-9ACE-D9B27D8C8D4E}" destId="{82876F55-DF05-40BD-8894-C85E5A98F626}" srcOrd="1" destOrd="0" presId="urn:microsoft.com/office/officeart/2005/8/layout/hierarchy2"/>
-    <dgm:cxn modelId="{A4FF75C5-B5BF-4CA8-9B66-B1674EA31850}" type="presParOf" srcId="{8A64451B-6987-40AB-8AA9-829BB3BBA757}" destId="{638E35A2-A5E3-4B2D-AF61-25404CA58C88}" srcOrd="1" destOrd="0" presId="urn:microsoft.com/office/officeart/2005/8/layout/hierarchy2"/>
-    <dgm:cxn modelId="{C83562E1-C91D-4F03-9FAD-EDE6AF252DE9}" type="presParOf" srcId="{638E35A2-A5E3-4B2D-AF61-25404CA58C88}" destId="{1F4CCB26-C0B0-4520-9273-CF75326737E8}" srcOrd="0" destOrd="0" presId="urn:microsoft.com/office/officeart/2005/8/layout/hierarchy2"/>
-    <dgm:cxn modelId="{44D995F3-7194-4F11-A1FE-9DB56152A7EC}" type="presParOf" srcId="{638E35A2-A5E3-4B2D-AF61-25404CA58C88}" destId="{79AB56CD-DADF-4444-9D60-567231B57B57}" srcOrd="1" destOrd="0" presId="urn:microsoft.com/office/officeart/2005/8/layout/hierarchy2"/>
-    <dgm:cxn modelId="{E2842E79-B96F-446B-A9E2-2A606E477729}" type="presParOf" srcId="{8A64451B-6987-40AB-8AA9-829BB3BBA757}" destId="{4B83601F-FF84-41AA-BDE5-94F6F7884CF8}" srcOrd="2" destOrd="0" presId="urn:microsoft.com/office/officeart/2005/8/layout/hierarchy2"/>
-    <dgm:cxn modelId="{32A6F5E4-4F72-43D4-8D9B-5BD9471D28D8}" type="presParOf" srcId="{4B83601F-FF84-41AA-BDE5-94F6F7884CF8}" destId="{77C47A97-26C2-4A9A-BE5F-C9B4196ED41C}" srcOrd="0" destOrd="0" presId="urn:microsoft.com/office/officeart/2005/8/layout/hierarchy2"/>
-    <dgm:cxn modelId="{CD1868FF-07C9-41C9-A4CE-966E5162EE29}" type="presParOf" srcId="{4B83601F-FF84-41AA-BDE5-94F6F7884CF8}" destId="{249CC7B0-3F90-4D44-810B-4F2526D8E05B}" srcOrd="1" destOrd="0" presId="urn:microsoft.com/office/officeart/2005/8/layout/hierarchy2"/>
-    <dgm:cxn modelId="{4354EF48-4265-483E-A9E2-AC83C7A34592}" type="presParOf" srcId="{8A64451B-6987-40AB-8AA9-829BB3BBA757}" destId="{B38DA1D1-FB39-4395-B1CA-C7A4533C72E7}" srcOrd="3" destOrd="0" presId="urn:microsoft.com/office/officeart/2005/8/layout/hierarchy2"/>
-    <dgm:cxn modelId="{5366C143-0F6A-491B-8595-AC75935AF056}" type="presParOf" srcId="{B38DA1D1-FB39-4395-B1CA-C7A4533C72E7}" destId="{D5254D5D-93F9-4349-97EE-703C0B99704D}" srcOrd="0" destOrd="0" presId="urn:microsoft.com/office/officeart/2005/8/layout/hierarchy2"/>
-    <dgm:cxn modelId="{5025BB14-E19F-4FBC-A169-8163613C2EB7}" type="presParOf" srcId="{B38DA1D1-FB39-4395-B1CA-C7A4533C72E7}" destId="{F3FCB086-5F13-401A-BBAB-AC1B90C95764}" srcOrd="1" destOrd="0" presId="urn:microsoft.com/office/officeart/2005/8/layout/hierarchy2"/>
-    <dgm:cxn modelId="{1CB46D55-C1B7-4BDB-A96A-2465CB9B8F4B}" type="presParOf" srcId="{8A64451B-6987-40AB-8AA9-829BB3BBA757}" destId="{18A3DD57-A554-434F-BA9A-C93B3DFD6D99}" srcOrd="4" destOrd="0" presId="urn:microsoft.com/office/officeart/2005/8/layout/hierarchy2"/>
-    <dgm:cxn modelId="{443D2514-DBA5-4200-8F20-6746BC43D11D}" type="presParOf" srcId="{18A3DD57-A554-434F-BA9A-C93B3DFD6D99}" destId="{F9144E29-2DA4-4D21-B3EF-213A5F247CBA}" srcOrd="0" destOrd="0" presId="urn:microsoft.com/office/officeart/2005/8/layout/hierarchy2"/>
-    <dgm:cxn modelId="{7507E5E5-CF63-4CB2-BC48-DA76982566D8}" type="presParOf" srcId="{18A3DD57-A554-434F-BA9A-C93B3DFD6D99}" destId="{F2C132D2-2AF2-40A3-9537-D735BB9C98CD}" srcOrd="1" destOrd="0" presId="urn:microsoft.com/office/officeart/2005/8/layout/hierarchy2"/>
+    <dgm:cxn modelId="{B8DE7401-5A2C-4F2A-8FE4-5EE6288443A1}" type="presOf" srcId="{79F8C9E6-E441-4856-9DE2-03B6AB20A102}" destId="{5BA9D47E-3BAB-4AA9-B14A-54B26154C85B}" srcOrd="1" destOrd="0" presId="urn:microsoft.com/office/officeart/2005/8/layout/matrix1"/>
+    <dgm:cxn modelId="{7B63AA09-C521-4737-8D4A-2CEC4C093F36}" type="presOf" srcId="{178FD340-0998-44EE-BF32-F2A4C865D183}" destId="{77855043-8F3A-4C66-9106-6B288F3097C9}" srcOrd="0" destOrd="0" presId="urn:microsoft.com/office/officeart/2005/8/layout/matrix1"/>
+    <dgm:cxn modelId="{BD177C39-B740-4968-A16F-FFAF3D4EF18D}" type="presOf" srcId="{178FD340-0998-44EE-BF32-F2A4C865D183}" destId="{BDA43C3D-C9C7-4995-8348-F09F390913AF}" srcOrd="1" destOrd="0" presId="urn:microsoft.com/office/officeart/2005/8/layout/matrix1"/>
+    <dgm:cxn modelId="{5A74213D-72B9-4B04-899F-9961D4BC0E23}" srcId="{ABFCE8A3-0BFF-4AC0-A58A-ADC58999D497}" destId="{81FEEF98-4BD1-4D41-BA5D-CE06208F7C4E}" srcOrd="3" destOrd="0" parTransId="{C685C38B-4378-452F-9322-56C97A1BB594}" sibTransId="{229A51D4-F1E7-4952-8BB7-D3475CD73710}"/>
+    <dgm:cxn modelId="{9A28E264-A358-4B33-893B-B3A51508B17A}" type="presOf" srcId="{79F8C9E6-E441-4856-9DE2-03B6AB20A102}" destId="{E74F4A6E-7743-4BA4-9D84-79269FA37DB4}" srcOrd="0" destOrd="0" presId="urn:microsoft.com/office/officeart/2005/8/layout/matrix1"/>
+    <dgm:cxn modelId="{CCAB438C-CA0E-4E02-A605-D248C77066C2}" srcId="{ABFCE8A3-0BFF-4AC0-A58A-ADC58999D497}" destId="{178FD340-0998-44EE-BF32-F2A4C865D183}" srcOrd="0" destOrd="0" parTransId="{F35325B6-754F-43F3-AECF-D0589CC263DA}" sibTransId="{A726973F-FB1E-4A2C-9D07-18F09026CA21}"/>
+    <dgm:cxn modelId="{78E05098-604F-44C0-B1E6-729798D02525}" type="presOf" srcId="{BB2464BA-081D-4B3A-B0A6-CDEE8DECB181}" destId="{E38F0745-8114-4CFB-B9ED-F3A2638DCF4D}" srcOrd="0" destOrd="0" presId="urn:microsoft.com/office/officeart/2005/8/layout/matrix1"/>
+    <dgm:cxn modelId="{4484B3AD-221A-438D-80DA-ADFE01B22406}" type="presOf" srcId="{81FEEF98-4BD1-4D41-BA5D-CE06208F7C4E}" destId="{F9212AD2-3739-41F9-857E-CD128EBB22FE}" srcOrd="0" destOrd="0" presId="urn:microsoft.com/office/officeart/2005/8/layout/matrix1"/>
+    <dgm:cxn modelId="{A04E14AF-338B-49B7-99DF-9568554D07F2}" type="presOf" srcId="{ABFCE8A3-0BFF-4AC0-A58A-ADC58999D497}" destId="{15DA4C24-45F2-491D-8FC2-76BE5FF69CA5}" srcOrd="0" destOrd="0" presId="urn:microsoft.com/office/officeart/2005/8/layout/matrix1"/>
+    <dgm:cxn modelId="{1112C1B3-41E5-4E60-9984-C3048FEF16B8}" srcId="{ABFCE8A3-0BFF-4AC0-A58A-ADC58999D497}" destId="{79F8C9E6-E441-4856-9DE2-03B6AB20A102}" srcOrd="1" destOrd="0" parTransId="{2A059EE1-12AE-428A-9ADD-1F3ED2852EF2}" sibTransId="{1273AC21-FBEB-4CBB-BE38-EC694397B2BE}"/>
+    <dgm:cxn modelId="{A8CB33CC-3F35-42AE-AC84-2B2453928B65}" type="presOf" srcId="{E0F8754D-031D-46A4-947D-70EA03CB7A85}" destId="{E23687CB-CD0B-46E6-BDE9-C3090FEB3CCA}" srcOrd="1" destOrd="0" presId="urn:microsoft.com/office/officeart/2005/8/layout/matrix1"/>
+    <dgm:cxn modelId="{E1FDEACD-D15D-44F4-BC5C-80CCF223FE82}" srcId="{ABFCE8A3-0BFF-4AC0-A58A-ADC58999D497}" destId="{E0F8754D-031D-46A4-947D-70EA03CB7A85}" srcOrd="2" destOrd="0" parTransId="{1DC585A6-A47A-4405-86A0-841751124881}" sibTransId="{5D6C68A1-6B09-469E-9CE2-C1476A635609}"/>
+    <dgm:cxn modelId="{02D409D2-21B6-444D-92EE-423F4E6F6108}" srcId="{BB2464BA-081D-4B3A-B0A6-CDEE8DECB181}" destId="{ABFCE8A3-0BFF-4AC0-A58A-ADC58999D497}" srcOrd="0" destOrd="0" parTransId="{6CCFF629-179D-4BDD-852F-57D663D1E2C4}" sibTransId="{42F903A5-6CA3-40F3-A6B9-BDAA841D3BEC}"/>
+    <dgm:cxn modelId="{722759DC-3498-4F42-B99D-CE4466C69795}" type="presOf" srcId="{E0F8754D-031D-46A4-947D-70EA03CB7A85}" destId="{D9CB5EF0-57C4-47A5-AE9B-937CE97F9480}" srcOrd="0" destOrd="0" presId="urn:microsoft.com/office/officeart/2005/8/layout/matrix1"/>
+    <dgm:cxn modelId="{F06B74DE-28C7-4F45-94B0-26F856142BC2}" type="presOf" srcId="{81FEEF98-4BD1-4D41-BA5D-CE06208F7C4E}" destId="{A47F731D-16CA-47C7-9B3F-3F7D45CB367F}" srcOrd="1" destOrd="0" presId="urn:microsoft.com/office/officeart/2005/8/layout/matrix1"/>
+    <dgm:cxn modelId="{7BD11BB7-C79A-4C52-B740-9710FE175594}" type="presParOf" srcId="{E38F0745-8114-4CFB-B9ED-F3A2638DCF4D}" destId="{2B42E5E3-ABBF-4DB9-9BB9-32BAD791DBCF}" srcOrd="0" destOrd="0" presId="urn:microsoft.com/office/officeart/2005/8/layout/matrix1"/>
+    <dgm:cxn modelId="{56F15F2A-63BF-4618-98A8-1EC2C997DB38}" type="presParOf" srcId="{2B42E5E3-ABBF-4DB9-9BB9-32BAD791DBCF}" destId="{77855043-8F3A-4C66-9106-6B288F3097C9}" srcOrd="0" destOrd="0" presId="urn:microsoft.com/office/officeart/2005/8/layout/matrix1"/>
+    <dgm:cxn modelId="{BF6948A8-85BB-404C-AE07-3A2A800EC06C}" type="presParOf" srcId="{2B42E5E3-ABBF-4DB9-9BB9-32BAD791DBCF}" destId="{BDA43C3D-C9C7-4995-8348-F09F390913AF}" srcOrd="1" destOrd="0" presId="urn:microsoft.com/office/officeart/2005/8/layout/matrix1"/>
+    <dgm:cxn modelId="{21B319DC-8200-4B47-B475-A3D49C43D098}" type="presParOf" srcId="{2B42E5E3-ABBF-4DB9-9BB9-32BAD791DBCF}" destId="{E74F4A6E-7743-4BA4-9D84-79269FA37DB4}" srcOrd="2" destOrd="0" presId="urn:microsoft.com/office/officeart/2005/8/layout/matrix1"/>
+    <dgm:cxn modelId="{6596E467-9495-4744-AD6F-ADC49B680729}" type="presParOf" srcId="{2B42E5E3-ABBF-4DB9-9BB9-32BAD791DBCF}" destId="{5BA9D47E-3BAB-4AA9-B14A-54B26154C85B}" srcOrd="3" destOrd="0" presId="urn:microsoft.com/office/officeart/2005/8/layout/matrix1"/>
+    <dgm:cxn modelId="{C375994A-14AF-4146-A386-074D968BF667}" type="presParOf" srcId="{2B42E5E3-ABBF-4DB9-9BB9-32BAD791DBCF}" destId="{D9CB5EF0-57C4-47A5-AE9B-937CE97F9480}" srcOrd="4" destOrd="0" presId="urn:microsoft.com/office/officeart/2005/8/layout/matrix1"/>
+    <dgm:cxn modelId="{4610900C-47DC-4CAF-B1B9-50AD05F65D33}" type="presParOf" srcId="{2B42E5E3-ABBF-4DB9-9BB9-32BAD791DBCF}" destId="{E23687CB-CD0B-46E6-BDE9-C3090FEB3CCA}" srcOrd="5" destOrd="0" presId="urn:microsoft.com/office/officeart/2005/8/layout/matrix1"/>
+    <dgm:cxn modelId="{8B2C3F63-233E-46E2-B196-9AFD6B0637C7}" type="presParOf" srcId="{2B42E5E3-ABBF-4DB9-9BB9-32BAD791DBCF}" destId="{F9212AD2-3739-41F9-857E-CD128EBB22FE}" srcOrd="6" destOrd="0" presId="urn:microsoft.com/office/officeart/2005/8/layout/matrix1"/>
+    <dgm:cxn modelId="{919A4C0F-BB4D-4C07-A5F6-13C6949277EC}" type="presParOf" srcId="{2B42E5E3-ABBF-4DB9-9BB9-32BAD791DBCF}" destId="{A47F731D-16CA-47C7-9B3F-3F7D45CB367F}" srcOrd="7" destOrd="0" presId="urn:microsoft.com/office/officeart/2005/8/layout/matrix1"/>
+    <dgm:cxn modelId="{A717A826-84DD-4F35-81C2-EBB36050070F}" type="presParOf" srcId="{E38F0745-8114-4CFB-B9ED-F3A2638DCF4D}" destId="{15DA4C24-45F2-491D-8FC2-76BE5FF69CA5}" srcOrd="1" destOrd="0" presId="urn:microsoft.com/office/officeart/2005/8/layout/matrix1"/>
   </dgm:cxnLst>
   <dgm:bg/>
   <dgm:whole/>
@@ -12176,72 +11993,49 @@
       <dsp:cNvGrpSpPr/>
     </dsp:nvGrpSpPr>
     <dsp:grpSpPr/>
-    <dsp:sp modelId="{10626306-2580-41C1-A07D-89D5E873C004}">
+    <dsp:sp modelId="{77855043-8F3A-4C66-9106-6B288F3097C9}">
       <dsp:nvSpPr>
         <dsp:cNvPr id="0" name=""/>
         <dsp:cNvSpPr/>
       </dsp:nvSpPr>
       <dsp:spPr>
-        <a:xfrm>
-          <a:off x="221" y="387484"/>
-          <a:ext cx="1010801" cy="302983"/>
+        <a:xfrm rot="16200000">
+          <a:off x="562451" y="-562451"/>
+          <a:ext cx="1575117" cy="2700019"/>
         </a:xfrm>
-        <a:prstGeom prst="roundRect">
-          <a:avLst>
-            <a:gd name="adj" fmla="val 10000"/>
-          </a:avLst>
+        <a:prstGeom prst="round1Rect">
+          <a:avLst/>
         </a:prstGeom>
-        <a:gradFill rotWithShape="0">
-          <a:gsLst>
-            <a:gs pos="0">
-              <a:schemeClr val="accent1">
-                <a:hueOff val="0"/>
-                <a:satOff val="0"/>
-                <a:lumOff val="0"/>
-                <a:alphaOff val="0"/>
-                <a:satMod val="103000"/>
-                <a:lumMod val="102000"/>
-                <a:tint val="94000"/>
-              </a:schemeClr>
-            </a:gs>
-            <a:gs pos="50000">
-              <a:schemeClr val="accent1">
-                <a:hueOff val="0"/>
-                <a:satOff val="0"/>
-                <a:lumOff val="0"/>
-                <a:alphaOff val="0"/>
-                <a:satMod val="110000"/>
-                <a:lumMod val="100000"/>
-                <a:shade val="100000"/>
-              </a:schemeClr>
-            </a:gs>
-            <a:gs pos="100000">
-              <a:schemeClr val="accent1">
-                <a:hueOff val="0"/>
-                <a:satOff val="0"/>
-                <a:lumOff val="0"/>
-                <a:alphaOff val="0"/>
-                <a:lumMod val="99000"/>
-                <a:satMod val="120000"/>
-                <a:shade val="78000"/>
-              </a:schemeClr>
-            </a:gs>
-          </a:gsLst>
-          <a:lin ang="5400000" scaled="0"/>
-        </a:gradFill>
-        <a:ln>
-          <a:noFill/>
+        <a:solidFill>
+          <a:schemeClr val="accent1">
+            <a:hueOff val="0"/>
+            <a:satOff val="0"/>
+            <a:lumOff val="0"/>
+            <a:alphaOff val="0"/>
+          </a:schemeClr>
+        </a:solidFill>
+        <a:ln w="12700" cap="flat" cmpd="sng" algn="ctr">
+          <a:solidFill>
+            <a:schemeClr val="lt1">
+              <a:hueOff val="0"/>
+              <a:satOff val="0"/>
+              <a:lumOff val="0"/>
+              <a:alphaOff val="0"/>
+            </a:schemeClr>
+          </a:solidFill>
+          <a:prstDash val="solid"/>
+          <a:miter lim="800000"/>
         </a:ln>
         <a:effectLst/>
       </dsp:spPr>
       <dsp:style>
-        <a:lnRef idx="0">
+        <a:lnRef idx="2">
           <a:scrgbClr r="0" g="0" b="0"/>
         </a:lnRef>
-        <a:fillRef idx="3">
+        <a:fillRef idx="1">
           <a:scrgbClr r="0" g="0" b="0"/>
         </a:fillRef>
-        <a:effectRef idx="2">
+        <a:effectRef idx="0">
           <a:scrgbClr r="0" g="0" b="0"/>
         </a:effectRef>
         <a:fontRef idx="minor">
@@ -12249,12 +12043,12 @@
         </a:fontRef>
       </dsp:style>
       <dsp:txBody>
-        <a:bodyPr spcFirstLastPara="0" vert="horz" wrap="square" lIns="5080" tIns="5080" rIns="5080" bIns="5080" numCol="1" spcCol="1270" anchor="ctr" anchorCtr="0">
+        <a:bodyPr spcFirstLastPara="0" vert="horz" wrap="square" lIns="106680" tIns="106680" rIns="106680" bIns="106680" numCol="1" spcCol="1270" anchor="ctr" anchorCtr="0">
           <a:noAutofit/>
         </a:bodyPr>
         <a:lstStyle/>
         <a:p>
-          <a:pPr marL="0" lvl="0" indent="0" algn="ctr" defTabSz="355600">
+          <a:pPr marL="0" lvl="0" indent="0" algn="ctr" defTabSz="666750">
             <a:lnSpc>
               <a:spcPct val="90000"/>
             </a:lnSpc>
@@ -12267,48 +12061,58 @@
             <a:buNone/>
           </a:pPr>
           <a:r>
-            <a:rPr lang="es-PE" sz="800" kern="1200"/>
-            <a:t>Gestion de compras</a:t>
+            <a:rPr lang="es-PE" sz="1500" kern="1200"/>
+            <a:t>Gestion de salidas:</a:t>
+          </a:r>
+        </a:p>
+        <a:p>
+          <a:pPr marL="0" lvl="0" indent="0" algn="ctr" defTabSz="666750">
+            <a:lnSpc>
+              <a:spcPct val="90000"/>
+            </a:lnSpc>
+            <a:spcBef>
+              <a:spcPct val="0"/>
+            </a:spcBef>
+            <a:spcAft>
+              <a:spcPct val="35000"/>
+            </a:spcAft>
+            <a:buNone/>
+          </a:pPr>
+          <a:r>
+            <a:rPr lang="es-PE" sz="1500" kern="1200"/>
+            <a:t>Despachos y monitoreopuerto</a:t>
           </a:r>
         </a:p>
       </dsp:txBody>
-      <dsp:txXfrm>
-        <a:off x="9095" y="396358"/>
-        <a:ext cx="993053" cy="285235"/>
+      <dsp:txXfrm rot="5400000">
+        <a:off x="0" y="0"/>
+        <a:ext cx="2700019" cy="1181338"/>
       </dsp:txXfrm>
     </dsp:sp>
-    <dsp:sp modelId="{0F9AD43E-D1E1-4DF9-BBDC-9DD7E9F2F7FF}">
+    <dsp:sp modelId="{E74F4A6E-7743-4BA4-9D84-79269FA37DB4}">
       <dsp:nvSpPr>
         <dsp:cNvPr id="0" name=""/>
         <dsp:cNvSpPr/>
       </dsp:nvSpPr>
       <dsp:spPr>
-        <a:xfrm rot="18220164">
-          <a:off x="900669" y="310476"/>
-          <a:ext cx="495305" cy="44780"/>
+        <a:xfrm>
+          <a:off x="2700019" y="0"/>
+          <a:ext cx="2700019" cy="1575117"/>
         </a:xfrm>
-        <a:custGeom>
+        <a:prstGeom prst="round1Rect">
           <a:avLst/>
-          <a:gdLst/>
-          <a:ahLst/>
-          <a:cxnLst/>
-          <a:rect l="0" t="0" r="0" b="0"/>
-          <a:pathLst>
-            <a:path>
-              <a:moveTo>
-                <a:pt x="0" y="22390"/>
-              </a:moveTo>
-              <a:lnTo>
-                <a:pt x="495305" y="22390"/>
-              </a:lnTo>
-            </a:path>
-          </a:pathLst>
-        </a:custGeom>
-        <a:noFill/>
-        <a:ln w="6350" cap="flat" cmpd="sng" algn="ctr">
+        </a:prstGeom>
+        <a:solidFill>
+          <a:schemeClr val="accent1">
+            <a:hueOff val="0"/>
+            <a:satOff val="0"/>
+            <a:lumOff val="0"/>
+            <a:alphaOff val="0"/>
+          </a:schemeClr>
+        </a:solidFill>
+        <a:ln w="12700" cap="flat" cmpd="sng" algn="ctr">
           <a:solidFill>
-            <a:schemeClr val="accent1">
-              <a:shade val="60000"/>
+            <a:schemeClr val="lt1">
               <a:hueOff val="0"/>
               <a:satOff val="0"/>
               <a:lumOff val="0"/>
@@ -12321,109 +12125,13 @@
         <a:effectLst/>
       </dsp:spPr>
       <dsp:style>
-        <a:lnRef idx="1">
+        <a:lnRef idx="2">
           <a:scrgbClr r="0" g="0" b="0"/>
         </a:lnRef>
-        <a:fillRef idx="0">
+        <a:fillRef idx="1">
           <a:scrgbClr r="0" g="0" b="0"/>
         </a:fillRef>
         <a:effectRef idx="0">
-          <a:scrgbClr r="0" g="0" b="0"/>
-        </a:effectRef>
-        <a:fontRef idx="minor"/>
-      </dsp:style>
-      <dsp:txBody>
-        <a:bodyPr spcFirstLastPara="0" vert="horz" wrap="square" lIns="12700" tIns="0" rIns="12700" bIns="0" numCol="1" spcCol="1270" anchor="ctr" anchorCtr="0">
-          <a:noAutofit/>
-        </a:bodyPr>
-        <a:lstStyle/>
-        <a:p>
-          <a:pPr marL="0" lvl="0" indent="0" algn="ctr" defTabSz="222250">
-            <a:lnSpc>
-              <a:spcPct val="90000"/>
-            </a:lnSpc>
-            <a:spcBef>
-              <a:spcPct val="0"/>
-            </a:spcBef>
-            <a:spcAft>
-              <a:spcPct val="35000"/>
-            </a:spcAft>
-            <a:buNone/>
-          </a:pPr>
-          <a:endParaRPr lang="es-PE" sz="500" kern="1200"/>
-        </a:p>
-      </dsp:txBody>
-      <dsp:txXfrm>
-        <a:off x="1135939" y="320484"/>
-        <a:ext cx="24765" cy="24765"/>
-      </dsp:txXfrm>
-    </dsp:sp>
-    <dsp:sp modelId="{8D89B59C-76D8-4726-93E9-BDBDEEC9934A}">
-      <dsp:nvSpPr>
-        <dsp:cNvPr id="0" name=""/>
-        <dsp:cNvSpPr/>
-      </dsp:nvSpPr>
-      <dsp:spPr>
-        <a:xfrm>
-          <a:off x="1285621" y="0"/>
-          <a:ext cx="1567426" cy="253515"/>
-        </a:xfrm>
-        <a:prstGeom prst="roundRect">
-          <a:avLst>
-            <a:gd name="adj" fmla="val 10000"/>
-          </a:avLst>
-        </a:prstGeom>
-        <a:gradFill rotWithShape="0">
-          <a:gsLst>
-            <a:gs pos="0">
-              <a:schemeClr val="accent1">
-                <a:hueOff val="0"/>
-                <a:satOff val="0"/>
-                <a:lumOff val="0"/>
-                <a:alphaOff val="0"/>
-                <a:satMod val="103000"/>
-                <a:lumMod val="102000"/>
-                <a:tint val="94000"/>
-              </a:schemeClr>
-            </a:gs>
-            <a:gs pos="50000">
-              <a:schemeClr val="accent1">
-                <a:hueOff val="0"/>
-                <a:satOff val="0"/>
-                <a:lumOff val="0"/>
-                <a:alphaOff val="0"/>
-                <a:satMod val="110000"/>
-                <a:lumMod val="100000"/>
-                <a:shade val="100000"/>
-              </a:schemeClr>
-            </a:gs>
-            <a:gs pos="100000">
-              <a:schemeClr val="accent1">
-                <a:hueOff val="0"/>
-                <a:satOff val="0"/>
-                <a:lumOff val="0"/>
-                <a:alphaOff val="0"/>
-                <a:lumMod val="99000"/>
-                <a:satMod val="120000"/>
-                <a:shade val="78000"/>
-              </a:schemeClr>
-            </a:gs>
-          </a:gsLst>
-          <a:lin ang="5400000" scaled="0"/>
-        </a:gradFill>
-        <a:ln>
-          <a:noFill/>
-        </a:ln>
-        <a:effectLst/>
-      </dsp:spPr>
-      <dsp:style>
-        <a:lnRef idx="0">
-          <a:scrgbClr r="0" g="0" b="0"/>
-        </a:lnRef>
-        <a:fillRef idx="3">
-          <a:scrgbClr r="0" g="0" b="0"/>
-        </a:fillRef>
-        <a:effectRef idx="2">
           <a:scrgbClr r="0" g="0" b="0"/>
         </a:effectRef>
         <a:fontRef idx="minor">
@@ -12431,12 +12139,12 @@
         </a:fontRef>
       </dsp:style>
       <dsp:txBody>
-        <a:bodyPr spcFirstLastPara="0" vert="horz" wrap="square" lIns="5080" tIns="5080" rIns="5080" bIns="5080" numCol="1" spcCol="1270" anchor="ctr" anchorCtr="0">
+        <a:bodyPr spcFirstLastPara="0" vert="horz" wrap="square" lIns="106680" tIns="106680" rIns="106680" bIns="106680" numCol="1" spcCol="1270" anchor="ctr" anchorCtr="0">
           <a:noAutofit/>
         </a:bodyPr>
         <a:lstStyle/>
         <a:p>
-          <a:pPr marL="0" lvl="0" indent="0" algn="ctr" defTabSz="355600">
+          <a:pPr marL="0" lvl="0" indent="0" algn="ctr" defTabSz="666750">
             <a:lnSpc>
               <a:spcPct val="90000"/>
             </a:lnSpc>
@@ -12449,48 +12157,58 @@
             <a:buNone/>
           </a:pPr>
           <a:r>
-            <a:rPr lang="es-PE" sz="800" kern="1200"/>
-            <a:t>Gestion de salida</a:t>
+            <a:rPr lang="es-PE" sz="1500" kern="1200"/>
+            <a:t>Gestion de compras:</a:t>
+          </a:r>
+        </a:p>
+        <a:p>
+          <a:pPr marL="0" lvl="0" indent="0" algn="ctr" defTabSz="666750">
+            <a:lnSpc>
+              <a:spcPct val="90000"/>
+            </a:lnSpc>
+            <a:spcBef>
+              <a:spcPct val="0"/>
+            </a:spcBef>
+            <a:spcAft>
+              <a:spcPct val="35000"/>
+            </a:spcAft>
+            <a:buNone/>
+          </a:pPr>
+          <a:r>
+            <a:rPr lang="es-PE" sz="1500" kern="1200"/>
+            <a:t>Transacciones, transaccionesdetalle y canales</a:t>
           </a:r>
         </a:p>
       </dsp:txBody>
       <dsp:txXfrm>
-        <a:off x="1293046" y="7425"/>
-        <a:ext cx="1552576" cy="238665"/>
+        <a:off x="2700019" y="0"/>
+        <a:ext cx="2700019" cy="1181338"/>
       </dsp:txXfrm>
     </dsp:sp>
-    <dsp:sp modelId="{FEB800BA-EEE9-45E9-BF1E-F37CDFE0C36F}">
+    <dsp:sp modelId="{D9CB5EF0-57C4-47A5-AE9B-937CE97F9480}">
       <dsp:nvSpPr>
         <dsp:cNvPr id="0" name=""/>
         <dsp:cNvSpPr/>
       </dsp:nvSpPr>
       <dsp:spPr>
-        <a:xfrm rot="1949548">
-          <a:off x="939587" y="761731"/>
-          <a:ext cx="912697" cy="44780"/>
+        <a:xfrm rot="10800000">
+          <a:off x="0" y="1575117"/>
+          <a:ext cx="2700019" cy="1575117"/>
         </a:xfrm>
-        <a:custGeom>
+        <a:prstGeom prst="round1Rect">
           <a:avLst/>
-          <a:gdLst/>
-          <a:ahLst/>
-          <a:cxnLst/>
-          <a:rect l="0" t="0" r="0" b="0"/>
-          <a:pathLst>
-            <a:path>
-              <a:moveTo>
-                <a:pt x="0" y="22390"/>
-              </a:moveTo>
-              <a:lnTo>
-                <a:pt x="912697" y="22390"/>
-              </a:lnTo>
-            </a:path>
-          </a:pathLst>
-        </a:custGeom>
-        <a:noFill/>
-        <a:ln w="6350" cap="flat" cmpd="sng" algn="ctr">
+        </a:prstGeom>
+        <a:solidFill>
+          <a:schemeClr val="accent1">
+            <a:hueOff val="0"/>
+            <a:satOff val="0"/>
+            <a:lumOff val="0"/>
+            <a:alphaOff val="0"/>
+          </a:schemeClr>
+        </a:solidFill>
+        <a:ln w="12700" cap="flat" cmpd="sng" algn="ctr">
           <a:solidFill>
-            <a:schemeClr val="accent1">
-              <a:shade val="60000"/>
+            <a:schemeClr val="lt1">
               <a:hueOff val="0"/>
               <a:satOff val="0"/>
               <a:lumOff val="0"/>
@@ -12503,109 +12221,13 @@
         <a:effectLst/>
       </dsp:spPr>
       <dsp:style>
-        <a:lnRef idx="1">
+        <a:lnRef idx="2">
           <a:scrgbClr r="0" g="0" b="0"/>
         </a:lnRef>
-        <a:fillRef idx="0">
+        <a:fillRef idx="1">
           <a:scrgbClr r="0" g="0" b="0"/>
         </a:fillRef>
         <a:effectRef idx="0">
-          <a:scrgbClr r="0" g="0" b="0"/>
-        </a:effectRef>
-        <a:fontRef idx="minor"/>
-      </dsp:style>
-      <dsp:txBody>
-        <a:bodyPr spcFirstLastPara="0" vert="horz" wrap="square" lIns="12700" tIns="0" rIns="12700" bIns="0" numCol="1" spcCol="1270" anchor="ctr" anchorCtr="0">
-          <a:noAutofit/>
-        </a:bodyPr>
-        <a:lstStyle/>
-        <a:p>
-          <a:pPr marL="0" lvl="0" indent="0" algn="ctr" defTabSz="222250">
-            <a:lnSpc>
-              <a:spcPct val="90000"/>
-            </a:lnSpc>
-            <a:spcBef>
-              <a:spcPct val="0"/>
-            </a:spcBef>
-            <a:spcAft>
-              <a:spcPct val="35000"/>
-            </a:spcAft>
-            <a:buNone/>
-          </a:pPr>
-          <a:endParaRPr lang="es-PE" sz="500" kern="1200"/>
-        </a:p>
-      </dsp:txBody>
-      <dsp:txXfrm>
-        <a:off x="1373119" y="761304"/>
-        <a:ext cx="45634" cy="45634"/>
-      </dsp:txXfrm>
-    </dsp:sp>
-    <dsp:sp modelId="{4AD5691D-C99C-4250-97DA-3BA6F8AC12A9}">
-      <dsp:nvSpPr>
-        <dsp:cNvPr id="0" name=""/>
-        <dsp:cNvSpPr/>
-      </dsp:nvSpPr>
-      <dsp:spPr>
-        <a:xfrm>
-          <a:off x="1780849" y="897340"/>
-          <a:ext cx="1567426" cy="263852"/>
-        </a:xfrm>
-        <a:prstGeom prst="roundRect">
-          <a:avLst>
-            <a:gd name="adj" fmla="val 10000"/>
-          </a:avLst>
-        </a:prstGeom>
-        <a:gradFill rotWithShape="0">
-          <a:gsLst>
-            <a:gs pos="0">
-              <a:schemeClr val="accent1">
-                <a:hueOff val="0"/>
-                <a:satOff val="0"/>
-                <a:lumOff val="0"/>
-                <a:alphaOff val="0"/>
-                <a:satMod val="103000"/>
-                <a:lumMod val="102000"/>
-                <a:tint val="94000"/>
-              </a:schemeClr>
-            </a:gs>
-            <a:gs pos="50000">
-              <a:schemeClr val="accent1">
-                <a:hueOff val="0"/>
-                <a:satOff val="0"/>
-                <a:lumOff val="0"/>
-                <a:alphaOff val="0"/>
-                <a:satMod val="110000"/>
-                <a:lumMod val="100000"/>
-                <a:shade val="100000"/>
-              </a:schemeClr>
-            </a:gs>
-            <a:gs pos="100000">
-              <a:schemeClr val="accent1">
-                <a:hueOff val="0"/>
-                <a:satOff val="0"/>
-                <a:lumOff val="0"/>
-                <a:alphaOff val="0"/>
-                <a:lumMod val="99000"/>
-                <a:satMod val="120000"/>
-                <a:shade val="78000"/>
-              </a:schemeClr>
-            </a:gs>
-          </a:gsLst>
-          <a:lin ang="5400000" scaled="0"/>
-        </a:gradFill>
-        <a:ln>
-          <a:noFill/>
-        </a:ln>
-        <a:effectLst/>
-      </dsp:spPr>
-      <dsp:style>
-        <a:lnRef idx="0">
-          <a:scrgbClr r="0" g="0" b="0"/>
-        </a:lnRef>
-        <a:fillRef idx="3">
-          <a:scrgbClr r="0" g="0" b="0"/>
-        </a:fillRef>
-        <a:effectRef idx="2">
           <a:scrgbClr r="0" g="0" b="0"/>
         </a:effectRef>
         <a:fontRef idx="minor">
@@ -12613,12 +12235,12 @@
         </a:fontRef>
       </dsp:style>
       <dsp:txBody>
-        <a:bodyPr spcFirstLastPara="0" vert="horz" wrap="square" lIns="5080" tIns="5080" rIns="5080" bIns="5080" numCol="1" spcCol="1270" anchor="ctr" anchorCtr="0">
+        <a:bodyPr spcFirstLastPara="0" vert="horz" wrap="square" lIns="106680" tIns="106680" rIns="106680" bIns="106680" numCol="1" spcCol="1270" anchor="ctr" anchorCtr="0">
           <a:noAutofit/>
         </a:bodyPr>
         <a:lstStyle/>
         <a:p>
-          <a:pPr marL="0" lvl="0" indent="0" algn="ctr" defTabSz="355600">
+          <a:pPr marL="0" lvl="0" indent="0" algn="ctr" defTabSz="666750">
             <a:lnSpc>
               <a:spcPct val="90000"/>
             </a:lnSpc>
@@ -12631,48 +12253,58 @@
             <a:buNone/>
           </a:pPr>
           <a:r>
-            <a:rPr lang="es-PE" sz="800" kern="1200"/>
-            <a:t>Produccion</a:t>
+            <a:rPr lang="es-PE" sz="1500" kern="1200"/>
+            <a:t>Produccion: </a:t>
+          </a:r>
+        </a:p>
+        <a:p>
+          <a:pPr marL="0" lvl="0" indent="0" algn="ctr" defTabSz="666750">
+            <a:lnSpc>
+              <a:spcPct val="90000"/>
+            </a:lnSpc>
+            <a:spcBef>
+              <a:spcPct val="0"/>
+            </a:spcBef>
+            <a:spcAft>
+              <a:spcPct val="35000"/>
+            </a:spcAft>
+            <a:buNone/>
+          </a:pPr>
+          <a:r>
+            <a:rPr lang="es-PE" sz="1500" kern="1200"/>
+            <a:t>Lotes y productos </a:t>
           </a:r>
         </a:p>
       </dsp:txBody>
-      <dsp:txXfrm>
-        <a:off x="1788577" y="905068"/>
-        <a:ext cx="1551970" cy="248396"/>
+      <dsp:txXfrm rot="10800000">
+        <a:off x="0" y="1968896"/>
+        <a:ext cx="2700019" cy="1181338"/>
       </dsp:txXfrm>
     </dsp:sp>
-    <dsp:sp modelId="{809E78D7-ECDC-4D04-A70A-F7167F78B08D}">
+    <dsp:sp modelId="{F9212AD2-3739-41F9-857E-CD128EBB22FE}">
       <dsp:nvSpPr>
         <dsp:cNvPr id="0" name=""/>
         <dsp:cNvSpPr/>
       </dsp:nvSpPr>
       <dsp:spPr>
-        <a:xfrm rot="18433766">
-          <a:off x="3190171" y="688171"/>
-          <a:ext cx="800546" cy="44780"/>
+        <a:xfrm rot="5400000">
+          <a:off x="3262471" y="1012666"/>
+          <a:ext cx="1575117" cy="2700019"/>
         </a:xfrm>
-        <a:custGeom>
+        <a:prstGeom prst="round1Rect">
           <a:avLst/>
-          <a:gdLst/>
-          <a:ahLst/>
-          <a:cxnLst/>
-          <a:rect l="0" t="0" r="0" b="0"/>
-          <a:pathLst>
-            <a:path>
-              <a:moveTo>
-                <a:pt x="0" y="22390"/>
-              </a:moveTo>
-              <a:lnTo>
-                <a:pt x="800546" y="22390"/>
-              </a:lnTo>
-            </a:path>
-          </a:pathLst>
-        </a:custGeom>
-        <a:noFill/>
-        <a:ln w="6350" cap="flat" cmpd="sng" algn="ctr">
+        </a:prstGeom>
+        <a:solidFill>
+          <a:schemeClr val="accent1">
+            <a:hueOff val="0"/>
+            <a:satOff val="0"/>
+            <a:lumOff val="0"/>
+            <a:alphaOff val="0"/>
+          </a:schemeClr>
+        </a:solidFill>
+        <a:ln w="12700" cap="flat" cmpd="sng" algn="ctr">
           <a:solidFill>
-            <a:schemeClr val="accent1">
-              <a:shade val="80000"/>
+            <a:schemeClr val="lt1">
               <a:hueOff val="0"/>
               <a:satOff val="0"/>
               <a:lumOff val="0"/>
@@ -12685,109 +12317,13 @@
         <a:effectLst/>
       </dsp:spPr>
       <dsp:style>
-        <a:lnRef idx="1">
+        <a:lnRef idx="2">
           <a:scrgbClr r="0" g="0" b="0"/>
         </a:lnRef>
-        <a:fillRef idx="0">
+        <a:fillRef idx="1">
           <a:scrgbClr r="0" g="0" b="0"/>
         </a:fillRef>
         <a:effectRef idx="0">
-          <a:scrgbClr r="0" g="0" b="0"/>
-        </a:effectRef>
-        <a:fontRef idx="minor"/>
-      </dsp:style>
-      <dsp:txBody>
-        <a:bodyPr spcFirstLastPara="0" vert="horz" wrap="square" lIns="12700" tIns="0" rIns="12700" bIns="0" numCol="1" spcCol="1270" anchor="ctr" anchorCtr="0">
-          <a:noAutofit/>
-        </a:bodyPr>
-        <a:lstStyle/>
-        <a:p>
-          <a:pPr marL="0" lvl="0" indent="0" algn="ctr" defTabSz="222250">
-            <a:lnSpc>
-              <a:spcPct val="90000"/>
-            </a:lnSpc>
-            <a:spcBef>
-              <a:spcPct val="0"/>
-            </a:spcBef>
-            <a:spcAft>
-              <a:spcPct val="35000"/>
-            </a:spcAft>
-            <a:buNone/>
-          </a:pPr>
-          <a:endParaRPr lang="es-PE" sz="500" kern="1200"/>
-        </a:p>
-      </dsp:txBody>
-      <dsp:txXfrm>
-        <a:off x="3570431" y="690548"/>
-        <a:ext cx="40027" cy="40027"/>
-      </dsp:txXfrm>
-    </dsp:sp>
-    <dsp:sp modelId="{9EED91FC-DC27-4282-B0C2-5F757280B8B3}">
-      <dsp:nvSpPr>
-        <dsp:cNvPr id="0" name=""/>
-        <dsp:cNvSpPr/>
-      </dsp:nvSpPr>
-      <dsp:spPr>
-        <a:xfrm>
-          <a:off x="3832613" y="0"/>
-          <a:ext cx="1567426" cy="783713"/>
-        </a:xfrm>
-        <a:prstGeom prst="roundRect">
-          <a:avLst>
-            <a:gd name="adj" fmla="val 10000"/>
-          </a:avLst>
-        </a:prstGeom>
-        <a:gradFill rotWithShape="0">
-          <a:gsLst>
-            <a:gs pos="0">
-              <a:schemeClr val="accent1">
-                <a:hueOff val="0"/>
-                <a:satOff val="0"/>
-                <a:lumOff val="0"/>
-                <a:alphaOff val="0"/>
-                <a:satMod val="103000"/>
-                <a:lumMod val="102000"/>
-                <a:tint val="94000"/>
-              </a:schemeClr>
-            </a:gs>
-            <a:gs pos="50000">
-              <a:schemeClr val="accent1">
-                <a:hueOff val="0"/>
-                <a:satOff val="0"/>
-                <a:lumOff val="0"/>
-                <a:alphaOff val="0"/>
-                <a:satMod val="110000"/>
-                <a:lumMod val="100000"/>
-                <a:shade val="100000"/>
-              </a:schemeClr>
-            </a:gs>
-            <a:gs pos="100000">
-              <a:schemeClr val="accent1">
-                <a:hueOff val="0"/>
-                <a:satOff val="0"/>
-                <a:lumOff val="0"/>
-                <a:alphaOff val="0"/>
-                <a:lumMod val="99000"/>
-                <a:satMod val="120000"/>
-                <a:shade val="78000"/>
-              </a:schemeClr>
-            </a:gs>
-          </a:gsLst>
-          <a:lin ang="5400000" scaled="0"/>
-        </a:gradFill>
-        <a:ln>
-          <a:noFill/>
-        </a:ln>
-        <a:effectLst/>
-      </dsp:spPr>
-      <dsp:style>
-        <a:lnRef idx="0">
-          <a:scrgbClr r="0" g="0" b="0"/>
-        </a:lnRef>
-        <a:fillRef idx="3">
-          <a:scrgbClr r="0" g="0" b="0"/>
-        </a:fillRef>
-        <a:effectRef idx="2">
           <a:scrgbClr r="0" g="0" b="0"/>
         </a:effectRef>
         <a:fontRef idx="minor">
@@ -12795,12 +12331,12 @@
         </a:fontRef>
       </dsp:style>
       <dsp:txBody>
-        <a:bodyPr spcFirstLastPara="0" vert="horz" wrap="square" lIns="5080" tIns="5080" rIns="5080" bIns="5080" numCol="1" spcCol="1270" anchor="ctr" anchorCtr="0">
+        <a:bodyPr spcFirstLastPara="0" vert="horz" wrap="square" lIns="106680" tIns="106680" rIns="106680" bIns="106680" numCol="1" spcCol="1270" anchor="ctr" anchorCtr="0">
           <a:noAutofit/>
         </a:bodyPr>
         <a:lstStyle/>
         <a:p>
-          <a:pPr marL="0" lvl="0" indent="0" algn="ctr" defTabSz="355600">
+          <a:pPr marL="0" lvl="0" indent="0" algn="ctr" defTabSz="666750">
             <a:lnSpc>
               <a:spcPct val="90000"/>
             </a:lnSpc>
@@ -12813,95 +12349,12 @@
             <a:buNone/>
           </a:pPr>
           <a:r>
-            <a:rPr lang="es-PE" sz="800" kern="1200"/>
-            <a:t>Cliente/Solicitud</a:t>
+            <a:rPr lang="es-PE" sz="1500" kern="1200"/>
+            <a:t>Datos del consumidor:</a:t>
           </a:r>
         </a:p>
-      </dsp:txBody>
-      <dsp:txXfrm>
-        <a:off x="3855567" y="22954"/>
-        <a:ext cx="1521518" cy="737805"/>
-      </dsp:txXfrm>
-    </dsp:sp>
-    <dsp:sp modelId="{1F4CCB26-C0B0-4520-9273-CF75326737E8}">
-      <dsp:nvSpPr>
-        <dsp:cNvPr id="0" name=""/>
-        <dsp:cNvSpPr/>
-      </dsp:nvSpPr>
-      <dsp:spPr>
-        <a:xfrm>
-          <a:off x="295431" y="839655"/>
-          <a:ext cx="808008" cy="682386"/>
-        </a:xfrm>
-        <a:prstGeom prst="roundRect">
-          <a:avLst>
-            <a:gd name="adj" fmla="val 10000"/>
-          </a:avLst>
-        </a:prstGeom>
-        <a:gradFill rotWithShape="0">
-          <a:gsLst>
-            <a:gs pos="0">
-              <a:schemeClr val="accent1">
-                <a:hueOff val="0"/>
-                <a:satOff val="0"/>
-                <a:lumOff val="0"/>
-                <a:alphaOff val="0"/>
-                <a:satMod val="103000"/>
-                <a:lumMod val="102000"/>
-                <a:tint val="94000"/>
-              </a:schemeClr>
-            </a:gs>
-            <a:gs pos="50000">
-              <a:schemeClr val="accent1">
-                <a:hueOff val="0"/>
-                <a:satOff val="0"/>
-                <a:lumOff val="0"/>
-                <a:alphaOff val="0"/>
-                <a:satMod val="110000"/>
-                <a:lumMod val="100000"/>
-                <a:shade val="100000"/>
-              </a:schemeClr>
-            </a:gs>
-            <a:gs pos="100000">
-              <a:schemeClr val="accent1">
-                <a:hueOff val="0"/>
-                <a:satOff val="0"/>
-                <a:lumOff val="0"/>
-                <a:alphaOff val="0"/>
-                <a:lumMod val="99000"/>
-                <a:satMod val="120000"/>
-                <a:shade val="78000"/>
-              </a:schemeClr>
-            </a:gs>
-          </a:gsLst>
-          <a:lin ang="5400000" scaled="0"/>
-        </a:gradFill>
-        <a:ln>
-          <a:noFill/>
-        </a:ln>
-        <a:effectLst/>
-      </dsp:spPr>
-      <dsp:style>
-        <a:lnRef idx="0">
-          <a:scrgbClr r="0" g="0" b="0"/>
-        </a:lnRef>
-        <a:fillRef idx="3">
-          <a:scrgbClr r="0" g="0" b="0"/>
-        </a:fillRef>
-        <a:effectRef idx="2">
-          <a:scrgbClr r="0" g="0" b="0"/>
-        </a:effectRef>
-        <a:fontRef idx="minor">
-          <a:schemeClr val="lt1"/>
-        </a:fontRef>
-      </dsp:style>
-      <dsp:txBody>
-        <a:bodyPr spcFirstLastPara="0" vert="horz" wrap="square" lIns="5080" tIns="5080" rIns="5080" bIns="5080" numCol="1" spcCol="1270" anchor="ctr" anchorCtr="0">
-          <a:noAutofit/>
-        </a:bodyPr>
-        <a:lstStyle/>
         <a:p>
-          <a:pPr marL="0" lvl="0" indent="0" algn="ctr" defTabSz="355600">
+          <a:pPr marL="0" lvl="0" indent="0" algn="ctr" defTabSz="666750">
             <a:lnSpc>
               <a:spcPct val="90000"/>
             </a:lnSpc>
@@ -12914,12 +12367,71 @@
             <a:buNone/>
           </a:pPr>
           <a:r>
-            <a:rPr lang="es-PE" sz="800" kern="1200"/>
-            <a:t>- Detalle de la transferencia</a:t>
+            <a:rPr lang="es-PE" sz="1500" kern="1200"/>
+            <a:t>Interaccionesqr y consumidorfinal</a:t>
           </a:r>
         </a:p>
+      </dsp:txBody>
+      <dsp:txXfrm rot="-5400000">
+        <a:off x="2700020" y="1968895"/>
+        <a:ext cx="2700019" cy="1181338"/>
+      </dsp:txXfrm>
+    </dsp:sp>
+    <dsp:sp modelId="{15DA4C24-45F2-491D-8FC2-76BE5FF69CA5}">
+      <dsp:nvSpPr>
+        <dsp:cNvPr id="0" name=""/>
+        <dsp:cNvSpPr/>
+      </dsp:nvSpPr>
+      <dsp:spPr>
+        <a:xfrm>
+          <a:off x="1890013" y="1181338"/>
+          <a:ext cx="1620012" cy="787558"/>
+        </a:xfrm>
+        <a:prstGeom prst="roundRect">
+          <a:avLst/>
+        </a:prstGeom>
+        <a:solidFill>
+          <a:schemeClr val="accent1">
+            <a:tint val="60000"/>
+            <a:hueOff val="0"/>
+            <a:satOff val="0"/>
+            <a:lumOff val="0"/>
+            <a:alphaOff val="0"/>
+          </a:schemeClr>
+        </a:solidFill>
+        <a:ln w="12700" cap="flat" cmpd="sng" algn="ctr">
+          <a:solidFill>
+            <a:schemeClr val="lt1">
+              <a:hueOff val="0"/>
+              <a:satOff val="0"/>
+              <a:lumOff val="0"/>
+              <a:alphaOff val="0"/>
+            </a:schemeClr>
+          </a:solidFill>
+          <a:prstDash val="solid"/>
+          <a:miter lim="800000"/>
+        </a:ln>
+        <a:effectLst/>
+      </dsp:spPr>
+      <dsp:style>
+        <a:lnRef idx="2">
+          <a:scrgbClr r="0" g="0" b="0"/>
+        </a:lnRef>
+        <a:fillRef idx="1">
+          <a:scrgbClr r="0" g="0" b="0"/>
+        </a:fillRef>
+        <a:effectRef idx="0">
+          <a:scrgbClr r="0" g="0" b="0"/>
+        </a:effectRef>
+        <a:fontRef idx="minor"/>
+      </dsp:style>
+      <dsp:txBody>
+        <a:bodyPr spcFirstLastPara="0" vert="horz" wrap="square" lIns="57150" tIns="57150" rIns="57150" bIns="57150" numCol="1" spcCol="1270" anchor="ctr" anchorCtr="0">
+          <a:noAutofit/>
+        </a:bodyPr>
+        <a:lstStyle/>
         <a:p>
-          <a:pPr marL="0" lvl="0" indent="0" algn="ctr" defTabSz="355600">
+          <a:pPr marL="0" lvl="0" indent="0" algn="ctr" defTabSz="666750">
             <a:lnSpc>
               <a:spcPct val="90000"/>
             </a:lnSpc>
@@ -12932,389 +12444,14 @@
             <a:buNone/>
           </a:pPr>
           <a:r>
-            <a:rPr lang="es-PE" sz="800" kern="1200"/>
-            <a:t>- Transacciones</a:t>
-          </a:r>
-        </a:p>
-        <a:p>
-          <a:pPr marL="0" lvl="0" indent="0" algn="ctr" defTabSz="355600">
-            <a:lnSpc>
-              <a:spcPct val="90000"/>
-            </a:lnSpc>
-            <a:spcBef>
-              <a:spcPct val="0"/>
-            </a:spcBef>
-            <a:spcAft>
-              <a:spcPct val="35000"/>
-            </a:spcAft>
-            <a:buNone/>
-          </a:pPr>
-          <a:r>
-            <a:rPr lang="es-PE" sz="800" kern="1200"/>
-            <a:t>- Canales </a:t>
+            <a:rPr lang="es-PE" sz="1500" kern="1200"/>
+            <a:t>Base de datos "agroglobal"</a:t>
           </a:r>
         </a:p>
       </dsp:txBody>
       <dsp:txXfrm>
-        <a:off x="315417" y="859641"/>
-        <a:ext cx="768036" cy="642414"/>
-      </dsp:txXfrm>
-    </dsp:sp>
-    <dsp:sp modelId="{77C47A97-26C2-4A9A-BE5F-C9B4196ED41C}">
-      <dsp:nvSpPr>
-        <dsp:cNvPr id="0" name=""/>
-        <dsp:cNvSpPr/>
-      </dsp:nvSpPr>
-      <dsp:spPr>
-        <a:xfrm>
-          <a:off x="1556018" y="290538"/>
-          <a:ext cx="1257655" cy="367726"/>
-        </a:xfrm>
-        <a:prstGeom prst="roundRect">
-          <a:avLst>
-            <a:gd name="adj" fmla="val 10000"/>
-          </a:avLst>
-        </a:prstGeom>
-        <a:gradFill rotWithShape="0">
-          <a:gsLst>
-            <a:gs pos="0">
-              <a:schemeClr val="accent1">
-                <a:hueOff val="0"/>
-                <a:satOff val="0"/>
-                <a:lumOff val="0"/>
-                <a:alphaOff val="0"/>
-                <a:satMod val="103000"/>
-                <a:lumMod val="102000"/>
-                <a:tint val="94000"/>
-              </a:schemeClr>
-            </a:gs>
-            <a:gs pos="50000">
-              <a:schemeClr val="accent1">
-                <a:hueOff val="0"/>
-                <a:satOff val="0"/>
-                <a:lumOff val="0"/>
-                <a:alphaOff val="0"/>
-                <a:satMod val="110000"/>
-                <a:lumMod val="100000"/>
-                <a:shade val="100000"/>
-              </a:schemeClr>
-            </a:gs>
-            <a:gs pos="100000">
-              <a:schemeClr val="accent1">
-                <a:hueOff val="0"/>
-                <a:satOff val="0"/>
-                <a:lumOff val="0"/>
-                <a:alphaOff val="0"/>
-                <a:lumMod val="99000"/>
-                <a:satMod val="120000"/>
-                <a:shade val="78000"/>
-              </a:schemeClr>
-            </a:gs>
-          </a:gsLst>
-          <a:lin ang="5400000" scaled="0"/>
-        </a:gradFill>
-        <a:ln>
-          <a:noFill/>
-        </a:ln>
-        <a:effectLst/>
-      </dsp:spPr>
-      <dsp:style>
-        <a:lnRef idx="0">
-          <a:scrgbClr r="0" g="0" b="0"/>
-        </a:lnRef>
-        <a:fillRef idx="3">
-          <a:scrgbClr r="0" g="0" b="0"/>
-        </a:fillRef>
-        <a:effectRef idx="2">
-          <a:scrgbClr r="0" g="0" b="0"/>
-        </a:effectRef>
-        <a:fontRef idx="minor">
-          <a:schemeClr val="lt1"/>
-        </a:fontRef>
-      </dsp:style>
-      <dsp:txBody>
-        <a:bodyPr spcFirstLastPara="0" vert="horz" wrap="square" lIns="5080" tIns="5080" rIns="5080" bIns="5080" numCol="1" spcCol="1270" anchor="ctr" anchorCtr="0">
-          <a:noAutofit/>
-        </a:bodyPr>
-        <a:lstStyle/>
-        <a:p>
-          <a:pPr marL="0" lvl="0" indent="0" algn="ctr" defTabSz="355600">
-            <a:lnSpc>
-              <a:spcPct val="90000"/>
-            </a:lnSpc>
-            <a:spcBef>
-              <a:spcPct val="0"/>
-            </a:spcBef>
-            <a:spcAft>
-              <a:spcPct val="35000"/>
-            </a:spcAft>
-            <a:buNone/>
-          </a:pPr>
-          <a:r>
-            <a:rPr lang="es-PE" sz="800" kern="1200"/>
-            <a:t>- Despacho </a:t>
-          </a:r>
-        </a:p>
-        <a:p>
-          <a:pPr marL="0" lvl="0" indent="0" algn="ctr" defTabSz="355600">
-            <a:lnSpc>
-              <a:spcPct val="90000"/>
-            </a:lnSpc>
-            <a:spcBef>
-              <a:spcPct val="0"/>
-            </a:spcBef>
-            <a:spcAft>
-              <a:spcPct val="35000"/>
-            </a:spcAft>
-            <a:buNone/>
-          </a:pPr>
-          <a:r>
-            <a:rPr lang="es-PE" sz="800" kern="1200"/>
-            <a:t>- Monitoreo de puerto</a:t>
-          </a:r>
-        </a:p>
-      </dsp:txBody>
-      <dsp:txXfrm>
-        <a:off x="1566788" y="301308"/>
-        <a:ext cx="1236115" cy="346186"/>
-      </dsp:txXfrm>
-    </dsp:sp>
-    <dsp:sp modelId="{D5254D5D-93F9-4349-97EE-703C0B99704D}">
-      <dsp:nvSpPr>
-        <dsp:cNvPr id="0" name=""/>
-        <dsp:cNvSpPr/>
-      </dsp:nvSpPr>
-      <dsp:spPr>
-        <a:xfrm>
-          <a:off x="1829032" y="1209184"/>
-          <a:ext cx="1266308" cy="358956"/>
-        </a:xfrm>
-        <a:prstGeom prst="roundRect">
-          <a:avLst>
-            <a:gd name="adj" fmla="val 10000"/>
-          </a:avLst>
-        </a:prstGeom>
-        <a:gradFill rotWithShape="0">
-          <a:gsLst>
-            <a:gs pos="0">
-              <a:schemeClr val="accent1">
-                <a:hueOff val="0"/>
-                <a:satOff val="0"/>
-                <a:lumOff val="0"/>
-                <a:alphaOff val="0"/>
-                <a:satMod val="103000"/>
-                <a:lumMod val="102000"/>
-                <a:tint val="94000"/>
-              </a:schemeClr>
-            </a:gs>
-            <a:gs pos="50000">
-              <a:schemeClr val="accent1">
-                <a:hueOff val="0"/>
-                <a:satOff val="0"/>
-                <a:lumOff val="0"/>
-                <a:alphaOff val="0"/>
-                <a:satMod val="110000"/>
-                <a:lumMod val="100000"/>
-                <a:shade val="100000"/>
-              </a:schemeClr>
-            </a:gs>
-            <a:gs pos="100000">
-              <a:schemeClr val="accent1">
-                <a:hueOff val="0"/>
-                <a:satOff val="0"/>
-                <a:lumOff val="0"/>
-                <a:alphaOff val="0"/>
-                <a:lumMod val="99000"/>
-                <a:satMod val="120000"/>
-                <a:shade val="78000"/>
-              </a:schemeClr>
-            </a:gs>
-          </a:gsLst>
-          <a:lin ang="5400000" scaled="0"/>
-        </a:gradFill>
-        <a:ln>
-          <a:noFill/>
-        </a:ln>
-        <a:effectLst/>
-      </dsp:spPr>
-      <dsp:style>
-        <a:lnRef idx="0">
-          <a:scrgbClr r="0" g="0" b="0"/>
-        </a:lnRef>
-        <a:fillRef idx="3">
-          <a:scrgbClr r="0" g="0" b="0"/>
-        </a:fillRef>
-        <a:effectRef idx="2">
-          <a:scrgbClr r="0" g="0" b="0"/>
-        </a:effectRef>
-        <a:fontRef idx="minor">
-          <a:schemeClr val="lt1"/>
-        </a:fontRef>
-      </dsp:style>
-      <dsp:txBody>
-        <a:bodyPr spcFirstLastPara="0" vert="horz" wrap="square" lIns="5080" tIns="5080" rIns="5080" bIns="5080" numCol="1" spcCol="1270" anchor="ctr" anchorCtr="0">
-          <a:noAutofit/>
-        </a:bodyPr>
-        <a:lstStyle/>
-        <a:p>
-          <a:pPr marL="0" lvl="0" indent="0" algn="ctr" defTabSz="355600">
-            <a:lnSpc>
-              <a:spcPct val="90000"/>
-            </a:lnSpc>
-            <a:spcBef>
-              <a:spcPct val="0"/>
-            </a:spcBef>
-            <a:spcAft>
-              <a:spcPct val="35000"/>
-            </a:spcAft>
-            <a:buNone/>
-          </a:pPr>
-          <a:r>
-            <a:rPr lang="es-PE" sz="800" kern="1200"/>
-            <a:t>- Qr o codigos en barra</a:t>
-          </a:r>
-        </a:p>
-        <a:p>
-          <a:pPr marL="0" lvl="0" indent="0" algn="ctr" defTabSz="355600">
-            <a:lnSpc>
-              <a:spcPct val="90000"/>
-            </a:lnSpc>
-            <a:spcBef>
-              <a:spcPct val="0"/>
-            </a:spcBef>
-            <a:spcAft>
-              <a:spcPct val="35000"/>
-            </a:spcAft>
-            <a:buNone/>
-          </a:pPr>
-          <a:r>
-            <a:rPr lang="es-PE" sz="800" kern="1200"/>
-            <a:t>- Consumidor final</a:t>
-          </a:r>
-        </a:p>
-      </dsp:txBody>
-      <dsp:txXfrm>
-        <a:off x="1839545" y="1219697"/>
-        <a:ext cx="1245282" cy="337930"/>
-      </dsp:txXfrm>
-    </dsp:sp>
-    <dsp:sp modelId="{F9144E29-2DA4-4D21-B3EF-213A5F247CBA}">
-      <dsp:nvSpPr>
-        <dsp:cNvPr id="0" name=""/>
-        <dsp:cNvSpPr/>
-      </dsp:nvSpPr>
-      <dsp:spPr>
-        <a:xfrm>
-          <a:off x="3995858" y="840635"/>
-          <a:ext cx="1266308" cy="358956"/>
-        </a:xfrm>
-        <a:prstGeom prst="roundRect">
-          <a:avLst>
-            <a:gd name="adj" fmla="val 10000"/>
-          </a:avLst>
-        </a:prstGeom>
-        <a:gradFill rotWithShape="0">
-          <a:gsLst>
-            <a:gs pos="0">
-              <a:schemeClr val="accent1">
-                <a:hueOff val="0"/>
-                <a:satOff val="0"/>
-                <a:lumOff val="0"/>
-                <a:alphaOff val="0"/>
-                <a:satMod val="103000"/>
-                <a:lumMod val="102000"/>
-                <a:tint val="94000"/>
-              </a:schemeClr>
-            </a:gs>
-            <a:gs pos="50000">
-              <a:schemeClr val="accent1">
-                <a:hueOff val="0"/>
-                <a:satOff val="0"/>
-                <a:lumOff val="0"/>
-                <a:alphaOff val="0"/>
-                <a:satMod val="110000"/>
-                <a:lumMod val="100000"/>
-                <a:shade val="100000"/>
-              </a:schemeClr>
-            </a:gs>
-            <a:gs pos="100000">
-              <a:schemeClr val="accent1">
-                <a:hueOff val="0"/>
-                <a:satOff val="0"/>
-                <a:lumOff val="0"/>
-                <a:alphaOff val="0"/>
-                <a:lumMod val="99000"/>
-                <a:satMod val="120000"/>
-                <a:shade val="78000"/>
-              </a:schemeClr>
-            </a:gs>
-          </a:gsLst>
-          <a:lin ang="5400000" scaled="0"/>
-        </a:gradFill>
-        <a:ln>
-          <a:noFill/>
-        </a:ln>
-        <a:effectLst/>
-      </dsp:spPr>
-      <dsp:style>
-        <a:lnRef idx="0">
-          <a:scrgbClr r="0" g="0" b="0"/>
-        </a:lnRef>
-        <a:fillRef idx="3">
-          <a:scrgbClr r="0" g="0" b="0"/>
-        </a:fillRef>
-        <a:effectRef idx="2">
-          <a:scrgbClr r="0" g="0" b="0"/>
-        </a:effectRef>
-        <a:fontRef idx="minor">
-          <a:schemeClr val="lt1"/>
-        </a:fontRef>
-      </dsp:style>
-      <dsp:txBody>
-        <a:bodyPr spcFirstLastPara="0" vert="horz" wrap="square" lIns="5080" tIns="5080" rIns="5080" bIns="5080" numCol="1" spcCol="1270" anchor="ctr" anchorCtr="0">
-          <a:noAutofit/>
-        </a:bodyPr>
-        <a:lstStyle/>
-        <a:p>
-          <a:pPr marL="0" lvl="0" indent="0" algn="ctr" defTabSz="355600">
-            <a:lnSpc>
-              <a:spcPct val="90000"/>
-            </a:lnSpc>
-            <a:spcBef>
-              <a:spcPct val="0"/>
-            </a:spcBef>
-            <a:spcAft>
-              <a:spcPct val="35000"/>
-            </a:spcAft>
-            <a:buNone/>
-          </a:pPr>
-          <a:r>
-            <a:rPr lang="es-PE" sz="800" kern="1200"/>
-            <a:t>- Productos</a:t>
-          </a:r>
-        </a:p>
-        <a:p>
-          <a:pPr marL="0" lvl="0" indent="0" algn="ctr" defTabSz="355600">
-            <a:lnSpc>
-              <a:spcPct val="90000"/>
-            </a:lnSpc>
-            <a:spcBef>
-              <a:spcPct val="0"/>
-            </a:spcBef>
-            <a:spcAft>
-              <a:spcPct val="35000"/>
-            </a:spcAft>
-            <a:buNone/>
-          </a:pPr>
-          <a:r>
-            <a:rPr lang="es-PE" sz="800" kern="1200"/>
-            <a:t>- Lotes</a:t>
-          </a:r>
-        </a:p>
-      </dsp:txBody>
-      <dsp:txXfrm>
-        <a:off x="4006371" y="851148"/>
-        <a:ext cx="1245282" cy="337930"/>
+        <a:off x="1928458" y="1219783"/>
+        <a:ext cx="1543122" cy="710668"/>
       </dsp:txXfrm>
     </dsp:sp>
   </dsp:spTree>
@@ -13642,11 +12779,11 @@
 </file>
 
 <file path=word/diagrams/layout2.xml><?xml version="1.0" encoding="utf-8"?>
-<dgm:layoutDef xmlns:dgm="http://schemas.openxmlformats.org/drawingml/2006/diagram" xmlns:a="http://schemas.openxmlformats.org/drawingml/2006/main" uniqueId="urn:microsoft.com/office/officeart/2005/8/layout/hierarchy2">
+<dgm:layoutDef xmlns:dgm="http://schemas.openxmlformats.org/drawingml/2006/diagram" xmlns:a="http://schemas.openxmlformats.org/drawingml/2006/main" uniqueId="urn:microsoft.com/office/officeart/2005/8/layout/matrix1">
   <dgm:title val=""/>
   <dgm:desc val=""/>
   <dgm:catLst>
-    <dgm:cat type="hierarchy" pri="5000"/>
+    <dgm:cat type="matrix" pri="2000"/>
   </dgm:catLst>
   <dgm:sampData>
     <dgm:dataModel>
@@ -13655,29 +12792,25 @@
         <dgm:pt modelId="1">
           <dgm:prSet phldr="1"/>
         </dgm:pt>
-        <dgm:pt modelId="2">
+        <dgm:pt modelId="11">
           <dgm:prSet phldr="1"/>
         </dgm:pt>
-        <dgm:pt modelId="21">
+        <dgm:pt modelId="12">
           <dgm:prSet phldr="1"/>
         </dgm:pt>
-        <dgm:pt modelId="22">
+        <dgm:pt modelId="13">
           <dgm:prSet phldr="1"/>
         </dgm:pt>
-        <dgm:pt modelId="3">
-          <dgm:prSet phldr="1"/>
-        </dgm:pt>
-        <dgm:pt modelId="31">
+        <dgm:pt modelId="14">
           <dgm:prSet phldr="1"/>
         </dgm:pt>
       </dgm:ptLst>
       <dgm:cxnLst>
-        <dgm:cxn modelId="4" srcId="0" destId="1" srcOrd="0" destOrd="0"/>
-        <dgm:cxn modelId="5" srcId="1" destId="2" srcOrd="0" destOrd="0"/>
-        <dgm:cxn modelId="6" srcId="1" destId="3" srcOrd="1" destOrd="0"/>
-        <dgm:cxn modelId="23" srcId="2" destId="21" srcOrd="0" destOrd="0"/>
-        <dgm:cxn modelId="24" srcId="2" destId="22" srcOrd="1" destOrd="0"/>
-        <dgm:cxn modelId="33" srcId="3" destId="31" srcOrd="0" destOrd="0"/>
+        <dgm:cxn modelId="2" srcId="0" destId="1" srcOrd="0" destOrd="0"/>
+        <dgm:cxn modelId="3" srcId="1" destId="11" srcOrd="0" destOrd="0"/>
+        <dgm:cxn modelId="4" srcId="1" destId="12" srcOrd="1" destOrd="0"/>
+        <dgm:cxn modelId="5" srcId="1" destId="13" srcOrd="2" destOrd="0"/>
+        <dgm:cxn modelId="6" srcId="1" destId="14" srcOrd="3" destOrd="0"/>
       </dgm:cxnLst>
       <dgm:bg/>
       <dgm:whole/>
@@ -13690,11 +12823,15 @@
         <dgm:pt modelId="1"/>
         <dgm:pt modelId="11"/>
         <dgm:pt modelId="12"/>
+        <dgm:pt modelId="13"/>
+        <dgm:pt modelId="14"/>
       </dgm:ptLst>
       <dgm:cxnLst>
         <dgm:cxn modelId="2" srcId="0" destId="1" srcOrd="0" destOrd="0"/>
-        <dgm:cxn modelId="13" srcId="1" destId="11" srcOrd="0" destOrd="0"/>
-        <dgm:cxn modelId="14" srcId="1" destId="12" srcOrd="1" destOrd="0"/>
+        <dgm:cxn modelId="15" srcId="1" destId="11" srcOrd="0" destOrd="0"/>
+        <dgm:cxn modelId="16" srcId="1" destId="12" srcOrd="1" destOrd="0"/>
+        <dgm:cxn modelId="17" srcId="1" destId="13" srcOrd="2" destOrd="0"/>
+        <dgm:cxn modelId="18" srcId="1" destId="14" srcOrd="3" destOrd="0"/>
       </dgm:cxnLst>
       <dgm:bg/>
       <dgm:whole/>
@@ -13705,21 +12842,17 @@
       <dgm:ptLst>
         <dgm:pt modelId="0" type="doc"/>
         <dgm:pt modelId="1"/>
-        <dgm:pt modelId="2"/>
-        <dgm:pt modelId="21"/>
-        <dgm:pt modelId="211"/>
-        <dgm:pt modelId="3"/>
-        <dgm:pt modelId="31"/>
-        <dgm:pt modelId="311"/>
+        <dgm:pt modelId="11"/>
+        <dgm:pt modelId="12"/>
+        <dgm:pt modelId="13"/>
+        <dgm:pt modelId="14"/>
       </dgm:ptLst>
       <dgm:cxnLst>
-        <dgm:cxn modelId="4" srcId="0" destId="1" srcOrd="0" destOrd="0"/>
-        <dgm:cxn modelId="5" srcId="1" destId="2" srcOrd="0" destOrd="0"/>
-        <dgm:cxn modelId="6" srcId="1" destId="3" srcOrd="1" destOrd="0"/>
-        <dgm:cxn modelId="23" srcId="2" destId="21" srcOrd="0" destOrd="0"/>
-        <dgm:cxn modelId="24" srcId="21" destId="211" srcOrd="0" destOrd="0"/>
-        <dgm:cxn modelId="33" srcId="3" destId="31" srcOrd="0" destOrd="0"/>
-        <dgm:cxn modelId="34" srcId="31" destId="311" srcOrd="0" destOrd="0"/>
+        <dgm:cxn modelId="2" srcId="0" destId="1" srcOrd="0" destOrd="0"/>
+        <dgm:cxn modelId="15" srcId="1" destId="11" srcOrd="0" destOrd="0"/>
+        <dgm:cxn modelId="16" srcId="1" destId="12" srcOrd="1" destOrd="0"/>
+        <dgm:cxn modelId="17" srcId="1" destId="13" srcOrd="2" destOrd="0"/>
+        <dgm:cxn modelId="18" srcId="1" destId="14" srcOrd="3" destOrd="0"/>
       </dgm:cxnLst>
       <dgm:bg/>
       <dgm:whole/>
@@ -13727,236 +12860,297 @@
   </dgm:clrData>
   <dgm:layoutNode name="diagram">
     <dgm:varLst>
-      <dgm:chPref val="1"/>
+      <dgm:chMax val="1"/>
       <dgm:dir/>
-      <dgm:animOne val="branch"/>
-      <dgm:animLvl val="lvl"/>
+      <dgm:animLvl val="ctr"/>
       <dgm:resizeHandles val="exact"/>
     </dgm:varLst>
-    <dgm:choose name="Name0">
-      <dgm:if name="Name1" func="var" arg="dir" op="equ" val="norm">
-        <dgm:alg type="hierChild">
-          <dgm:param type="linDir" val="fromT"/>
-          <dgm:param type="chAlign" val="l"/>
-        </dgm:alg>
-      </dgm:if>
-      <dgm:else name="Name2">
-        <dgm:alg type="hierChild">
-          <dgm:param type="linDir" val="fromT"/>
-          <dgm:param type="chAlign" val="r"/>
-        </dgm:alg>
-      </dgm:else>
-    </dgm:choose>
+    <dgm:alg type="composite"/>
     <dgm:shape xmlns:r="http://schemas.openxmlformats.org/officeDocument/2006/relationships" r:blip="">
       <dgm:adjLst/>
     </dgm:shape>
     <dgm:presOf/>
     <dgm:constrLst>
-      <dgm:constr type="h" for="des" ptType="node" refType="h"/>
-      <dgm:constr type="w" for="des" ptType="node" refType="h" refFor="des" refPtType="node" fact="2"/>
-      <dgm:constr type="sibSp" refType="h" refFor="des" refPtType="node" op="equ" fact="0.15"/>
-      <dgm:constr type="sibSp" for="des" forName="level2hierChild" refType="h" refFor="des" refPtType="node" op="equ" fact="0.15"/>
-      <dgm:constr type="sibSp" for="des" forName="level3hierChild" refType="h" refFor="des" refPtType="node" op="equ" fact="0.15"/>
-      <dgm:constr type="sp" for="des" forName="root1" refType="w" refFor="des" refPtType="node" fact="0.4"/>
-      <dgm:constr type="sp" for="des" forName="root2" refType="sp" refFor="des" refForName="root1" op="equ"/>
+      <dgm:constr type="ctrX" for="ch" forName="matrix" refType="w" fact="0.5"/>
+      <dgm:constr type="ctrY" for="ch" forName="matrix" refType="h" fact="0.5"/>
+      <dgm:constr type="w" for="ch" forName="matrix" refType="w"/>
+      <dgm:constr type="h" for="ch" forName="matrix" refType="h"/>
+      <dgm:constr type="ctrX" for="ch" forName="centerTile" refType="w" fact="0.5"/>
+      <dgm:constr type="ctrY" for="ch" forName="centerTile" refType="h" fact="0.5"/>
+      <dgm:constr type="w" for="ch" forName="centerTile" refType="w" fact="0.3"/>
+      <dgm:constr type="h" for="ch" forName="centerTile" refType="h" fact="0.25"/>
       <dgm:constr type="primFontSz" for="des" ptType="node" op="equ" val="65"/>
-      <dgm:constr type="primFontSz" for="des" forName="connTx" op="equ" val="55"/>
-      <dgm:constr type="primFontSz" for="des" forName="connTx" refType="primFontSz" refFor="des" refPtType="node" op="lte" fact="0.8"/>
     </dgm:constrLst>
     <dgm:ruleLst/>
-    <dgm:forEach name="Name3" axis="ch">
-      <dgm:forEach name="Name4" axis="self" ptType="node">
-        <dgm:layoutNode name="root1">
-          <dgm:choose name="Name5">
-            <dgm:if name="Name6" func="var" arg="dir" op="equ" val="norm">
-              <dgm:alg type="hierRoot">
-                <dgm:param type="hierAlign" val="lCtrCh"/>
-              </dgm:alg>
-            </dgm:if>
-            <dgm:else name="Name7">
-              <dgm:alg type="hierRoot">
-                <dgm:param type="hierAlign" val="rCtrCh"/>
-              </dgm:alg>
-            </dgm:else>
-          </dgm:choose>
+    <dgm:choose name="Name0">
+      <dgm:if name="Name1" axis="ch" ptType="node" func="cnt" op="gte" val="1">
+        <dgm:layoutNode name="matrix">
+          <dgm:alg type="composite"/>
           <dgm:shape xmlns:r="http://schemas.openxmlformats.org/officeDocument/2006/relationships" r:blip="">
             <dgm:adjLst/>
           </dgm:shape>
           <dgm:presOf/>
-          <dgm:constrLst/>
+          <dgm:constrLst>
+            <dgm:constr type="l" for="ch" forName="tile1"/>
+            <dgm:constr type="t" for="ch" forName="tile1"/>
+            <dgm:constr type="r" for="ch" forName="tile1" refType="w" fact="0.5"/>
+            <dgm:constr type="b" for="ch" forName="tile1" refType="h" fact="0.5"/>
+            <dgm:constr type="l" for="ch" forName="tile1text" refType="l" refFor="ch" refForName="tile1"/>
+            <dgm:constr type="t" for="ch" forName="tile1text" refType="t" refFor="ch" refForName="tile1"/>
+            <dgm:constr type="w" for="ch" forName="tile1text" refType="w" refFor="ch" refForName="tile1"/>
+            <dgm:constr type="h" for="ch" forName="tile1text" refType="h" refFor="ch" refForName="tile1" fact="0.75"/>
+            <dgm:constr type="r" for="ch" forName="tile2" refType="w"/>
+            <dgm:constr type="t" for="ch" forName="tile2"/>
+            <dgm:constr type="l" for="ch" forName="tile2" refType="w" fact="0.5"/>
+            <dgm:constr type="b" for="ch" forName="tile2" refType="h" fact="0.5"/>
+            <dgm:constr type="r" for="ch" forName="tile2text" refType="r" refFor="ch" refForName="tile2"/>
+            <dgm:constr type="t" for="ch" forName="tile2text" refType="t" refFor="ch" refForName="tile2"/>
+            <dgm:constr type="w" for="ch" forName="tile2text" refType="w" refFor="ch" refForName="tile2"/>
+            <dgm:constr type="h" for="ch" forName="tile2text" refType="h" refFor="ch" refForName="tile2" fact="0.75"/>
+            <dgm:constr type="l" for="ch" forName="tile3"/>
+            <dgm:constr type="b" for="ch" forName="tile3" refType="h"/>
+            <dgm:constr type="r" for="ch" forName="tile3" refType="w" fact="0.5"/>
+            <dgm:constr type="t" for="ch" forName="tile3" refType="h" fact="0.5"/>
+            <dgm:constr type="l" for="ch" forName="tile3text" refType="l" refFor="ch" refForName="tile3"/>
+            <dgm:constr type="b" for="ch" forName="tile3text" refType="b" refFor="ch" refForName="tile3"/>
+            <dgm:constr type="w" for="ch" forName="tile3text" refType="w" refFor="ch" refForName="tile3"/>
+            <dgm:constr type="h" for="ch" forName="tile3text" refType="h" refFor="ch" refForName="tile3" fact="0.75"/>
+            <dgm:constr type="r" for="ch" forName="tile4" refType="w"/>
+            <dgm:constr type="b" for="ch" forName="tile4" refType="h"/>
+            <dgm:constr type="l" for="ch" forName="tile4" refType="w" fact="0.5"/>
+            <dgm:constr type="t" for="ch" forName="tile4" refType="h" fact="0.5"/>
+            <dgm:constr type="r" for="ch" forName="tile4text" refType="r" refFor="ch" refForName="tile4"/>
+            <dgm:constr type="b" for="ch" forName="tile4text" refType="b" refFor="ch" refForName="tile4"/>
+            <dgm:constr type="w" for="ch" forName="tile4text" refType="w" refFor="ch" refForName="tile4"/>
+            <dgm:constr type="h" for="ch" forName="tile4text" refType="h" refFor="ch" refForName="tile4" fact="0.75"/>
+          </dgm:constrLst>
           <dgm:ruleLst/>
-          <dgm:layoutNode name="LevelOneTextNode" styleLbl="node0">
+          <dgm:layoutNode name="tile1" styleLbl="node1">
+            <dgm:alg type="sp"/>
+            <dgm:shape xmlns:r="http://schemas.openxmlformats.org/officeDocument/2006/relationships" rot="270" type="round1Rect" r:blip="">
+              <dgm:adjLst/>
+            </dgm:shape>
+            <dgm:choose name="Name2">
+              <dgm:if name="Name3" func="var" arg="dir" op="equ" val="norm">
+                <dgm:presOf axis="ch ch desOrSelf" ptType="node node node" st="1 1 1" cnt="1 1 0"/>
+              </dgm:if>
+              <dgm:else name="Name4">
+                <dgm:presOf axis="ch ch desOrSelf" ptType="node node node" st="1 2 1" cnt="1 1 0"/>
+              </dgm:else>
+            </dgm:choose>
+            <dgm:constrLst/>
+            <dgm:ruleLst/>
+          </dgm:layoutNode>
+          <dgm:layoutNode name="tile1text" styleLbl="node1">
             <dgm:varLst>
-              <dgm:chPref val="3"/>
+              <dgm:chMax val="0"/>
+              <dgm:chPref val="0"/>
+              <dgm:bulletEnabled val="1"/>
             </dgm:varLst>
-            <dgm:alg type="tx"/>
-            <dgm:shape xmlns:r="http://schemas.openxmlformats.org/officeDocument/2006/relationships" type="roundRect" r:blip="">
+            <dgm:choose name="Name5">
+              <dgm:if name="Name6" axis="root des" func="maxDepth" op="gte" val="3">
+                <dgm:alg type="tx">
+                  <dgm:param type="txAnchorVert" val="t"/>
+                  <dgm:param type="parTxLTRAlign" val="l"/>
+                  <dgm:param type="parTxRTLAlign" val="r"/>
+                </dgm:alg>
+              </dgm:if>
+              <dgm:else name="Name7">
+                <dgm:alg type="tx"/>
+              </dgm:else>
+            </dgm:choose>
+            <dgm:shape xmlns:r="http://schemas.openxmlformats.org/officeDocument/2006/relationships" rot="270" type="rect" r:blip="" hideGeom="1">
               <dgm:adjLst>
-                <dgm:adj idx="1" val="0.1"/>
+                <dgm:adj idx="1" val="0.2"/>
               </dgm:adjLst>
             </dgm:shape>
-            <dgm:presOf axis="self"/>
-            <dgm:constrLst>
-              <dgm:constr type="tMarg" refType="primFontSz" fact="0.05"/>
-              <dgm:constr type="bMarg" refType="primFontSz" fact="0.05"/>
-              <dgm:constr type="lMarg" refType="primFontSz" fact="0.05"/>
-              <dgm:constr type="rMarg" refType="primFontSz" fact="0.05"/>
-            </dgm:constrLst>
+            <dgm:choose name="Name8">
+              <dgm:if name="Name9" func="var" arg="dir" op="equ" val="norm">
+                <dgm:presOf axis="ch ch desOrSelf" ptType="node node node" st="1 1 1" cnt="1 1 0"/>
+              </dgm:if>
+              <dgm:else name="Name10">
+                <dgm:presOf axis="ch ch desOrSelf" ptType="node node node" st="1 2 1" cnt="1 1 0"/>
+              </dgm:else>
+            </dgm:choose>
+            <dgm:constrLst/>
             <dgm:ruleLst>
               <dgm:rule type="primFontSz" val="5" fact="NaN" max="NaN"/>
             </dgm:ruleLst>
           </dgm:layoutNode>
-          <dgm:layoutNode name="level2hierChild">
-            <dgm:choose name="Name8">
-              <dgm:if name="Name9" func="var" arg="dir" op="equ" val="norm">
-                <dgm:alg type="hierChild">
-                  <dgm:param type="linDir" val="fromT"/>
-                  <dgm:param type="chAlign" val="l"/>
+          <dgm:layoutNode name="tile2" styleLbl="node1">
+            <dgm:alg type="sp"/>
+            <dgm:shape xmlns:r="http://schemas.openxmlformats.org/officeDocument/2006/relationships" type="round1Rect" r:blip="">
+              <dgm:adjLst/>
+            </dgm:shape>
+            <dgm:choose name="Name11">
+              <dgm:if name="Name12" func="var" arg="dir" op="equ" val="norm">
+                <dgm:presOf axis="ch ch desOrSelf" ptType="node node node" st="1 2 1" cnt="1 1 0"/>
+              </dgm:if>
+              <dgm:else name="Name13">
+                <dgm:presOf axis="ch ch desOrSelf" ptType="node node node" st="1 1 1" cnt="1 1 0"/>
+              </dgm:else>
+            </dgm:choose>
+            <dgm:constrLst/>
+            <dgm:ruleLst/>
+          </dgm:layoutNode>
+          <dgm:layoutNode name="tile2text" styleLbl="node1">
+            <dgm:varLst>
+              <dgm:chMax val="0"/>
+              <dgm:chPref val="0"/>
+              <dgm:bulletEnabled val="1"/>
+            </dgm:varLst>
+            <dgm:choose name="Name14">
+              <dgm:if name="Name15" axis="root des" func="maxDepth" op="gte" val="3">
+                <dgm:alg type="tx">
+                  <dgm:param type="txAnchorVert" val="t"/>
+                  <dgm:param type="parTxLTRAlign" val="l"/>
+                  <dgm:param type="parTxRTLAlign" val="r"/>
                 </dgm:alg>
               </dgm:if>
-              <dgm:else name="Name10">
-                <dgm:alg type="hierChild">
-                  <dgm:param type="linDir" val="fromT"/>
-                  <dgm:param type="chAlign" val="r"/>
-                </dgm:alg>
+              <dgm:else name="Name16">
+                <dgm:alg type="tx"/>
               </dgm:else>
             </dgm:choose>
-            <dgm:shape xmlns:r="http://schemas.openxmlformats.org/officeDocument/2006/relationships" r:blip="">
+            <dgm:shape xmlns:r="http://schemas.openxmlformats.org/officeDocument/2006/relationships" type="rect" r:blip="" hideGeom="1">
               <dgm:adjLst/>
             </dgm:shape>
-            <dgm:presOf/>
+            <dgm:choose name="Name17">
+              <dgm:if name="Name18" func="var" arg="dir" op="equ" val="norm">
+                <dgm:presOf axis="ch ch desOrSelf" ptType="node node node" st="1 2 1" cnt="1 1 0"/>
+              </dgm:if>
+              <dgm:else name="Name19">
+                <dgm:presOf axis="ch ch desOrSelf" ptType="node node node" st="1 1 1" cnt="1 1 0"/>
+              </dgm:else>
+            </dgm:choose>
+            <dgm:constrLst/>
+            <dgm:ruleLst>
+              <dgm:rule type="primFontSz" val="5" fact="NaN" max="NaN"/>
+            </dgm:ruleLst>
+          </dgm:layoutNode>
+          <dgm:layoutNode name="tile3" styleLbl="node1">
+            <dgm:alg type="sp"/>
+            <dgm:shape xmlns:r="http://schemas.openxmlformats.org/officeDocument/2006/relationships" rot="180" type="round1Rect" r:blip="">
+              <dgm:adjLst/>
+            </dgm:shape>
+            <dgm:choose name="Name20">
+              <dgm:if name="Name21" func="var" arg="dir" op="equ" val="norm">
+                <dgm:presOf axis="ch ch desOrSelf" ptType="node node node" st="1 3 1" cnt="1 1 0"/>
+              </dgm:if>
+              <dgm:else name="Name22">
+                <dgm:presOf axis="ch ch desOrSelf" ptType="node node node" st="1 4 1" cnt="1 1 0"/>
+              </dgm:else>
+            </dgm:choose>
             <dgm:constrLst/>
             <dgm:ruleLst/>
-            <dgm:forEach name="repeat" axis="ch">
-              <dgm:forEach name="Name11" axis="self" ptType="parTrans" cnt="1">
-                <dgm:layoutNode name="conn2-1">
-                  <dgm:choose name="Name12">
-                    <dgm:if name="Name13" func="var" arg="dir" op="equ" val="norm">
-                      <dgm:alg type="conn">
-                        <dgm:param type="dim" val="1D"/>
-                        <dgm:param type="begPts" val="midR"/>
-                        <dgm:param type="endPts" val="midL"/>
-                        <dgm:param type="endSty" val="noArr"/>
-                      </dgm:alg>
-                    </dgm:if>
-                    <dgm:else name="Name14">
-                      <dgm:alg type="conn">
-                        <dgm:param type="dim" val="1D"/>
-                        <dgm:param type="begPts" val="midL"/>
-                        <dgm:param type="endPts" val="midR"/>
-                        <dgm:param type="endSty" val="noArr"/>
-                      </dgm:alg>
-                    </dgm:else>
-                  </dgm:choose>
-                  <dgm:shape xmlns:r="http://schemas.openxmlformats.org/officeDocument/2006/relationships" type="conn" r:blip="">
-                    <dgm:adjLst/>
-                  </dgm:shape>
-                  <dgm:presOf axis="self"/>
-                  <dgm:constrLst>
-                    <dgm:constr type="w" val="1"/>
-                    <dgm:constr type="h" val="5"/>
-                    <dgm:constr type="connDist"/>
-                    <dgm:constr type="begPad"/>
-                    <dgm:constr type="endPad"/>
-                    <dgm:constr type="userA" for="ch" refType="connDist"/>
-                  </dgm:constrLst>
-                  <dgm:ruleLst/>
-                  <dgm:layoutNode name="connTx">
-                    <dgm:alg type="tx">
-                      <dgm:param type="autoTxRot" val="grav"/>
-                    </dgm:alg>
-                    <dgm:shape xmlns:r="http://schemas.openxmlformats.org/officeDocument/2006/relationships" type="rect" r:blip="" hideGeom="1">
-                      <dgm:adjLst/>
-                    </dgm:shape>
-                    <dgm:presOf axis="self"/>
-                    <dgm:constrLst>
-                      <dgm:constr type="userA"/>
-                      <dgm:constr type="w" refType="userA" fact="0.05"/>
-                      <dgm:constr type="h" refType="userA" fact="0.05"/>
-                      <dgm:constr type="lMarg" val="1"/>
-                      <dgm:constr type="rMarg" val="1"/>
-                      <dgm:constr type="tMarg"/>
-                      <dgm:constr type="bMarg"/>
-                    </dgm:constrLst>
-                    <dgm:ruleLst>
-                      <dgm:rule type="h" val="NaN" fact="0.25" max="NaN"/>
-                      <dgm:rule type="w" val="NaN" fact="0.8" max="NaN"/>
-                      <dgm:rule type="primFontSz" val="5" fact="NaN" max="NaN"/>
-                    </dgm:ruleLst>
-                  </dgm:layoutNode>
-                </dgm:layoutNode>
-              </dgm:forEach>
-              <dgm:forEach name="Name15" axis="self" ptType="node">
-                <dgm:layoutNode name="root2">
-                  <dgm:choose name="Name16">
-                    <dgm:if name="Name17" func="var" arg="dir" op="equ" val="norm">
-                      <dgm:alg type="hierRoot">
-                        <dgm:param type="hierAlign" val="lCtrCh"/>
-                      </dgm:alg>
-                    </dgm:if>
-                    <dgm:else name="Name18">
-                      <dgm:alg type="hierRoot">
-                        <dgm:param type="hierAlign" val="rCtrCh"/>
-                      </dgm:alg>
-                    </dgm:else>
-                  </dgm:choose>
-                  <dgm:shape xmlns:r="http://schemas.openxmlformats.org/officeDocument/2006/relationships" r:blip="">
-                    <dgm:adjLst/>
-                  </dgm:shape>
-                  <dgm:presOf/>
-                  <dgm:constrLst/>
-                  <dgm:ruleLst/>
-                  <dgm:layoutNode name="LevelTwoTextNode">
-                    <dgm:varLst>
-                      <dgm:chPref val="3"/>
-                    </dgm:varLst>
-                    <dgm:alg type="tx"/>
-                    <dgm:shape xmlns:r="http://schemas.openxmlformats.org/officeDocument/2006/relationships" type="roundRect" r:blip="">
-                      <dgm:adjLst>
-                        <dgm:adj idx="1" val="0.1"/>
-                      </dgm:adjLst>
-                    </dgm:shape>
-                    <dgm:presOf axis="self"/>
-                    <dgm:constrLst>
-                      <dgm:constr type="tMarg" refType="primFontSz" fact="0.05"/>
-                      <dgm:constr type="bMarg" refType="primFontSz" fact="0.05"/>
-                      <dgm:constr type="lMarg" refType="primFontSz" fact="0.05"/>
-                      <dgm:constr type="rMarg" refType="primFontSz" fact="0.05"/>
-                    </dgm:constrLst>
-                    <dgm:ruleLst>
-                      <dgm:rule type="primFontSz" val="5" fact="NaN" max="NaN"/>
-                    </dgm:ruleLst>
-                  </dgm:layoutNode>
-                  <dgm:layoutNode name="level3hierChild">
-                    <dgm:choose name="Name19">
-                      <dgm:if name="Name20" func="var" arg="dir" op="equ" val="norm">
-                        <dgm:alg type="hierChild">
-                          <dgm:param type="linDir" val="fromT"/>
-                          <dgm:param type="chAlign" val="l"/>
-                        </dgm:alg>
-                      </dgm:if>
-                      <dgm:else name="Name21">
-                        <dgm:alg type="hierChild">
-                          <dgm:param type="linDir" val="fromT"/>
-                          <dgm:param type="chAlign" val="r"/>
-                        </dgm:alg>
-                      </dgm:else>
-                    </dgm:choose>
-                    <dgm:shape xmlns:r="http://schemas.openxmlformats.org/officeDocument/2006/relationships" r:blip="">
-                      <dgm:adjLst/>
-                    </dgm:shape>
-                    <dgm:presOf/>
-                    <dgm:constrLst/>
-                    <dgm:ruleLst/>
-                    <dgm:forEach name="Name22" ref="repeat"/>
-                  </dgm:layoutNode>
-                </dgm:layoutNode>
-              </dgm:forEach>
-            </dgm:forEach>
+          </dgm:layoutNode>
+          <dgm:layoutNode name="tile3text" styleLbl="node1">
+            <dgm:varLst>
+              <dgm:chMax val="0"/>
+              <dgm:chPref val="0"/>
+              <dgm:bulletEnabled val="1"/>
+            </dgm:varLst>
+            <dgm:choose name="Name23">
+              <dgm:if name="Name24" axis="root des" func="maxDepth" op="gte" val="3">
+                <dgm:alg type="tx">
+                  <dgm:param type="txAnchorVert" val="t"/>
+                  <dgm:param type="parTxLTRAlign" val="l"/>
+                  <dgm:param type="parTxRTLAlign" val="r"/>
+                </dgm:alg>
+              </dgm:if>
+              <dgm:else name="Name25">
+                <dgm:alg type="tx"/>
+              </dgm:else>
+            </dgm:choose>
+            <dgm:shape xmlns:r="http://schemas.openxmlformats.org/officeDocument/2006/relationships" rot="180" type="rect" r:blip="" hideGeom="1">
+              <dgm:adjLst/>
+            </dgm:shape>
+            <dgm:choose name="Name26">
+              <dgm:if name="Name27" func="var" arg="dir" op="equ" val="norm">
+                <dgm:presOf axis="ch ch desOrSelf" ptType="node node node" st="1 3 1" cnt="1 1 0"/>
+              </dgm:if>
+              <dgm:else name="Name28">
+                <dgm:presOf axis="ch ch desOrSelf" ptType="node node node" st="1 4 1" cnt="1 1 0"/>
+              </dgm:else>
+            </dgm:choose>
+            <dgm:constrLst/>
+            <dgm:ruleLst>
+              <dgm:rule type="primFontSz" val="5" fact="NaN" max="NaN"/>
+            </dgm:ruleLst>
+          </dgm:layoutNode>
+          <dgm:layoutNode name="tile4" styleLbl="node1">
+            <dgm:alg type="sp"/>
+            <dgm:shape xmlns:r="http://schemas.openxmlformats.org/officeDocument/2006/relationships" rot="90" type="round1Rect" r:blip="">
+              <dgm:adjLst/>
+            </dgm:shape>
+            <dgm:choose name="Name29">
+              <dgm:if name="Name30" func="var" arg="dir" op="equ" val="norm">
+                <dgm:presOf axis="ch ch desOrSelf" ptType="node node node" st="1 4 1" cnt="1 1 0"/>
+              </dgm:if>
+              <dgm:else name="Name31">
+                <dgm:presOf axis="ch ch desOrSelf" ptType="node node node" st="1 3 1" cnt="1 1 0"/>
+              </dgm:else>
+            </dgm:choose>
+            <dgm:constrLst/>
+            <dgm:ruleLst/>
+          </dgm:layoutNode>
+          <dgm:layoutNode name="tile4text" styleLbl="node1">
+            <dgm:varLst>
+              <dgm:chMax val="0"/>
+              <dgm:chPref val="0"/>
+              <dgm:bulletEnabled val="1"/>
+            </dgm:varLst>
+            <dgm:choose name="Name32">
+              <dgm:if name="Name33" axis="root des" func="maxDepth" op="gte" val="3">
+                <dgm:alg type="tx">
+                  <dgm:param type="txAnchorVert" val="t"/>
+                  <dgm:param type="parTxLTRAlign" val="l"/>
+                  <dgm:param type="parTxRTLAlign" val="r"/>
+                </dgm:alg>
+              </dgm:if>
+              <dgm:else name="Name34">
+                <dgm:alg type="tx"/>
+              </dgm:else>
+            </dgm:choose>
+            <dgm:shape xmlns:r="http://schemas.openxmlformats.org/officeDocument/2006/relationships" rot="90" type="rect" r:blip="" hideGeom="1">
+              <dgm:adjLst/>
+            </dgm:shape>
+            <dgm:choose name="Name35">
+              <dgm:if name="Name36" func="var" arg="dir" op="equ" val="norm">
+                <dgm:presOf axis="ch ch desOrSelf" ptType="node node node" st="1 4 1" cnt="1 1 0"/>
+              </dgm:if>
+              <dgm:else name="Name37">
+                <dgm:presOf axis="ch ch desOrSelf" ptType="node node node" st="1 3 1" cnt="1 1 0"/>
+              </dgm:else>
+            </dgm:choose>
+            <dgm:constrLst/>
+            <dgm:ruleLst>
+              <dgm:rule type="primFontSz" val="5" fact="NaN" max="NaN"/>
+            </dgm:ruleLst>
           </dgm:layoutNode>
         </dgm:layoutNode>
-      </dgm:forEach>
-    </dgm:forEach>
+        <dgm:layoutNode name="centerTile" styleLbl="fgShp">
+          <dgm:varLst>
+            <dgm:chMax val="0"/>
+            <dgm:chPref val="0"/>
+          </dgm:varLst>
+          <dgm:alg type="tx"/>
+          <dgm:shape xmlns:r="http://schemas.openxmlformats.org/officeDocument/2006/relationships" type="roundRect" r:blip="">
+            <dgm:adjLst/>
+          </dgm:shape>
+          <dgm:presOf axis="ch" ptType="node" cnt="1"/>
+          <dgm:constrLst>
+            <dgm:constr type="tMarg" refType="primFontSz" fact="0.3"/>
+            <dgm:constr type="bMarg" refType="primFontSz" fact="0.3"/>
+            <dgm:constr type="lMarg" refType="primFontSz" fact="0.3"/>
+            <dgm:constr type="rMarg" refType="primFontSz" fact="0.3"/>
+          </dgm:constrLst>
+          <dgm:ruleLst>
+            <dgm:rule type="primFontSz" val="5" fact="NaN" max="NaN"/>
+          </dgm:ruleLst>
+        </dgm:layoutNode>
+      </dgm:if>
+      <dgm:else name="Name38"/>
+    </dgm:choose>
   </dgm:layoutNode>
 </dgm:layoutDef>
 </file>
@@ -14996,11 +14190,11 @@
 </file>
 
 <file path=word/diagrams/quickStyle2.xml><?xml version="1.0" encoding="utf-8"?>
-<dgm:styleDef xmlns:dgm="http://schemas.openxmlformats.org/drawingml/2006/diagram" xmlns:a="http://schemas.openxmlformats.org/drawingml/2006/main" uniqueId="urn:microsoft.com/office/officeart/2005/8/quickstyle/simple4">
+<dgm:styleDef xmlns:dgm="http://schemas.openxmlformats.org/drawingml/2006/diagram" xmlns:a="http://schemas.openxmlformats.org/drawingml/2006/main" uniqueId="urn:microsoft.com/office/officeart/2005/8/quickstyle/simple1">
   <dgm:title val=""/>
   <dgm:desc val=""/>
   <dgm:catLst>
-    <dgm:cat type="simple" pri="10400"/>
+    <dgm:cat type="simple" pri="10100"/>
   </dgm:catLst>
   <dgm:scene3d>
     <a:camera prst="orthographicFront"/>
@@ -15014,13 +14208,13 @@
     <dgm:sp3d/>
     <dgm:txPr/>
     <dgm:style>
-      <a:lnRef idx="0">
+      <a:lnRef idx="2">
         <a:scrgbClr r="0" g="0" b="0"/>
       </a:lnRef>
-      <a:fillRef idx="3">
+      <a:fillRef idx="1">
         <a:scrgbClr r="0" g="0" b="0"/>
       </a:fillRef>
-      <a:effectRef idx="2">
+      <a:effectRef idx="0">
         <a:scrgbClr r="0" g="0" b="0"/>
       </a:effectRef>
       <a:fontRef idx="minor">
@@ -15036,13 +14230,13 @@
     <dgm:sp3d/>
     <dgm:txPr/>
     <dgm:style>
-      <a:lnRef idx="1">
+      <a:lnRef idx="2">
         <a:scrgbClr r="0" g="0" b="0"/>
       </a:lnRef>
-      <a:fillRef idx="3">
+      <a:fillRef idx="1">
         <a:scrgbClr r="0" g="0" b="0"/>
       </a:fillRef>
-      <a:effectRef idx="2">
+      <a:effectRef idx="0">
         <a:scrgbClr r="0" g="0" b="0"/>
       </a:effectRef>
       <a:fontRef idx="minor">
@@ -15058,10 +14252,10 @@
     <dgm:sp3d/>
     <dgm:txPr/>
     <dgm:style>
-      <a:lnRef idx="0">
+      <a:lnRef idx="2">
         <a:scrgbClr r="0" g="0" b="0"/>
       </a:lnRef>
-      <a:fillRef idx="3">
+      <a:fillRef idx="1">
         <a:scrgbClr r="0" g="0" b="0"/>
       </a:fillRef>
       <a:effectRef idx="0">
@@ -15080,13 +14274,13 @@
     <dgm:sp3d/>
     <dgm:txPr/>
     <dgm:style>
-      <a:lnRef idx="1">
+      <a:lnRef idx="2">
         <a:scrgbClr r="0" g="0" b="0"/>
       </a:lnRef>
-      <a:fillRef idx="3">
+      <a:fillRef idx="1">
         <a:scrgbClr r="0" g="0" b="0"/>
       </a:fillRef>
-      <a:effectRef idx="2">
+      <a:effectRef idx="0">
         <a:scrgbClr r="0" g="0" b="0"/>
       </a:effectRef>
       <a:fontRef idx="minor">
@@ -15102,13 +14296,13 @@
     <dgm:sp3d/>
     <dgm:txPr/>
     <dgm:style>
-      <a:lnRef idx="0">
+      <a:lnRef idx="2">
         <a:scrgbClr r="0" g="0" b="0"/>
       </a:lnRef>
-      <a:fillRef idx="3">
+      <a:fillRef idx="1">
         <a:scrgbClr r="0" g="0" b="0"/>
       </a:fillRef>
-      <a:effectRef idx="2">
+      <a:effectRef idx="0">
         <a:scrgbClr r="0" g="0" b="0"/>
       </a:effectRef>
       <a:fontRef idx="minor">
@@ -15124,13 +14318,13 @@
     <dgm:sp3d/>
     <dgm:txPr/>
     <dgm:style>
-      <a:lnRef idx="0">
+      <a:lnRef idx="2">
         <a:scrgbClr r="0" g="0" b="0"/>
       </a:lnRef>
-      <a:fillRef idx="3">
+      <a:fillRef idx="1">
         <a:scrgbClr r="0" g="0" b="0"/>
       </a:fillRef>
-      <a:effectRef idx="2">
+      <a:effectRef idx="0">
         <a:scrgbClr r="0" g="0" b="0"/>
       </a:effectRef>
       <a:fontRef idx="minor">
@@ -15146,13 +14340,13 @@
     <dgm:sp3d/>
     <dgm:txPr/>
     <dgm:style>
-      <a:lnRef idx="0">
+      <a:lnRef idx="2">
         <a:scrgbClr r="0" g="0" b="0"/>
       </a:lnRef>
-      <a:fillRef idx="3">
+      <a:fillRef idx="1">
         <a:scrgbClr r="0" g="0" b="0"/>
       </a:fillRef>
-      <a:effectRef idx="2">
+      <a:effectRef idx="0">
         <a:scrgbClr r="0" g="0" b="0"/>
       </a:effectRef>
       <a:fontRef idx="minor">
@@ -15168,13 +14362,13 @@
     <dgm:sp3d/>
     <dgm:txPr/>
     <dgm:style>
-      <a:lnRef idx="0">
+      <a:lnRef idx="2">
         <a:scrgbClr r="0" g="0" b="0"/>
       </a:lnRef>
-      <a:fillRef idx="3">
+      <a:fillRef idx="1">
         <a:scrgbClr r="0" g="0" b="0"/>
       </a:fillRef>
-      <a:effectRef idx="2">
+      <a:effectRef idx="0">
         <a:scrgbClr r="0" g="0" b="0"/>
       </a:effectRef>
       <a:fontRef idx="minor">
@@ -15190,13 +14384,13 @@
     <dgm:sp3d/>
     <dgm:txPr/>
     <dgm:style>
-      <a:lnRef idx="0">
+      <a:lnRef idx="2">
         <a:scrgbClr r="0" g="0" b="0"/>
       </a:lnRef>
       <a:fillRef idx="1">
         <a:scrgbClr r="0" g="0" b="0"/>
       </a:fillRef>
-      <a:effectRef idx="2">
+      <a:effectRef idx="0">
         <a:scrgbClr r="0" g="0" b="0"/>
       </a:effectRef>
       <a:fontRef idx="minor"/>
@@ -15210,13 +14404,13 @@
     <dgm:sp3d/>
     <dgm:txPr/>
     <dgm:style>
-      <a:lnRef idx="0">
+      <a:lnRef idx="2">
         <a:scrgbClr r="0" g="0" b="0"/>
       </a:lnRef>
       <a:fillRef idx="1">
         <a:scrgbClr r="0" g="0" b="0"/>
       </a:fillRef>
-      <a:effectRef idx="2">
+      <a:effectRef idx="0">
         <a:scrgbClr r="0" g="0" b="0"/>
       </a:effectRef>
       <a:fontRef idx="minor"/>
@@ -15230,13 +14424,13 @@
     <dgm:sp3d/>
     <dgm:txPr/>
     <dgm:style>
-      <a:lnRef idx="0">
+      <a:lnRef idx="2">
         <a:scrgbClr r="0" g="0" b="0"/>
       </a:lnRef>
       <a:fillRef idx="1">
         <a:scrgbClr r="0" g="0" b="0"/>
       </a:fillRef>
-      <a:effectRef idx="2">
+      <a:effectRef idx="0">
         <a:scrgbClr r="0" g="0" b="0"/>
       </a:effectRef>
       <a:fontRef idx="minor"/>
@@ -15253,10 +14447,10 @@
       <a:lnRef idx="0">
         <a:scrgbClr r="0" g="0" b="0"/>
       </a:lnRef>
-      <a:fillRef idx="3">
+      <a:fillRef idx="1">
         <a:scrgbClr r="0" g="0" b="0"/>
       </a:fillRef>
-      <a:effectRef idx="2">
+      <a:effectRef idx="0">
         <a:scrgbClr r="0" g="0" b="0"/>
       </a:effectRef>
       <a:fontRef idx="minor">
@@ -15275,10 +14469,10 @@
       <a:lnRef idx="0">
         <a:scrgbClr r="0" g="0" b="0"/>
       </a:lnRef>
-      <a:fillRef idx="3">
+      <a:fillRef idx="1">
         <a:scrgbClr r="0" g="0" b="0"/>
       </a:fillRef>
-      <a:effectRef idx="2">
+      <a:effectRef idx="0">
         <a:scrgbClr r="0" g="0" b="0"/>
       </a:effectRef>
       <a:fontRef idx="minor">
@@ -15297,10 +14491,10 @@
       <a:lnRef idx="0">
         <a:scrgbClr r="0" g="0" b="0"/>
       </a:lnRef>
-      <a:fillRef idx="3">
+      <a:fillRef idx="1">
         <a:scrgbClr r="0" g="0" b="0"/>
       </a:fillRef>
-      <a:effectRef idx="2">
+      <a:effectRef idx="0">
         <a:scrgbClr r="0" g="0" b="0"/>
       </a:effectRef>
       <a:fontRef idx="minor">
@@ -15342,7 +14536,7 @@
       <a:fillRef idx="1">
         <a:scrgbClr r="0" g="0" b="0"/>
       </a:fillRef>
-      <a:effectRef idx="1">
+      <a:effectRef idx="0">
         <a:scrgbClr r="0" g="0" b="0"/>
       </a:effectRef>
       <a:fontRef idx="minor"/>
@@ -15356,13 +14550,13 @@
     <dgm:sp3d/>
     <dgm:txPr/>
     <dgm:style>
-      <a:lnRef idx="0">
+      <a:lnRef idx="2">
         <a:scrgbClr r="0" g="0" b="0"/>
       </a:lnRef>
-      <a:fillRef idx="3">
+      <a:fillRef idx="1">
         <a:scrgbClr r="0" g="0" b="0"/>
       </a:fillRef>
-      <a:effectRef idx="2">
+      <a:effectRef idx="0">
         <a:scrgbClr r="0" g="0" b="0"/>
       </a:effectRef>
       <a:fontRef idx="minor">
@@ -15378,13 +14572,13 @@
     <dgm:sp3d/>
     <dgm:txPr/>
     <dgm:style>
-      <a:lnRef idx="0">
+      <a:lnRef idx="2">
         <a:scrgbClr r="0" g="0" b="0"/>
       </a:lnRef>
-      <a:fillRef idx="3">
+      <a:fillRef idx="1">
         <a:scrgbClr r="0" g="0" b="0"/>
       </a:fillRef>
-      <a:effectRef idx="2">
+      <a:effectRef idx="0">
         <a:scrgbClr r="0" g="0" b="0"/>
       </a:effectRef>
       <a:fontRef idx="minor">
@@ -15400,13 +14594,13 @@
     <dgm:sp3d/>
     <dgm:txPr/>
     <dgm:style>
-      <a:lnRef idx="0">
+      <a:lnRef idx="2">
         <a:scrgbClr r="0" g="0" b="0"/>
       </a:lnRef>
-      <a:fillRef idx="3">
+      <a:fillRef idx="1">
         <a:scrgbClr r="0" g="0" b="0"/>
       </a:fillRef>
-      <a:effectRef idx="2">
+      <a:effectRef idx="0">
         <a:scrgbClr r="0" g="0" b="0"/>
       </a:effectRef>
       <a:fontRef idx="minor">
@@ -15422,13 +14616,13 @@
     <dgm:sp3d/>
     <dgm:txPr/>
     <dgm:style>
-      <a:lnRef idx="0">
+      <a:lnRef idx="2">
         <a:scrgbClr r="0" g="0" b="0"/>
       </a:lnRef>
-      <a:fillRef idx="3">
+      <a:fillRef idx="1">
         <a:scrgbClr r="0" g="0" b="0"/>
       </a:fillRef>
-      <a:effectRef idx="2">
+      <a:effectRef idx="0">
         <a:scrgbClr r="0" g="0" b="0"/>
       </a:effectRef>
       <a:fontRef idx="minor">
@@ -15444,13 +14638,13 @@
     <dgm:sp3d/>
     <dgm:txPr/>
     <dgm:style>
-      <a:lnRef idx="0">
+      <a:lnRef idx="2">
         <a:scrgbClr r="0" g="0" b="0"/>
       </a:lnRef>
-      <a:fillRef idx="3">
+      <a:fillRef idx="1">
         <a:scrgbClr r="0" g="0" b="0"/>
       </a:fillRef>
-      <a:effectRef idx="2">
+      <a:effectRef idx="0">
         <a:scrgbClr r="0" g="0" b="0"/>
       </a:effectRef>
       <a:fontRef idx="minor">
@@ -15466,13 +14660,13 @@
     <dgm:sp3d/>
     <dgm:txPr/>
     <dgm:style>
-      <a:lnRef idx="0">
+      <a:lnRef idx="2">
         <a:scrgbClr r="0" g="0" b="0"/>
       </a:lnRef>
-      <a:fillRef idx="3">
+      <a:fillRef idx="1">
         <a:scrgbClr r="0" g="0" b="0"/>
       </a:fillRef>
-      <a:effectRef idx="2">
+      <a:effectRef idx="0">
         <a:scrgbClr r="0" g="0" b="0"/>
       </a:effectRef>
       <a:fontRef idx="minor">
@@ -15488,13 +14682,13 @@
     <dgm:sp3d/>
     <dgm:txPr/>
     <dgm:style>
-      <a:lnRef idx="0">
+      <a:lnRef idx="2">
         <a:scrgbClr r="0" g="0" b="0"/>
       </a:lnRef>
-      <a:fillRef idx="3">
+      <a:fillRef idx="1">
         <a:scrgbClr r="0" g="0" b="0"/>
       </a:fillRef>
-      <a:effectRef idx="2">
+      <a:effectRef idx="0">
         <a:scrgbClr r="0" g="0" b="0"/>
       </a:effectRef>
       <a:fontRef idx="minor">
@@ -15510,13 +14704,13 @@
     <dgm:sp3d/>
     <dgm:txPr/>
     <dgm:style>
-      <a:lnRef idx="1">
+      <a:lnRef idx="2">
         <a:scrgbClr r="0" g="0" b="0"/>
       </a:lnRef>
-      <a:fillRef idx="3">
+      <a:fillRef idx="1">
         <a:scrgbClr r="0" g="0" b="0"/>
       </a:fillRef>
-      <a:effectRef idx="2">
+      <a:effectRef idx="0">
         <a:scrgbClr r="0" g="0" b="0"/>
       </a:effectRef>
       <a:fontRef idx="minor">
@@ -15532,13 +14726,13 @@
     <dgm:sp3d/>
     <dgm:txPr/>
     <dgm:style>
-      <a:lnRef idx="1">
+      <a:lnRef idx="2">
         <a:scrgbClr r="0" g="0" b="0"/>
       </a:lnRef>
-      <a:fillRef idx="3">
+      <a:fillRef idx="1">
         <a:scrgbClr r="0" g="0" b="0"/>
       </a:fillRef>
-      <a:effectRef idx="2">
+      <a:effectRef idx="0">
         <a:scrgbClr r="0" g="0" b="0"/>
       </a:effectRef>
       <a:fontRef idx="minor">
@@ -15554,7 +14748,7 @@
     <dgm:sp3d/>
     <dgm:txPr/>
     <dgm:style>
-      <a:lnRef idx="1">
+      <a:lnRef idx="2">
         <a:scrgbClr r="0" g="0" b="0"/>
       </a:lnRef>
       <a:fillRef idx="0">
@@ -15574,7 +14768,7 @@
     <dgm:sp3d/>
     <dgm:txPr/>
     <dgm:style>
-      <a:lnRef idx="1">
+      <a:lnRef idx="2">
         <a:scrgbClr r="0" g="0" b="0"/>
       </a:lnRef>
       <a:fillRef idx="0">
@@ -15594,7 +14788,7 @@
     <dgm:sp3d/>
     <dgm:txPr/>
     <dgm:style>
-      <a:lnRef idx="1">
+      <a:lnRef idx="2">
         <a:scrgbClr r="0" g="0" b="0"/>
       </a:lnRef>
       <a:fillRef idx="0">
@@ -15614,7 +14808,7 @@
     <dgm:sp3d/>
     <dgm:txPr/>
     <dgm:style>
-      <a:lnRef idx="1">
+      <a:lnRef idx="2">
         <a:scrgbClr r="0" g="0" b="0"/>
       </a:lnRef>
       <a:fillRef idx="0">
@@ -15634,7 +14828,7 @@
     <dgm:sp3d/>
     <dgm:txPr/>
     <dgm:style>
-      <a:lnRef idx="1">
+      <a:lnRef idx="2">
         <a:scrgbClr r="0" g="0" b="0"/>
       </a:lnRef>
       <a:fillRef idx="1">
@@ -15654,7 +14848,7 @@
     <dgm:sp3d/>
     <dgm:txPr/>
     <dgm:style>
-      <a:lnRef idx="1">
+      <a:lnRef idx="2">
         <a:scrgbClr r="0" g="0" b="0"/>
       </a:lnRef>
       <a:fillRef idx="1">
@@ -15674,7 +14868,7 @@
     <dgm:sp3d/>
     <dgm:txPr/>
     <dgm:style>
-      <a:lnRef idx="1">
+      <a:lnRef idx="2">
         <a:scrgbClr r="0" g="0" b="0"/>
       </a:lnRef>
       <a:fillRef idx="1">
@@ -15714,7 +14908,7 @@
     <dgm:sp3d/>
     <dgm:txPr/>
     <dgm:style>
-      <a:lnRef idx="1">
+      <a:lnRef idx="2">
         <a:scrgbClr r="0" g="0" b="0"/>
       </a:lnRef>
       <a:fillRef idx="1">
@@ -15734,7 +14928,7 @@
     <dgm:sp3d/>
     <dgm:txPr/>
     <dgm:style>
-      <a:lnRef idx="1">
+      <a:lnRef idx="2">
         <a:scrgbClr r="0" g="0" b="0"/>
       </a:lnRef>
       <a:fillRef idx="1">
@@ -15754,7 +14948,7 @@
     <dgm:sp3d/>
     <dgm:txPr/>
     <dgm:style>
-      <a:lnRef idx="1">
+      <a:lnRef idx="2">
         <a:scrgbClr r="0" g="0" b="0"/>
       </a:lnRef>
       <a:fillRef idx="1">
@@ -15774,7 +14968,7 @@
     <dgm:sp3d/>
     <dgm:txPr/>
     <dgm:style>
-      <a:lnRef idx="1">
+      <a:lnRef idx="2">
         <a:scrgbClr r="0" g="0" b="0"/>
       </a:lnRef>
       <a:fillRef idx="1">
@@ -15794,7 +14988,7 @@
     <dgm:sp3d/>
     <dgm:txPr/>
     <dgm:style>
-      <a:lnRef idx="1">
+      <a:lnRef idx="2">
         <a:scrgbClr r="0" g="0" b="0"/>
       </a:lnRef>
       <a:fillRef idx="1">
@@ -15814,7 +15008,7 @@
     <dgm:sp3d/>
     <dgm:txPr/>
     <dgm:style>
-      <a:lnRef idx="1">
+      <a:lnRef idx="2">
         <a:scrgbClr r="0" g="0" b="0"/>
       </a:lnRef>
       <a:fillRef idx="1">
@@ -15834,7 +15028,7 @@
     <dgm:sp3d/>
     <dgm:txPr/>
     <dgm:style>
-      <a:lnRef idx="1">
+      <a:lnRef idx="2">
         <a:scrgbClr r="0" g="0" b="0"/>
       </a:lnRef>
       <a:fillRef idx="1">
@@ -15854,7 +15048,7 @@
     <dgm:sp3d/>
     <dgm:txPr/>
     <dgm:style>
-      <a:lnRef idx="1">
+      <a:lnRef idx="2">
         <a:scrgbClr r="0" g="0" b="0"/>
       </a:lnRef>
       <a:fillRef idx="1">
@@ -15874,7 +15068,7 @@
     <dgm:sp3d/>
     <dgm:txPr/>
     <dgm:style>
-      <a:lnRef idx="1">
+      <a:lnRef idx="2">
         <a:scrgbClr r="0" g="0" b="0"/>
       </a:lnRef>
       <a:fillRef idx="1">
@@ -15894,7 +15088,7 @@
     <dgm:sp3d/>
     <dgm:txPr/>
     <dgm:style>
-      <a:lnRef idx="1">
+      <a:lnRef idx="2">
         <a:scrgbClr r="0" g="0" b="0"/>
       </a:lnRef>
       <a:fillRef idx="1">
@@ -15914,7 +15108,7 @@
     <dgm:sp3d/>
     <dgm:txPr/>
     <dgm:style>
-      <a:lnRef idx="1">
+      <a:lnRef idx="2">
         <a:scrgbClr r="0" g="0" b="0"/>
       </a:lnRef>
       <a:fillRef idx="1">
@@ -15940,7 +15134,7 @@
       <a:fillRef idx="1">
         <a:scrgbClr r="0" g="0" b="0"/>
       </a:fillRef>
-      <a:effectRef idx="2">
+      <a:effectRef idx="0">
         <a:scrgbClr r="0" g="0" b="0"/>
       </a:effectRef>
       <a:fontRef idx="minor"/>
@@ -15960,7 +15154,7 @@
       <a:fillRef idx="1">
         <a:scrgbClr r="0" g="0" b="0"/>
       </a:fillRef>
-      <a:effectRef idx="2">
+      <a:effectRef idx="0">
         <a:scrgbClr r="0" g="0" b="0"/>
       </a:effectRef>
       <a:fontRef idx="minor"/>
@@ -15994,13 +15188,13 @@
     <dgm:sp3d/>
     <dgm:txPr/>
     <dgm:style>
-      <a:lnRef idx="0">
+      <a:lnRef idx="2">
         <a:scrgbClr r="0" g="0" b="0"/>
       </a:lnRef>
-      <a:fillRef idx="3">
+      <a:fillRef idx="1">
         <a:scrgbClr r="0" g="0" b="0"/>
       </a:fillRef>
-      <a:effectRef idx="2">
+      <a:effectRef idx="0">
         <a:scrgbClr r="0" g="0" b="0"/>
       </a:effectRef>
       <a:fontRef idx="minor"/>

</xml_diff>